<commit_message>
modificacion de actividad 1 dentro del docx
</commit_message>
<xml_diff>
--- a/Proyecto Adquision.docx
+++ b/Proyecto Adquision.docx
@@ -51,30 +51,70 @@
           <w:szCs w:val="36"/>
         </w:rPr>
       </w:pPr>
-      <w:r>
+    </w:p>
+    <w:p>
+      <w:pPr>
+        <w:jc w:val="center"/>
         <w:rPr>
           <w:rFonts w:ascii="Times New Roman" w:hAnsi="Times New Roman" w:cs="Times New Roman"/>
           <w:sz w:val="36"/>
           <w:szCs w:val="36"/>
         </w:rPr>
-        <w:t>Sistema de integración de datos para la evaluación del riesgo por velocidad de circulación en la curva de La Asomadera #2, Avenida Las Palmas (Medellín)</w:t>
-      </w:r>
-    </w:p>
-    <w:p>
-      <w:pPr>
-        <w:jc w:val="center"/>
+      </w:pPr>
+      <w:r>
         <w:rPr>
           <w:rFonts w:ascii="Times New Roman" w:hAnsi="Times New Roman" w:cs="Times New Roman"/>
           <w:sz w:val="36"/>
           <w:szCs w:val="36"/>
         </w:rPr>
-      </w:pPr>
+        <w:t>Sistema de integración de datos para la evaluación del riesgo asociado a la velocidad de circulación en tramos curvos de la Avenida Las Palmas (Medellín).</w:t>
+      </w:r>
     </w:p>
     <w:p>
       <w:pPr>
         <w:jc w:val="center"/>
         <w:rPr>
           <w:rFonts w:ascii="Times New Roman" w:hAnsi="Times New Roman" w:cs="Times New Roman"/>
+          <w:sz w:val="36"/>
+          <w:szCs w:val="36"/>
+        </w:rPr>
+      </w:pPr>
+    </w:p>
+    <w:p>
+      <w:pPr>
+        <w:jc w:val="center"/>
+        <w:rPr>
+          <w:rFonts w:ascii="Times New Roman" w:hAnsi="Times New Roman" w:cs="Times New Roman"/>
+          <w:sz w:val="36"/>
+          <w:szCs w:val="36"/>
+        </w:rPr>
+      </w:pPr>
+    </w:p>
+    <w:p>
+      <w:pPr>
+        <w:jc w:val="center"/>
+        <w:rPr>
+          <w:rFonts w:ascii="Times New Roman" w:hAnsi="Times New Roman" w:cs="Times New Roman"/>
+          <w:sz w:val="36"/>
+          <w:szCs w:val="36"/>
+        </w:rPr>
+      </w:pPr>
+    </w:p>
+    <w:p>
+      <w:pPr>
+        <w:jc w:val="center"/>
+        <w:rPr>
+          <w:rFonts w:ascii="Times New Roman" w:hAnsi="Times New Roman" w:cs="Times New Roman"/>
+          <w:sz w:val="36"/>
+          <w:szCs w:val="36"/>
+        </w:rPr>
+      </w:pPr>
+    </w:p>
+    <w:p>
+      <w:pPr>
+        <w:jc w:val="center"/>
+        <w:rPr>
+          <w:rFonts w:ascii="Times New Roman" w:hAnsi="Times New Roman" w:cs="Times New Roman"/>
           <w:sz w:val="24"/>
           <w:szCs w:val="24"/>
         </w:rPr>
@@ -153,14 +193,6 @@
           <w:szCs w:val="24"/>
         </w:rPr>
       </w:pPr>
-      <w:r>
-        <w:rPr>
-          <w:rFonts w:ascii="Times New Roman" w:hAnsi="Times New Roman" w:cs="Times New Roman"/>
-          <w:sz w:val="24"/>
-          <w:szCs w:val="24"/>
-        </w:rPr>
-        <w:t>Daniela Castro Zapata</w:t>
-      </w:r>
     </w:p>
     <w:p>
       <w:pPr>
@@ -253,6 +285,11 @@
     </w:p>
     <w:p>
       <w:pPr>
+        <w:pStyle w:val="Prrafodelista"/>
+        <w:numPr>
+          <w:ilvl w:val="1"/>
+          <w:numId w:val="3"/>
+        </w:numPr>
         <w:rPr>
           <w:rFonts w:ascii="Times New Roman" w:hAnsi="Times New Roman" w:cs="Times New Roman"/>
           <w:b/>
@@ -269,7 +306,7 @@
           <w:sz w:val="24"/>
           <w:szCs w:val="24"/>
         </w:rPr>
-        <w:t xml:space="preserve">1.1 Estado del arte </w:t>
+        <w:t xml:space="preserve">Estado del arte </w:t>
       </w:r>
       <w:r>
         <w:rPr>
@@ -284,132 +321,174 @@
     </w:p>
     <w:p>
       <w:pPr>
-        <w:pStyle w:val="NormalWeb"/>
-      </w:pPr>
-      <w:commentRangeStart w:id="0"/>
-      <w:r>
-        <w:t xml:space="preserve">La evaluación de la seguridad vial a partir de la consistencia del diseño geométrico es un enfoque ampliamente documentado en la ingeniería de transporte. González Fernández, Ruiz Caballero y Almenares-García (2021) aplicaron los criterios de Lamm para analizar un tramo de la Carretera Central en Cuba, comparando la velocidad de operación  con la velocidad de diseño en elementos geométricos consecutivos; encontraron que los tramos con mayor diferencial de velocidad entre curvas coincidían con los puntos de mayor concentración de accidentes, </w:t>
-      </w:r>
-      <w:r>
-        <w:t xml:space="preserve">esto muestra que la geometría de la vía y la velocidad de operación deben analizarse juntas. </w:t>
-      </w:r>
-    </w:p>
-    <w:p>
-      <w:pPr>
-        <w:pStyle w:val="NormalWeb"/>
-      </w:pPr>
-      <w:r>
-        <w:t xml:space="preserve">Elvik (2009), en la actualización de su reconocido "Power Model" para el Institute of Transport Economics de Noruega a partir de 115 estudios y 526 estimaciones, investigó la relación entre cambios en la velocidad media de la circulación y cambios en el número de accidentes y víctimas, concluyendo que dicha relación es de tipo exponencial. </w:t>
-      </w:r>
-    </w:p>
-    <w:p>
-      <w:pPr>
-        <w:pStyle w:val="NormalWeb"/>
-      </w:pPr>
-      <w:r>
-        <w:t>Finalmente, la Universidad de Medellín (2024) documenta, en un comunicado institucional sobre una investigación propia iniciada en 2016, el desarrollo de un software que evalúa la consistencia vial de la doble calzada de Las Palmas a partir del diseño geométrico y la velocidad de operación estimada, identificando tres puntos críticos de alta probabilidad de accidentalidad en el corredor</w:t>
-      </w:r>
-      <w:r>
-        <w:t>. Debido a</w:t>
-      </w:r>
-      <w:r>
-        <w:t xml:space="preserve"> sus condiciones geométricas,</w:t>
-      </w:r>
-      <w:r>
-        <w:t xml:space="preserve"> el estudio</w:t>
-      </w:r>
-      <w:r>
-        <w:t xml:space="preserve"> recomienda que </w:t>
-      </w:r>
-      <w:r>
-        <w:t>la vía no debería transitarse a más de 40 km/h en ningún tramo, incluyendo el sector cercano a La Asomadera.</w:t>
-      </w:r>
-      <w:commentRangeEnd w:id="0"/>
-      <w:r>
-        <w:rPr>
-          <w:rStyle w:val="Refdecomentario"/>
-          <w:sz w:val="24"/>
-          <w:szCs w:val="24"/>
-        </w:rPr>
-        <w:commentReference w:id="0"/>
-      </w:r>
-    </w:p>
-    <w:p>
-      <w:pPr>
-        <w:pStyle w:val="NormalWeb"/>
-        <w:rPr>
+        <w:rPr>
+          <w:rFonts w:ascii="Times New Roman" w:hAnsi="Times New Roman" w:cs="Times New Roman"/>
           <w:b/>
           <w:bCs/>
-        </w:rPr>
-      </w:pPr>
-      <w:r>
+          <w:sz w:val="24"/>
+          <w:szCs w:val="24"/>
+        </w:rPr>
+      </w:pPr>
+      <w:commentRangeStart w:id="0"/>
+      <w:r>
+        <w:rPr>
+          <w:rFonts w:ascii="Times New Roman" w:hAnsi="Times New Roman" w:cs="Times New Roman"/>
+          <w:sz w:val="24"/>
+          <w:szCs w:val="24"/>
+        </w:rPr>
+        <w:t xml:space="preserve">La evaluación de la seguridad vial a partir de la consistencia del diseño geométrico es un enfoque ampliamente documentado en la ingeniería de transporte. González Fernández, Ruiz Caballero y Almenares-García (2021) aplicaron los criterios de Lamm para analizar un tramo de la Carretera Central en Cuba, comparando la velocidad de operación  con la velocidad de diseño en elementos geométricos consecutivos; encontraron que los tramos con mayor diferencial de velocidad entre curvas coincidían con los puntos de mayor concentración de accidentes, </w:t>
+      </w:r>
+      <w:r>
+        <w:rPr>
+          <w:rFonts w:ascii="Times New Roman" w:hAnsi="Times New Roman" w:cs="Times New Roman"/>
+          <w:sz w:val="24"/>
+          <w:szCs w:val="24"/>
+        </w:rPr>
+        <w:t xml:space="preserve">esto muestra que la geometría de la vía y la velocidad de operación deben analizarse juntas. </w:t>
+      </w:r>
+    </w:p>
+    <w:p>
+      <w:pPr>
+        <w:pStyle w:val="NormalWeb"/>
+      </w:pPr>
+      <w:r>
+        <w:t>Elvik (2009), en la actualización de su reconocido "Power Model" para el Institute of Transport Economics de Noruega a partir de 115 estudios y 526 estimaciones, investigó la relación entre cambios en la velocidad media de la circulación y cambios en el número de accidentes y víctimas, concluyendo que dicha relación es de tipo exponencial</w:t>
+      </w:r>
+      <w:r>
+        <w:t xml:space="preserve">. </w:t>
+      </w:r>
+    </w:p>
+    <w:p>
+      <w:pPr>
+        <w:pStyle w:val="NormalWeb"/>
+      </w:pPr>
+      <w:r>
+        <w:t>Finalmente, la Universidad de Medellín (2024) documenta, en un comunicado institucional sobre una investigación propia iniciada en 2016, el desarrollo de un software que evalúa la consistencia vial de la doble calzada de Las Palmas a partir del diseño geométrico y la velocidad de operación estimada, identificando tres puntos críticos de alta probabilidad de accidentalidad en el corredor</w:t>
+      </w:r>
+      <w:r>
+        <w:t>. Debido a</w:t>
+      </w:r>
+      <w:r>
+        <w:t xml:space="preserve"> sus condiciones geométricas,</w:t>
+      </w:r>
+      <w:r>
+        <w:t xml:space="preserve"> el estudio</w:t>
+      </w:r>
+      <w:r>
+        <w:t xml:space="preserve"> recomienda que </w:t>
+      </w:r>
+      <w:r>
+        <w:t>la vía no debería transitarse a más de 40 km/h en ningún tramo, incluyendo el sector cercano a La Asomadera.</w:t>
+      </w:r>
+      <w:commentRangeEnd w:id="0"/>
+      <w:r>
+        <w:rPr>
+          <w:rStyle w:val="Refdecomentario"/>
+          <w:sz w:val="24"/>
+          <w:szCs w:val="24"/>
+        </w:rPr>
+        <w:commentReference w:id="0"/>
+      </w:r>
+    </w:p>
+    <w:p>
+      <w:pPr>
+        <w:pStyle w:val="NormalWeb"/>
         <w:rPr>
           <w:b/>
           <w:bCs/>
         </w:rPr>
-        <w:t xml:space="preserve">1.2 Contexto del problema </w:t>
-      </w:r>
-    </w:p>
-    <w:p>
-      <w:pPr>
-        <w:pStyle w:val="NormalWeb"/>
-      </w:pPr>
-      <w:r>
-        <w:t xml:space="preserve">La secretaria de movilidad de Medellín necesita contar con información integrada para apoyar la evaluación de seguridad vial en tramos curvos de </w:t>
-      </w:r>
-      <w:r>
-        <w:t xml:space="preserve">la </w:t>
-      </w:r>
-      <w:commentRangeStart w:id="1"/>
-      <w:r>
-        <w:t>Avenida Las Palmas, específicamente en el tramo comprendido entre La Asomadera y el Country Club, uno de los principales corredores de conexión entre Medellín y el Oriente antioqueño</w:t>
-      </w:r>
-      <w:r>
-        <w:t xml:space="preserve">, ya que presenta una problemática de siniestralidad documentada </w:t>
-      </w:r>
-    </w:p>
-    <w:p>
-      <w:pPr>
-        <w:pStyle w:val="NormalWeb"/>
-      </w:pPr>
-      <w:r>
-        <w:t>E</w:t>
-      </w:r>
-      <w:r>
-        <w:t xml:space="preserve">l corredor completo de Las Palmas registró 489 incidentes viales entre enero de 2025 y enero de 2026 (El Tiempo, 2026), y entre 2021 y 2023 se contabilizaron 1.428 accidentes de tránsito, de los cuales 962 dejaron personas lesionadas y 14 tuvieron desenlaces fatales, con un aumento del 28 % en incidentes frente a periodos anteriores (El Colombiano, 2025). Estas cifras evidencian un problema de salud pública y seguridad vial de alto impacto social y económico a nivel de toda la vía. </w:t>
-      </w:r>
-    </w:p>
-    <w:p>
-      <w:pPr>
-        <w:pStyle w:val="NormalWeb"/>
-      </w:pPr>
-      <w:r>
-        <w:t xml:space="preserve">A </w:t>
-      </w:r>
-      <w:r>
-        <w:t xml:space="preserve">diferencia de las cifras anteriores, que son agregadas para toda la avenida, existe evidencia de que la problemática también ocurre específicamente en el micro-tramo elegido: en octubre de 2024 se registró un choque múltiple a la altura de La Asomadera #2 que involucró dos buses, dos automóviles y dos motocicletas (Semana, 2024), confirmando incidentalidad documentada en este punto exacto y no solo en el corredor en general. </w:t>
-      </w:r>
-      <w:commentRangeEnd w:id="1"/>
-      <w:r>
-        <w:rPr>
-          <w:rStyle w:val="Refdecomentario"/>
-          <w:sz w:val="24"/>
-          <w:szCs w:val="24"/>
-        </w:rPr>
-        <w:commentReference w:id="1"/>
-      </w:r>
-    </w:p>
-    <w:p>
-      <w:pPr>
-        <w:rPr>
-          <w:rFonts w:ascii="Times New Roman" w:hAnsi="Times New Roman" w:cs="Times New Roman"/>
+      </w:pPr>
+      <w:r>
+        <w:rPr>
           <w:b/>
           <w:bCs/>
-          <w:sz w:val="24"/>
-          <w:szCs w:val="24"/>
-        </w:rPr>
-      </w:pPr>
-      <w:r>
+        </w:rPr>
+        <w:t xml:space="preserve">1.2 Contexto del problema </w:t>
+      </w:r>
+    </w:p>
+    <w:p>
+      <w:pPr>
+        <w:rPr>
+          <w:rFonts w:ascii="Times New Roman" w:eastAsia="Times New Roman" w:hAnsi="Times New Roman" w:cs="Times New Roman"/>
+          <w:kern w:val="0"/>
+          <w:sz w:val="24"/>
+          <w:szCs w:val="24"/>
+          <w:lang w:eastAsia="es-CO"/>
+          <w14:ligatures w14:val="none"/>
+        </w:rPr>
+      </w:pPr>
+      <w:r>
+        <w:rPr>
+          <w:rFonts w:ascii="Times New Roman" w:eastAsia="Times New Roman" w:hAnsi="Times New Roman" w:cs="Times New Roman"/>
+          <w:kern w:val="0"/>
+          <w:sz w:val="24"/>
+          <w:szCs w:val="24"/>
+          <w:lang w:eastAsia="es-CO"/>
+          <w14:ligatures w14:val="none"/>
+        </w:rPr>
+        <w:t>La Secretaría de Movilidad de Medellín necesita información integrada para apoyar la evaluación de seguridad vial en distintos tramos curvos de la Avenida Las Palmas, uno de los principales corredores entre Medellín y el Oriente antioqueño. Este corredor presenta una siniestralidad documentada: registró 489 incidentes viales entre enero de 2025 y enero de 2026 (El Tiempo, 2026), y entre 2021 y 2023 se contabilizaron 1.428 accidentes, de los cuales 962 dejaron personas lesionadas y 14 tuvieron desenlaces fatales, con un aumento del 28 % frente a periodos anteriores (El Colombiano, 2025).</w:t>
+      </w:r>
+    </w:p>
+    <w:p>
+      <w:pPr>
+        <w:rPr>
+          <w:rFonts w:ascii="Times New Roman" w:eastAsia="Times New Roman" w:hAnsi="Times New Roman" w:cs="Times New Roman"/>
+          <w:kern w:val="0"/>
+          <w:sz w:val="24"/>
+          <w:szCs w:val="24"/>
+          <w:lang w:eastAsia="es-CO"/>
+          <w14:ligatures w14:val="none"/>
+        </w:rPr>
+      </w:pPr>
+      <w:r>
+        <w:rPr>
+          <w:rFonts w:ascii="Times New Roman" w:eastAsia="Times New Roman" w:hAnsi="Times New Roman" w:cs="Times New Roman"/>
+          <w:kern w:val="0"/>
+          <w:sz w:val="24"/>
+          <w:szCs w:val="24"/>
+          <w:lang w:eastAsia="es-CO"/>
+          <w14:ligatures w14:val="none"/>
+        </w:rPr>
+        <w:t>Estas cifras, sin embargo, son agregadas para toda la avenida, y la problemática también se manifiesta en puntos específicos. En octubre de 2024 ocurrió un choque múltiple a la altura de La Asomadera #2 que involucró dos buses, dos automóviles y dos motocicletas (Semana, 2024), lo que evidencia la importancia de estudiar sectores puntuales y compararlos con otras curvas del corredor.</w:t>
+      </w:r>
+    </w:p>
+    <w:p>
+      <w:pPr>
+        <w:rPr>
+          <w:rFonts w:ascii="Times New Roman" w:eastAsia="Times New Roman" w:hAnsi="Times New Roman" w:cs="Times New Roman"/>
+          <w:kern w:val="0"/>
+          <w:sz w:val="24"/>
+          <w:szCs w:val="24"/>
+          <w:lang w:eastAsia="es-CO"/>
+          <w14:ligatures w14:val="none"/>
+        </w:rPr>
+      </w:pPr>
+      <w:r>
+        <w:rPr>
+          <w:rFonts w:ascii="Times New Roman" w:eastAsia="Times New Roman" w:hAnsi="Times New Roman" w:cs="Times New Roman"/>
+          <w:kern w:val="0"/>
+          <w:sz w:val="24"/>
+          <w:szCs w:val="24"/>
+          <w:lang w:eastAsia="es-CO"/>
+          <w14:ligatures w14:val="none"/>
+        </w:rPr>
+        <w:t xml:space="preserve">Sin embargo, estas fuentes por si solas no permiten determinar si la velocidad en puntos específicos se relaciona con la frecuencia de siniestros, ni cómo se asocian la geometría vial y las condiciones meteorológicas con la accidentalidad. Por ello, se propone integrar velocidades simuladas, características geométricas, registros meteorológicos e incidentes </w:t>
+      </w:r>
+      <w:r>
+        <w:rPr>
+          <w:rFonts w:ascii="Times New Roman" w:eastAsia="Times New Roman" w:hAnsi="Times New Roman" w:cs="Times New Roman"/>
+          <w:kern w:val="0"/>
+          <w:sz w:val="24"/>
+          <w:szCs w:val="24"/>
+          <w:lang w:eastAsia="es-CO"/>
+          <w14:ligatures w14:val="none"/>
+        </w:rPr>
+        <w:lastRenderedPageBreak/>
+        <w:t>geolocalizados para comparar los tramos seleccionados y apoyar la evaluación de seguridad vial.</w:t>
+      </w:r>
+    </w:p>
+    <w:p>
+      <w:pPr>
         <w:rPr>
           <w:rFonts w:ascii="Times New Roman" w:hAnsi="Times New Roman" w:cs="Times New Roman"/>
           <w:b/>
@@ -417,46 +496,33 @@
           <w:sz w:val="24"/>
           <w:szCs w:val="24"/>
         </w:rPr>
-        <w:lastRenderedPageBreak/>
-        <w:t xml:space="preserve">1.3 Problema </w:t>
-      </w:r>
-    </w:p>
-    <w:p>
-      <w:pPr>
-        <w:rPr>
-          <w:rFonts w:ascii="Times New Roman" w:hAnsi="Times New Roman" w:cs="Times New Roman"/>
-          <w:sz w:val="24"/>
-          <w:szCs w:val="24"/>
-        </w:rPr>
-      </w:pPr>
-      <w:r>
-        <w:rPr>
-          <w:rFonts w:ascii="Times New Roman" w:hAnsi="Times New Roman" w:cs="Times New Roman"/>
-          <w:sz w:val="24"/>
-          <w:szCs w:val="24"/>
-        </w:rPr>
-        <w:t>¿Cómo puede la integración de datos de velocidad de circulación, siniestralidad histórica y geometría vial ayudar a caracterizar las condiciones de riesgo asociadas a la velocidad en la curva de La Asomadera #2 de la Avenida Las Palmas?</w:t>
-      </w:r>
-    </w:p>
-    <w:p>
-      <w:pPr>
-        <w:rPr>
-          <w:rFonts w:ascii="Times New Roman" w:hAnsi="Times New Roman" w:cs="Times New Roman"/>
-        </w:rPr>
       </w:pPr>
       <w:r>
         <w:rPr>
           <w:rFonts w:ascii="Times New Roman" w:hAnsi="Times New Roman" w:cs="Times New Roman"/>
           <w:b/>
           <w:bCs/>
-        </w:rPr>
-        <w:t xml:space="preserve">1. </w:t>
-      </w:r>
-      <w:r>
-        <w:rPr>
-          <w:rFonts w:ascii="Times New Roman" w:hAnsi="Times New Roman" w:cs="Times New Roman"/>
-        </w:rPr>
-        <w:t>Fuente primaria (sensor): dispositivo de medición de velocidad instalado conceptualmente (simulado) en el punto crítico de la curva (radar Doppler), que captura la velocidad de los vehículos y registra la fecha y hora de cada medición.</w:t>
+          <w:sz w:val="24"/>
+          <w:szCs w:val="24"/>
+        </w:rPr>
+        <w:t xml:space="preserve">1.3 Problema </w:t>
+      </w:r>
+    </w:p>
+    <w:p>
+      <w:pPr>
+        <w:rPr>
+          <w:rFonts w:ascii="Times New Roman" w:hAnsi="Times New Roman" w:cs="Times New Roman"/>
+          <w:sz w:val="24"/>
+          <w:szCs w:val="24"/>
+        </w:rPr>
+      </w:pPr>
+      <w:r>
+        <w:rPr>
+          <w:rFonts w:ascii="Times New Roman" w:hAnsi="Times New Roman" w:cs="Times New Roman"/>
+          <w:sz w:val="24"/>
+          <w:szCs w:val="24"/>
+        </w:rPr>
+        <w:t>¿Cómo puede la integración de datos de velocidad de circulación, siniestralidad histórica, geometría vial y condiciones meteorológicas ayudar a caracterizar y comparar las condiciones de riesgo asociadas a la velocidad en diferentes tramos curvos de la Avenida Las Palmas?</w:t>
       </w:r>
     </w:p>
     <w:p>
@@ -473,13 +539,13 @@
           <w:b/>
           <w:bCs/>
         </w:rPr>
-        <w:t xml:space="preserve">2. </w:t>
-      </w:r>
-      <w:r>
-        <w:rPr>
-          <w:rFonts w:ascii="Times New Roman" w:hAnsi="Times New Roman" w:cs="Times New Roman"/>
-        </w:rPr>
-        <w:t>Fuente secundaria 1: API de Siniestralidad de la Secretaría de Movilidad de Medellín, que contiene registros georreferenciados de siniestros viales ocurridos entre 2019 y 2025. De esta fuente se utilizarán principalmente la fecha, hora, clase del siniestro, gravedad y ubicación geográfica.</w:t>
+        <w:t xml:space="preserve">1. </w:t>
+      </w:r>
+      <w:r>
+        <w:rPr>
+          <w:rFonts w:ascii="Times New Roman" w:hAnsi="Times New Roman" w:cs="Times New Roman"/>
+        </w:rPr>
+        <w:t>Fuente primaria (sensor): radares Doppler simulados, ubicados conceptualmente en puntos estratégicos de diferentes curvas de Las Palmas, que registran la velocidad de los vehículos, fecha, hora e identificador de cada sensor.</w:t>
       </w:r>
     </w:p>
     <w:p>
@@ -496,38 +562,34 @@
           <w:b/>
           <w:bCs/>
         </w:rPr>
-        <w:t xml:space="preserve">3. </w:t>
-      </w:r>
-      <w:r>
-        <w:rPr>
-          <w:rFonts w:ascii="Times New Roman" w:hAnsi="Times New Roman" w:cs="Times New Roman"/>
-        </w:rPr>
-        <w:t>Fuente secundaria 2: capa Segmento Vial - Flujo de la Secretaría de Movilidad de Medellín, consultada mediante la API de ArcGIS REST. Esta fuente contiene información geográfica y características generales de los segmentos viales. Se utilizará para identificar y delimitar el tramo donde se encuentra la curva de La Asomadera #2 y, a partir de su geometría, obtener una medida que permita representar qué tan pronunciada es la curva.</w:t>
-      </w:r>
-      <w:r>
-        <w:rPr>
-          <w:rFonts w:ascii="Times New Roman" w:hAnsi="Times New Roman" w:cs="Times New Roman"/>
-        </w:rPr>
-        <w:t xml:space="preserve"> </w:t>
-      </w:r>
-    </w:p>
-    <w:p>
-      <w:pPr>
+        <w:t xml:space="preserve">2. </w:t>
+      </w:r>
+      <w:r>
+        <w:rPr>
+          <w:rFonts w:ascii="Times New Roman" w:hAnsi="Times New Roman" w:cs="Times New Roman"/>
+        </w:rPr>
+        <w:t>Fuente secundaria 1: API de Siniestralidad de la Secretaría de Movilidad de Medellín, que contiene registros georreferenciados de siniestros viales ocurridos entre 2019 y 2025. De esta fuente se utilizarán principalmente la fecha, hora, clase del siniestro, gravedad y ubicación geográfica.</w:t>
+      </w:r>
+    </w:p>
+    <w:p>
+      <w:pPr>
+        <w:rPr>
+          <w:rFonts w:ascii="Times New Roman" w:hAnsi="Times New Roman" w:cs="Times New Roman"/>
+        </w:rPr>
+      </w:pPr>
+      <w:r>
         <w:rPr>
           <w:rFonts w:ascii="Times New Roman" w:hAnsi="Times New Roman" w:cs="Times New Roman"/>
           <w:b/>
           <w:bCs/>
-          <w:sz w:val="24"/>
-          <w:szCs w:val="24"/>
-        </w:rPr>
-      </w:pPr>
-      <w:r>
-        <w:rPr>
-          <w:rFonts w:ascii="Times New Roman" w:hAnsi="Times New Roman" w:cs="Times New Roman"/>
-          <w:sz w:val="24"/>
-          <w:szCs w:val="24"/>
-        </w:rPr>
-        <w:t>Las tres fuentes se cruzan principalmente usando un dato en común: la ubicación, es decir, la curva de La Asomadera #2. Los datos de accidentes se filtran para ese sector, las mediciones del radar se toman en el mismo punto y la información de la vía permite identificar y describir la curva. La fecha y la hora también se guardan para analizar los datos, pero no se usan como el criterio principal para relacionar la información histórica con las mediciones simuladas.</w:t>
+        </w:rPr>
+        <w:t xml:space="preserve">3. </w:t>
+      </w:r>
+      <w:r>
+        <w:rPr>
+          <w:rFonts w:ascii="Times New Roman" w:hAnsi="Times New Roman" w:cs="Times New Roman"/>
+        </w:rPr>
+        <w:t>Fuente secundaria 2: capa Segmento Vial - Flujo de la Secretaría de Movilidad de Medellín, consultada mediante la API de ArcGIS REST. Contiene información geográfica de los segmentos viales y permitirá identificar, delimitar y caracterizar la geometría de las curvas seleccionadas.</w:t>
       </w:r>
     </w:p>
     <w:p>
@@ -536,8 +598,6 @@
           <w:rFonts w:ascii="Times New Roman" w:hAnsi="Times New Roman" w:cs="Times New Roman"/>
           <w:b/>
           <w:bCs/>
-          <w:sz w:val="24"/>
-          <w:szCs w:val="24"/>
         </w:rPr>
       </w:pPr>
       <w:r>
@@ -545,27 +605,39 @@
           <w:rFonts w:ascii="Times New Roman" w:hAnsi="Times New Roman" w:cs="Times New Roman"/>
           <w:b/>
           <w:bCs/>
-          <w:sz w:val="24"/>
-          <w:szCs w:val="24"/>
-        </w:rPr>
-        <w:t xml:space="preserve">1.4 Objetivo del Proyecto (SMART) </w:t>
-      </w:r>
-    </w:p>
-    <w:p>
-      <w:pPr>
-        <w:rPr>
-          <w:rFonts w:ascii="Times New Roman" w:hAnsi="Times New Roman" w:cs="Times New Roman"/>
-          <w:sz w:val="24"/>
-          <w:szCs w:val="24"/>
-        </w:rPr>
-      </w:pPr>
-      <w:r>
-        <w:rPr>
-          <w:rFonts w:ascii="Times New Roman" w:hAnsi="Times New Roman" w:cs="Times New Roman"/>
-          <w:sz w:val="24"/>
-          <w:szCs w:val="24"/>
-        </w:rPr>
-        <w:t>Objetivo general: Caracterizar, mediante la integración de datos de velocidad de circulación, siniestralidad histórica y geometría vial de tres fuentes distintas, las condiciones de riesgo asociadas a la velocidad en la curva de La Asomadera #2 (Av. Las Palmas), durante el semestre académico en curso.</w:t>
+        </w:rPr>
+        <w:t xml:space="preserve">4. </w:t>
+      </w:r>
+      <w:r>
+        <w:rPr>
+          <w:rFonts w:ascii="Times New Roman" w:hAnsi="Times New Roman" w:cs="Times New Roman"/>
+        </w:rPr>
+        <w:t>Fuente secundaria 3: API meteorológica de Open-Meteo, que proporciona registros históricos de precipitación, temperatura y humedad. Se utilizará principalmente para identificar condiciones de lluvia y ausencia de lluvia durante los periodos de estudio.</w:t>
+      </w:r>
+    </w:p>
+    <w:p>
+      <w:pPr>
+        <w:rPr>
+          <w:rFonts w:ascii="Times New Roman" w:hAnsi="Times New Roman" w:cs="Times New Roman"/>
+          <w:sz w:val="24"/>
+          <w:szCs w:val="24"/>
+        </w:rPr>
+      </w:pPr>
+      <w:r>
+        <w:rPr>
+          <w:rFonts w:ascii="Times New Roman" w:hAnsi="Times New Roman" w:cs="Times New Roman"/>
+          <w:sz w:val="24"/>
+          <w:szCs w:val="24"/>
+        </w:rPr>
+        <w:t>Las cuatro fuentes se relacionarán mediante la ubicación geográfica y, cuando corresponda, la fecha y hora. La geometría permitirá asociar los sensores y siniestros con cada tramo, mientras que los datos meteorológicos permitirán identificar condiciones de lluvia durante los accidentes históricos y comparar su frecuencia proporcional entre periodos lluviosos y secos. Las velocidades simuladas se analizarán por tramo</w:t>
+      </w:r>
+      <w:r>
+        <w:rPr>
+          <w:rFonts w:ascii="Times New Roman" w:hAnsi="Times New Roman" w:cs="Times New Roman"/>
+          <w:sz w:val="24"/>
+          <w:szCs w:val="24"/>
+        </w:rPr>
+        <w:t>.</w:t>
       </w:r>
     </w:p>
     <w:p>
@@ -586,15 +658,40 @@
           <w:sz w:val="24"/>
           <w:szCs w:val="24"/>
         </w:rPr>
-        <w:t xml:space="preserve">Específico: </w:t>
-      </w:r>
-      <w:r>
-        <w:rPr>
-          <w:rFonts w:ascii="Times New Roman" w:hAnsi="Times New Roman" w:cs="Times New Roman"/>
-          <w:sz w:val="24"/>
-          <w:szCs w:val="24"/>
-        </w:rPr>
-        <w:t>integrar la velocidad de circulación obtenida mediante un radar Doppler simulado, los registros históricos de siniestralidad y la información geométrica del tramo correspondiente a la curva de La Asomadera #2.</w:t>
+        <w:t>1.4 Objetivo del Proyecto (SMART)</w:t>
+      </w:r>
+    </w:p>
+    <w:p>
+      <w:pPr>
+        <w:rPr>
+          <w:rFonts w:ascii="Times New Roman" w:hAnsi="Times New Roman" w:cs="Times New Roman"/>
+          <w:sz w:val="24"/>
+          <w:szCs w:val="24"/>
+        </w:rPr>
+      </w:pPr>
+      <w:r>
+        <w:rPr>
+          <w:rFonts w:ascii="Times New Roman" w:hAnsi="Times New Roman" w:cs="Times New Roman"/>
+          <w:sz w:val="24"/>
+          <w:szCs w:val="24"/>
+        </w:rPr>
+        <w:t>Objetivo general:</w:t>
+      </w:r>
+      <w:r>
+        <w:rPr>
+          <w:rFonts w:ascii="Times New Roman" w:hAnsi="Times New Roman" w:cs="Times New Roman"/>
+          <w:sz w:val="24"/>
+          <w:szCs w:val="24"/>
+        </w:rPr>
+        <w:t xml:space="preserve"> </w:t>
+      </w:r>
+      <w:r>
+        <w:rPr>
+          <w:rFonts w:ascii="Times New Roman" w:hAnsi="Times New Roman" w:cs="Times New Roman"/>
+          <w:sz w:val="24"/>
+          <w:szCs w:val="24"/>
+        </w:rPr>
+        <w:t>Caracterizar y comparar, mediante la integración de datos de velocidad simulada, siniestralidad histórica, geometría vial y condiciones meteorológicas de cuatro fuentes distintas, las condiciones asociadas al riesgo por velocidad en diferentes tramos curvos de la Avenida Las Palmas, durante el semestre académico en curso.</w:t>
       </w:r>
     </w:p>
     <w:p>
@@ -615,19 +712,9 @@
           <w:sz w:val="24"/>
           <w:szCs w:val="24"/>
         </w:rPr>
-        <w:t xml:space="preserve">Medible: </w:t>
-      </w:r>
-      <w:r>
-        <w:rPr>
-          <w:rFonts w:ascii="Times New Roman" w:hAnsi="Times New Roman" w:cs="Times New Roman"/>
-          <w:sz w:val="24"/>
-          <w:szCs w:val="24"/>
-        </w:rPr>
-        <w:t>mediante indicadores de velocidad de circulación, cantidad y gravedad de los siniestros registrados y una medida que permita representar la curvatura del tramo.</w:t>
-      </w:r>
-    </w:p>
-    <w:p>
-      <w:pPr>
+        <w:t>Específico:</w:t>
+      </w:r>
+      <w:r>
         <w:rPr>
           <w:rFonts w:ascii="Times New Roman" w:hAnsi="Times New Roman" w:cs="Times New Roman"/>
           <w:b/>
@@ -635,7 +722,16 @@
           <w:sz w:val="24"/>
           <w:szCs w:val="24"/>
         </w:rPr>
-      </w:pPr>
+        <w:t xml:space="preserve"> </w:t>
+      </w:r>
+      <w:r>
+        <w:rPr>
+          <w:rFonts w:ascii="Times New Roman" w:hAnsi="Times New Roman" w:cs="Times New Roman"/>
+          <w:sz w:val="24"/>
+          <w:szCs w:val="24"/>
+        </w:rPr>
+        <w:t>integrar las velocidades obtenidas mediante radares Doppler simulados, los registros históricos de siniestralidad, la información geométrica de los tramos seleccionados y las condiciones meteorológicas correspondientes</w:t>
+      </w:r>
       <w:r>
         <w:rPr>
           <w:rFonts w:ascii="Times New Roman" w:hAnsi="Times New Roman" w:cs="Times New Roman"/>
@@ -644,15 +740,7 @@
           <w:sz w:val="24"/>
           <w:szCs w:val="24"/>
         </w:rPr>
-        <w:t xml:space="preserve">Alcanzable: </w:t>
-      </w:r>
-      <w:r>
-        <w:rPr>
-          <w:rFonts w:ascii="Times New Roman" w:hAnsi="Times New Roman" w:cs="Times New Roman"/>
-          <w:sz w:val="24"/>
-          <w:szCs w:val="24"/>
-        </w:rPr>
-        <w:t>con un radar Doppler simulado y datos públicos ya identificados y consultados mediante las APIs de Siniestralidad y Segmento Vial - Flujo de la Secretaría de Movilidad de Medellín.</w:t>
+        <w:t>.</w:t>
       </w:r>
     </w:p>
     <w:p>
@@ -673,25 +761,8 @@
           <w:sz w:val="24"/>
           <w:szCs w:val="24"/>
         </w:rPr>
-        <w:t xml:space="preserve">Relevante: </w:t>
-      </w:r>
-      <w:r>
-        <w:rPr>
-          <w:rFonts w:ascii="Times New Roman" w:hAnsi="Times New Roman" w:cs="Times New Roman"/>
-          <w:sz w:val="24"/>
-          <w:szCs w:val="24"/>
-        </w:rPr>
-        <w:t>responde a un problema real de seguridad vial documentado oficial e institucionalmente y permite analizar de manera integrada información que actualmente se encuentra en fuentes independientes.</w:t>
-      </w:r>
-    </w:p>
-    <w:p>
-      <w:pPr>
-        <w:rPr>
-          <w:rFonts w:ascii="Times New Roman" w:hAnsi="Times New Roman" w:cs="Times New Roman"/>
-          <w:sz w:val="24"/>
-          <w:szCs w:val="24"/>
-        </w:rPr>
-      </w:pPr>
+        <w:t>Medible:</w:t>
+      </w:r>
       <w:r>
         <w:rPr>
           <w:rFonts w:ascii="Times New Roman" w:hAnsi="Times New Roman" w:cs="Times New Roman"/>
@@ -700,19 +771,17 @@
           <w:sz w:val="24"/>
           <w:szCs w:val="24"/>
         </w:rPr>
-        <w:t>Temporal:</w:t>
-      </w:r>
-      <w:r>
-        <w:rPr>
-          <w:rFonts w:ascii="Times New Roman" w:hAnsi="Times New Roman" w:cs="Times New Roman"/>
-          <w:sz w:val="24"/>
-          <w:szCs w:val="24"/>
-        </w:rPr>
-        <w:t xml:space="preserve"> entregable dentro del plazo del proyecto, según cronograma del curso.</w:t>
-      </w:r>
-    </w:p>
-    <w:p>
-      <w:pPr>
+        <w:t xml:space="preserve"> </w:t>
+      </w:r>
+      <w:r>
+        <w:rPr>
+          <w:rFonts w:ascii="Times New Roman" w:hAnsi="Times New Roman" w:cs="Times New Roman"/>
+          <w:sz w:val="24"/>
+          <w:szCs w:val="24"/>
+        </w:rPr>
+        <w:t>mediante</w:t>
+      </w:r>
+      <w:r>
         <w:rPr>
           <w:rFonts w:ascii="Times New Roman" w:hAnsi="Times New Roman" w:cs="Times New Roman"/>
           <w:b/>
@@ -720,6 +789,24 @@
           <w:sz w:val="24"/>
           <w:szCs w:val="24"/>
         </w:rPr>
+        <w:t xml:space="preserve"> </w:t>
+      </w:r>
+      <w:r>
+        <w:rPr>
+          <w:rFonts w:ascii="Times New Roman" w:hAnsi="Times New Roman" w:cs="Times New Roman"/>
+          <w:sz w:val="24"/>
+          <w:szCs w:val="24"/>
+        </w:rPr>
+        <w:t>indicadores de velocidad de circulación, cantidad y gravedad de los siniestros, medidas de curvatura y frecuencia de accidentes en periodos con y sin lluvia, considerando la duración de cada condición.</w:t>
+      </w:r>
+    </w:p>
+    <w:p>
+      <w:pPr>
+        <w:rPr>
+          <w:rFonts w:ascii="Times New Roman" w:hAnsi="Times New Roman" w:cs="Times New Roman"/>
+          <w:sz w:val="24"/>
+          <w:szCs w:val="24"/>
+        </w:rPr>
       </w:pPr>
       <w:r>
         <w:rPr>
@@ -729,7 +816,104 @@
           <w:sz w:val="24"/>
           <w:szCs w:val="24"/>
         </w:rPr>
+        <w:t>Alcanzable:</w:t>
+      </w:r>
+      <w:r>
+        <w:rPr>
+          <w:rFonts w:ascii="Times New Roman" w:hAnsi="Times New Roman" w:cs="Times New Roman"/>
+          <w:b/>
+          <w:bCs/>
+          <w:sz w:val="24"/>
+          <w:szCs w:val="24"/>
+        </w:rPr>
+        <w:t xml:space="preserve"> </w:t>
+      </w:r>
+      <w:r>
+        <w:rPr>
+          <w:rFonts w:ascii="Times New Roman" w:hAnsi="Times New Roman" w:cs="Times New Roman"/>
+          <w:sz w:val="24"/>
+          <w:szCs w:val="24"/>
+        </w:rPr>
+        <w:t>con radares Doppler simulados y datos públicos consultados mediante las APIs de Siniestralidad, Segmento Vial - Flujo y Open-Meteo.</w:t>
+      </w:r>
+    </w:p>
+    <w:p>
+      <w:pPr>
+        <w:rPr>
+          <w:rFonts w:ascii="Times New Roman" w:hAnsi="Times New Roman" w:cs="Times New Roman"/>
+          <w:b/>
+          <w:bCs/>
+          <w:sz w:val="24"/>
+          <w:szCs w:val="24"/>
+        </w:rPr>
+      </w:pPr>
+      <w:r>
+        <w:rPr>
+          <w:rFonts w:ascii="Times New Roman" w:hAnsi="Times New Roman" w:cs="Times New Roman"/>
+          <w:b/>
+          <w:bCs/>
+          <w:sz w:val="24"/>
+          <w:szCs w:val="24"/>
+        </w:rPr>
         <w:lastRenderedPageBreak/>
+        <w:t xml:space="preserve">Relevante: </w:t>
+      </w:r>
+      <w:r>
+        <w:rPr>
+          <w:rFonts w:ascii="Times New Roman" w:hAnsi="Times New Roman" w:cs="Times New Roman"/>
+          <w:sz w:val="24"/>
+          <w:szCs w:val="24"/>
+        </w:rPr>
+        <w:t>responde a un problema de seguridad vial documentado y permite comparar diferentes tramos mediante información integrada de fuentes independientes.</w:t>
+      </w:r>
+    </w:p>
+    <w:p>
+      <w:pPr>
+        <w:rPr>
+          <w:rFonts w:ascii="Times New Roman" w:hAnsi="Times New Roman" w:cs="Times New Roman"/>
+          <w:b/>
+          <w:bCs/>
+          <w:sz w:val="24"/>
+          <w:szCs w:val="24"/>
+        </w:rPr>
+      </w:pPr>
+      <w:r>
+        <w:rPr>
+          <w:rFonts w:ascii="Times New Roman" w:hAnsi="Times New Roman" w:cs="Times New Roman"/>
+          <w:b/>
+          <w:bCs/>
+          <w:sz w:val="24"/>
+          <w:szCs w:val="24"/>
+        </w:rPr>
+        <w:t xml:space="preserve">Temporal: </w:t>
+      </w:r>
+      <w:r>
+        <w:rPr>
+          <w:rFonts w:ascii="Times New Roman" w:hAnsi="Times New Roman" w:cs="Times New Roman"/>
+          <w:sz w:val="24"/>
+          <w:szCs w:val="24"/>
+        </w:rPr>
+        <w:t>entregable dentro del plazo del proyecto, según cronograma del curso.</w:t>
+      </w:r>
+    </w:p>
+    <w:p>
+      <w:pPr>
+        <w:rPr>
+          <w:rFonts w:ascii="Times New Roman" w:hAnsi="Times New Roman" w:cs="Times New Roman"/>
+          <w:b/>
+          <w:bCs/>
+          <w:sz w:val="24"/>
+          <w:szCs w:val="24"/>
+        </w:rPr>
+      </w:pPr>
+      <w:r>
+        <w:rPr>
+          <w:rFonts w:ascii="Times New Roman" w:hAnsi="Times New Roman" w:cs="Times New Roman"/>
+          <w:b/>
+          <w:bCs/>
+          <w:sz w:val="24"/>
+          <w:szCs w:val="24"/>
+        </w:rPr>
         <w:t>Actividad 2: Recursos-Identificación e Integración de Fuentes</w:t>
       </w:r>
     </w:p>
@@ -1038,6 +1222,7 @@
           <w:sz w:val="24"/>
           <w:szCs w:val="24"/>
         </w:rPr>
+        <w:lastRenderedPageBreak/>
         <w:t>2.2 Variables clave.</w:t>
       </w:r>
       <w:r>
@@ -1199,7 +1384,6 @@
                 <w:sz w:val="24"/>
                 <w:szCs w:val="24"/>
               </w:rPr>
-              <w:lastRenderedPageBreak/>
               <w:t>Radar Doppler OPS243-A</w:t>
             </w:r>
           </w:p>
@@ -2493,6 +2677,7 @@
                 <w:sz w:val="24"/>
                 <w:szCs w:val="24"/>
               </w:rPr>
+              <w:lastRenderedPageBreak/>
               <w:t>Segmento Vial - Flujo</w:t>
             </w:r>
           </w:p>
@@ -2687,7 +2872,6 @@
                 <w:sz w:val="24"/>
                 <w:szCs w:val="24"/>
               </w:rPr>
-              <w:lastRenderedPageBreak/>
               <w:t>Segmento Vial - Flujo</w:t>
             </w:r>
           </w:p>
@@ -3523,16 +3707,8 @@
           <w:sz w:val="24"/>
           <w:szCs w:val="24"/>
         </w:rPr>
-        <w:t xml:space="preserve">La fuente primaria del proyecto es un radar de velocidad: el OmniPreSense OPS243-A. Funciona parecido al radar que usa un policía de tránsito para medir qué tan rápido va un carro. Para el proyecto se plantea ubicarlo en un punto fijo de la curva de La Asomadera #2, sobre la Avenida Las Palmas, en las coordenadas 6.220055 de latitud y -75.562449 de </w:t>
-      </w:r>
-      <w:r>
-        <w:rPr>
-          <w:rFonts w:ascii="Times New Roman" w:hAnsi="Times New Roman" w:cs="Times New Roman"/>
-          <w:sz w:val="24"/>
-          <w:szCs w:val="24"/>
-        </w:rPr>
         <w:lastRenderedPageBreak/>
-        <w:t>longitud. Esta ubicación se encuentra entre las geometrías de las dos calzadas de Las Palmas obtenidas mediante la fuente Segmento Vial. El proceso de adquisición tiene tres pasos:</w:t>
+        <w:t>La fuente primaria del proyecto es un radar de velocidad: el OmniPreSense OPS243-A. Funciona parecido al radar que usa un policía de tránsito para medir qué tan rápido va un carro. Para el proyecto se plantea ubicarlo en un punto fijo de la curva de La Asomadera #2, sobre la Avenida Las Palmas, en las coordenadas 6.220055 de latitud y -75.562449 de longitud. Esta ubicación se encuentra entre las geometrías de las dos calzadas de Las Palmas obtenidas mediante la fuente Segmento Vial. El proceso de adquisición tiene tres pasos:</w:t>
       </w:r>
     </w:p>
     <w:p>
@@ -4575,6 +4751,7 @@
                 <w:sz w:val="24"/>
                 <w:szCs w:val="24"/>
               </w:rPr>
+              <w:lastRenderedPageBreak/>
               <w:t>14/3/2026 07:32</w:t>
             </w:r>
           </w:p>
@@ -4747,7 +4924,6 @@
           <w:sz w:val="24"/>
           <w:szCs w:val="24"/>
         </w:rPr>
-        <w:lastRenderedPageBreak/>
         <w:drawing>
           <wp:inline distT="0" distB="0" distL="0" distR="0" wp14:anchorId="283BA38F" wp14:editId="42976E8F">
             <wp:extent cx="6509747" cy="1533525"/>
@@ -5317,6 +5493,7 @@
           <w:sz w:val="24"/>
           <w:szCs w:val="24"/>
         </w:rPr>
+        <w:lastRenderedPageBreak/>
         <w:t>Tabla 1. Calidad general de las fuentes de datos</w:t>
       </w:r>
     </w:p>
@@ -5360,7 +5537,6 @@
                 <w:sz w:val="24"/>
                 <w:szCs w:val="24"/>
               </w:rPr>
-              <w:lastRenderedPageBreak/>
               <w:t>Nombre de la fuente</w:t>
             </w:r>
           </w:p>
@@ -6572,7 +6748,6 @@
           <w:sz w:val="24"/>
           <w:szCs w:val="24"/>
         </w:rPr>
-        <w:lastRenderedPageBreak/>
         <w:t xml:space="preserve">Referencias </w:t>
       </w:r>
     </w:p>
@@ -6743,7 +6918,7 @@
       </w:hyperlink>
     </w:p>
     <w:p>
-      <w:commentRangeStart w:id="2"/>
+      <w:commentRangeStart w:id="1"/>
       <w:r>
         <w:rPr>
           <w:rFonts w:ascii="Times New Roman" w:hAnsi="Times New Roman" w:cs="Times New Roman"/>
@@ -6781,14 +6956,14 @@
           <w:t>https://claude.ai</w:t>
         </w:r>
       </w:hyperlink>
-      <w:commentRangeEnd w:id="2"/>
+      <w:commentRangeEnd w:id="1"/>
       <w:r>
         <w:rPr>
           <w:rStyle w:val="Refdecomentario"/>
           <w:sz w:val="22"/>
           <w:szCs w:val="22"/>
         </w:rPr>
-        <w:commentReference w:id="2"/>
+        <w:commentReference w:id="1"/>
       </w:r>
     </w:p>
     <w:p>
@@ -7001,23 +7176,7 @@
       </w:r>
     </w:p>
   </w:comment>
-  <w:comment w:id="1" w:author="MARTIN DORIA RICARDO" w:date="2026-09-14T10:42:00Z" w:initials="MD">
-    <w:p>
-      <w:pPr>
-        <w:pStyle w:val="Textocomentario"/>
-      </w:pPr>
-      <w:r>
-        <w:rPr>
-          <w:rStyle w:val="Refdecomentario"/>
-        </w:rPr>
-        <w:annotationRef/>
-      </w:r>
-      <w:r>
-        <w:t>Sin embargo, ninguna de estas fuentes permite definir  si el comportamiento de velocidad en el punto exacto de la curva está asociado con la frecuencia de siniestros en ese sitio. La integración de datos permite resolver esta limitación: cruzando mediciones puntuales de velocidad con el histórico geolocalizado de incidentes es posible pasar de un diagnóstico general del corredor a evidencia específica del tramo, que respalde decisiones de intervención (señalización, reductores de velocidad, cámaras de control).</w:t>
-      </w:r>
-    </w:p>
-  </w:comment>
-  <w:comment w:id="2" w:author="MARTIN DORIA RICARDO" w:date="2026-09-14T11:15:00Z" w:initials="MD">
+  <w:comment w:id="1" w:author="MARTIN DORIA RICARDO" w:date="2026-09-14T11:15:00Z" w:initials="MD">
     <w:p>
       <w:pPr>
         <w:pStyle w:val="Textocomentario"/>
@@ -7039,7 +7198,6 @@
 <file path=word/commentsExtended.xml><?xml version="1.0" encoding="utf-8"?>
 <w15:commentsEx xmlns:wpc="http://schemas.microsoft.com/office/word/2010/wordprocessingCanvas" xmlns:cx="http://schemas.microsoft.com/office/drawing/2014/chartex" xmlns:cx1="http://schemas.microsoft.com/office/drawing/2015/9/8/chartex" xmlns:cx2="http://schemas.microsoft.com/office/drawing/2015/10/21/chartex" xmlns:cx3="http://schemas.microsoft.com/office/drawing/2016/5/9/chartex" xmlns:cx4="http://schemas.microsoft.com/office/drawing/2016/5/10/chartex" xmlns:cx5="http://schemas.microsoft.com/office/drawing/2016/5/11/chartex" xmlns:cx6="http://schemas.microsoft.com/office/drawing/2016/5/12/chartex" xmlns:cx7="http://schemas.microsoft.com/office/drawing/2016/5/13/chartex" xmlns:cx8="http://schemas.microsoft.com/office/drawing/2016/5/14/chartex" xmlns:mc="http://schemas.openxmlformats.org/markup-compatibility/2006" xmlns:aink="http://schemas.microsoft.com/office/drawing/2016/ink" xmlns:am3d="http://schemas.microsoft.com/office/drawing/2017/model3d" xmlns:o="urn:schemas-microsoft-com:office:office" xmlns:oel="http://schemas.microsoft.com/office/2019/extlst" xmlns:r="http://schemas.openxmlformats.org/officeDocument/2006/relationships" xmlns:m="http://schemas.openxmlformats.org/officeDocument/2006/math" xmlns:v="urn:schemas-microsoft-com:vml" xmlns:wp14="http://schemas.microsoft.com/office/word/2010/wordprocessingDrawing" xmlns:wp="http://schemas.openxmlformats.org/drawingml/2006/wordprocessingDrawing" xmlns:w10="urn:schemas-microsoft-com:office:word" xmlns:w="http://schemas.openxmlformats.org/wordprocessingml/2006/main" xmlns:w14="http://schemas.microsoft.com/office/word/2010/wordml" xmlns:w15="http://schemas.microsoft.com/office/word/2012/wordml" xmlns:w16cex="http://schemas.microsoft.com/office/word/2018/wordml/cex" xmlns:w16cid="http://schemas.microsoft.com/office/word/2016/wordml/cid" xmlns:w16="http://schemas.microsoft.com/office/word/2018/wordml" xmlns:w16du="http://schemas.microsoft.com/office/word/2023/wordml/word16du" xmlns:w16sdtdh="http://schemas.microsoft.com/office/word/2020/wordml/sdtdatahash" xmlns:w16sdtfl="http://schemas.microsoft.com/office/word/2024/wordml/sdtformatlock" xmlns:w16se="http://schemas.microsoft.com/office/word/2015/wordml/symex" xmlns:wpg="http://schemas.microsoft.com/office/word/2010/wordprocessingGroup" xmlns:wpi="http://schemas.microsoft.com/office/word/2010/wordprocessingInk" xmlns:wne="http://schemas.microsoft.com/office/word/2006/wordml" xmlns:wps="http://schemas.microsoft.com/office/word/2010/wordprocessingShape" mc:Ignorable="w14 w15 w16se w16cid w16 w16cex w16sdtdh w16sdtfl w16du wp14">
   <w15:commentEx w15:paraId="77BE341C" w15:done="1"/>
-  <w15:commentEx w15:paraId="2EAA33AA" w15:done="1"/>
   <w15:commentEx w15:paraId="6F2F482A" w15:done="1"/>
 </w15:commentsEx>
 </file>
@@ -7047,7 +7205,6 @@
 <file path=word/commentsExtensible.xml><?xml version="1.0" encoding="utf-8"?>
 <w16cex:commentsExtensible xmlns:wpc="http://schemas.microsoft.com/office/word/2010/wordprocessingCanvas" xmlns:cx="http://schemas.microsoft.com/office/drawing/2014/chartex" xmlns:cx1="http://schemas.microsoft.com/office/drawing/2015/9/8/chartex" xmlns:cx2="http://schemas.microsoft.com/office/drawing/2015/10/21/chartex" xmlns:cx3="http://schemas.microsoft.com/office/drawing/2016/5/9/chartex" xmlns:cx4="http://schemas.microsoft.com/office/drawing/2016/5/10/chartex" xmlns:cx5="http://schemas.microsoft.com/office/drawing/2016/5/11/chartex" xmlns:cx6="http://schemas.microsoft.com/office/drawing/2016/5/12/chartex" xmlns:cx7="http://schemas.microsoft.com/office/drawing/2016/5/13/chartex" xmlns:cx8="http://schemas.microsoft.com/office/drawing/2016/5/14/chartex" xmlns:cr="http://schemas.microsoft.com/office/comments/2020/reactions" xmlns:mc="http://schemas.openxmlformats.org/markup-compatibility/2006" xmlns:aink="http://schemas.microsoft.com/office/drawing/2016/ink" xmlns:am3d="http://schemas.microsoft.com/office/drawing/2017/model3d" xmlns:o="urn:schemas-microsoft-com:office:office" xmlns:oel="http://schemas.microsoft.com/office/2019/extlst" xmlns:r="http://schemas.openxmlformats.org/officeDocument/2006/relationships" xmlns:m="http://schemas.openxmlformats.org/officeDocument/2006/math" xmlns:v="urn:schemas-microsoft-com:vml" xmlns:wp14="http://schemas.microsoft.com/office/word/2010/wordprocessingDrawing" xmlns:wp="http://schemas.openxmlformats.org/drawingml/2006/wordprocessingDrawing" xmlns:w10="urn:schemas-microsoft-com:office:word" xmlns:w="http://schemas.openxmlformats.org/wordprocessingml/2006/main" xmlns:w14="http://schemas.microsoft.com/office/word/2010/wordml" xmlns:w15="http://schemas.microsoft.com/office/word/2012/wordml" xmlns:w16cex="http://schemas.microsoft.com/office/word/2018/wordml/cex" xmlns:w16cid="http://schemas.microsoft.com/office/word/2016/wordml/cid" xmlns:w16="http://schemas.microsoft.com/office/word/2018/wordml" xmlns:w16du="http://schemas.microsoft.com/office/word/2023/wordml/word16du" xmlns:w16sdtdh="http://schemas.microsoft.com/office/word/2020/wordml/sdtdatahash" xmlns:w16sdtfl="http://schemas.microsoft.com/office/word/2024/wordml/sdtformatlock" xmlns:w16se="http://schemas.microsoft.com/office/word/2015/wordml/symex" xmlns:wpg="http://schemas.microsoft.com/office/word/2010/wordprocessingGroup" xmlns:wpi="http://schemas.microsoft.com/office/word/2010/wordprocessingInk" xmlns:wne="http://schemas.microsoft.com/office/word/2006/wordml" xmlns:wps="http://schemas.microsoft.com/office/word/2010/wordprocessingShape" mc:Ignorable="w14 w15 w16se w16cid w16 w16cex w16sdtdh w16sdtfl cr w16du wp14">
   <w16cex:commentExtensible w16cex:durableId="1B3730D8" w16cex:dateUtc="2026-09-14T15:36:00Z"/>
-  <w16cex:commentExtensible w16cex:durableId="1B8FC38A" w16cex:dateUtc="2026-09-14T15:42:00Z"/>
   <w16cex:commentExtensible w16cex:durableId="00D0293E" w16cex:dateUtc="2026-09-14T16:15:00Z"/>
 </w16cex:commentsExtensible>
 </file>
@@ -7055,7 +7212,6 @@
 <file path=word/commentsIds.xml><?xml version="1.0" encoding="utf-8"?>
 <w16cid:commentsIds xmlns:wpc="http://schemas.microsoft.com/office/word/2010/wordprocessingCanvas" xmlns:cx="http://schemas.microsoft.com/office/drawing/2014/chartex" xmlns:cx1="http://schemas.microsoft.com/office/drawing/2015/9/8/chartex" xmlns:cx2="http://schemas.microsoft.com/office/drawing/2015/10/21/chartex" xmlns:cx3="http://schemas.microsoft.com/office/drawing/2016/5/9/chartex" xmlns:cx4="http://schemas.microsoft.com/office/drawing/2016/5/10/chartex" xmlns:cx5="http://schemas.microsoft.com/office/drawing/2016/5/11/chartex" xmlns:cx6="http://schemas.microsoft.com/office/drawing/2016/5/12/chartex" xmlns:cx7="http://schemas.microsoft.com/office/drawing/2016/5/13/chartex" xmlns:cx8="http://schemas.microsoft.com/office/drawing/2016/5/14/chartex" xmlns:mc="http://schemas.openxmlformats.org/markup-compatibility/2006" xmlns:aink="http://schemas.microsoft.com/office/drawing/2016/ink" xmlns:am3d="http://schemas.microsoft.com/office/drawing/2017/model3d" xmlns:o="urn:schemas-microsoft-com:office:office" xmlns:oel="http://schemas.microsoft.com/office/2019/extlst" xmlns:r="http://schemas.openxmlformats.org/officeDocument/2006/relationships" xmlns:m="http://schemas.openxmlformats.org/officeDocument/2006/math" xmlns:v="urn:schemas-microsoft-com:vml" xmlns:wp14="http://schemas.microsoft.com/office/word/2010/wordprocessingDrawing" xmlns:wp="http://schemas.openxmlformats.org/drawingml/2006/wordprocessingDrawing" xmlns:w10="urn:schemas-microsoft-com:office:word" xmlns:w="http://schemas.openxmlformats.org/wordprocessingml/2006/main" xmlns:w14="http://schemas.microsoft.com/office/word/2010/wordml" xmlns:w15="http://schemas.microsoft.com/office/word/2012/wordml" xmlns:w16cex="http://schemas.microsoft.com/office/word/2018/wordml/cex" xmlns:w16cid="http://schemas.microsoft.com/office/word/2016/wordml/cid" xmlns:w16="http://schemas.microsoft.com/office/word/2018/wordml" xmlns:w16du="http://schemas.microsoft.com/office/word/2023/wordml/word16du" xmlns:w16sdtdh="http://schemas.microsoft.com/office/word/2020/wordml/sdtdatahash" xmlns:w16sdtfl="http://schemas.microsoft.com/office/word/2024/wordml/sdtformatlock" xmlns:w16se="http://schemas.microsoft.com/office/word/2015/wordml/symex" xmlns:wpg="http://schemas.microsoft.com/office/word/2010/wordprocessingGroup" xmlns:wpi="http://schemas.microsoft.com/office/word/2010/wordprocessingInk" xmlns:wne="http://schemas.microsoft.com/office/word/2006/wordml" xmlns:wps="http://schemas.microsoft.com/office/word/2010/wordprocessingShape" mc:Ignorable="w14 w15 w16se w16cid w16 w16cex w16sdtdh w16sdtfl w16du wp14">
   <w16cid:commentId w16cid:paraId="77BE341C" w16cid:durableId="1B3730D8"/>
-  <w16cid:commentId w16cid:paraId="2EAA33AA" w16cid:durableId="1B8FC38A"/>
   <w16cid:commentId w16cid:paraId="6F2F482A" w16cid:durableId="00D0293E"/>
 </w16cid:commentsIds>
 </file>
@@ -7063,122 +7219,9 @@
 <file path=word/numbering.xml><?xml version="1.0" encoding="utf-8"?>
 <w:numbering xmlns:wpc="http://schemas.microsoft.com/office/word/2010/wordprocessingCanvas" xmlns:cx="http://schemas.microsoft.com/office/drawing/2014/chartex" xmlns:cx1="http://schemas.microsoft.com/office/drawing/2015/9/8/chartex" xmlns:cx2="http://schemas.microsoft.com/office/drawing/2015/10/21/chartex" xmlns:cx3="http://schemas.microsoft.com/office/drawing/2016/5/9/chartex" xmlns:cx4="http://schemas.microsoft.com/office/drawing/2016/5/10/chartex" xmlns:cx5="http://schemas.microsoft.com/office/drawing/2016/5/11/chartex" xmlns:cx6="http://schemas.microsoft.com/office/drawing/2016/5/12/chartex" xmlns:cx7="http://schemas.microsoft.com/office/drawing/2016/5/13/chartex" xmlns:cx8="http://schemas.microsoft.com/office/drawing/2016/5/14/chartex" xmlns:mc="http://schemas.openxmlformats.org/markup-compatibility/2006" xmlns:aink="http://schemas.microsoft.com/office/drawing/2016/ink" xmlns:am3d="http://schemas.microsoft.com/office/drawing/2017/model3d" xmlns:o="urn:schemas-microsoft-com:office:office" xmlns:oel="http://schemas.microsoft.com/office/2019/extlst" xmlns:r="http://schemas.openxmlformats.org/officeDocument/2006/relationships" xmlns:m="http://schemas.openxmlformats.org/officeDocument/2006/math" xmlns:v="urn:schemas-microsoft-com:vml" xmlns:wp14="http://schemas.microsoft.com/office/word/2010/wordprocessingDrawing" xmlns:wp="http://schemas.openxmlformats.org/drawingml/2006/wordprocessingDrawing" xmlns:w10="urn:schemas-microsoft-com:office:word" xmlns:w="http://schemas.openxmlformats.org/wordprocessingml/2006/main" xmlns:w14="http://schemas.microsoft.com/office/word/2010/wordml" xmlns:w15="http://schemas.microsoft.com/office/word/2012/wordml" xmlns:w16cex="http://schemas.microsoft.com/office/word/2018/wordml/cex" xmlns:w16cid="http://schemas.microsoft.com/office/word/2016/wordml/cid" xmlns:w16="http://schemas.microsoft.com/office/word/2018/wordml" xmlns:w16du="http://schemas.microsoft.com/office/word/2023/wordml/word16du" xmlns:w16sdtdh="http://schemas.microsoft.com/office/word/2020/wordml/sdtdatahash" xmlns:w16sdtfl="http://schemas.microsoft.com/office/word/2024/wordml/sdtformatlock" xmlns:w16se="http://schemas.microsoft.com/office/word/2015/wordml/symex" xmlns:wpg="http://schemas.microsoft.com/office/word/2010/wordprocessingGroup" xmlns:wpi="http://schemas.microsoft.com/office/word/2010/wordprocessingInk" xmlns:wne="http://schemas.microsoft.com/office/word/2006/wordml" xmlns:wps="http://schemas.microsoft.com/office/word/2010/wordprocessingShape" mc:Ignorable="w14 w15 w16se w16cid w16 w16cex w16sdtdh w16sdtfl w16du wp14">
   <w:abstractNum w:abstractNumId="0" w15:restartNumberingAfterBreak="0">
-    <w:nsid w:val="4FA94085"/>
+    <w:nsid w:val="20CE3EF7"/>
     <w:multiLevelType w:val="multilevel"/>
-    <w:tmpl w:val="05BA321A"/>
-    <w:lvl w:ilvl="0">
-      <w:start w:val="1"/>
-      <w:numFmt w:val="decimal"/>
-      <w:lvlText w:val="%1."/>
-      <w:lvlJc w:val="left"/>
-      <w:pPr>
-        <w:tabs>
-          <w:tab w:val="num" w:pos="720"/>
-        </w:tabs>
-        <w:ind w:left="720" w:hanging="360"/>
-      </w:pPr>
-    </w:lvl>
-    <w:lvl w:ilvl="1" w:tentative="1">
-      <w:start w:val="1"/>
-      <w:numFmt w:val="decimal"/>
-      <w:lvlText w:val="%2."/>
-      <w:lvlJc w:val="left"/>
-      <w:pPr>
-        <w:tabs>
-          <w:tab w:val="num" w:pos="1440"/>
-        </w:tabs>
-        <w:ind w:left="1440" w:hanging="360"/>
-      </w:pPr>
-    </w:lvl>
-    <w:lvl w:ilvl="2" w:tentative="1">
-      <w:start w:val="1"/>
-      <w:numFmt w:val="decimal"/>
-      <w:lvlText w:val="%3."/>
-      <w:lvlJc w:val="left"/>
-      <w:pPr>
-        <w:tabs>
-          <w:tab w:val="num" w:pos="2160"/>
-        </w:tabs>
-        <w:ind w:left="2160" w:hanging="360"/>
-      </w:pPr>
-    </w:lvl>
-    <w:lvl w:ilvl="3" w:tentative="1">
-      <w:start w:val="1"/>
-      <w:numFmt w:val="decimal"/>
-      <w:lvlText w:val="%4."/>
-      <w:lvlJc w:val="left"/>
-      <w:pPr>
-        <w:tabs>
-          <w:tab w:val="num" w:pos="2880"/>
-        </w:tabs>
-        <w:ind w:left="2880" w:hanging="360"/>
-      </w:pPr>
-    </w:lvl>
-    <w:lvl w:ilvl="4" w:tentative="1">
-      <w:start w:val="1"/>
-      <w:numFmt w:val="decimal"/>
-      <w:lvlText w:val="%5."/>
-      <w:lvlJc w:val="left"/>
-      <w:pPr>
-        <w:tabs>
-          <w:tab w:val="num" w:pos="3600"/>
-        </w:tabs>
-        <w:ind w:left="3600" w:hanging="360"/>
-      </w:pPr>
-    </w:lvl>
-    <w:lvl w:ilvl="5" w:tentative="1">
-      <w:start w:val="1"/>
-      <w:numFmt w:val="decimal"/>
-      <w:lvlText w:val="%6."/>
-      <w:lvlJc w:val="left"/>
-      <w:pPr>
-        <w:tabs>
-          <w:tab w:val="num" w:pos="4320"/>
-        </w:tabs>
-        <w:ind w:left="4320" w:hanging="360"/>
-      </w:pPr>
-    </w:lvl>
-    <w:lvl w:ilvl="6" w:tentative="1">
-      <w:start w:val="1"/>
-      <w:numFmt w:val="decimal"/>
-      <w:lvlText w:val="%7."/>
-      <w:lvlJc w:val="left"/>
-      <w:pPr>
-        <w:tabs>
-          <w:tab w:val="num" w:pos="5040"/>
-        </w:tabs>
-        <w:ind w:left="5040" w:hanging="360"/>
-      </w:pPr>
-    </w:lvl>
-    <w:lvl w:ilvl="7" w:tentative="1">
-      <w:start w:val="1"/>
-      <w:numFmt w:val="decimal"/>
-      <w:lvlText w:val="%8."/>
-      <w:lvlJc w:val="left"/>
-      <w:pPr>
-        <w:tabs>
-          <w:tab w:val="num" w:pos="5760"/>
-        </w:tabs>
-        <w:ind w:left="5760" w:hanging="360"/>
-      </w:pPr>
-    </w:lvl>
-    <w:lvl w:ilvl="8" w:tentative="1">
-      <w:start w:val="1"/>
-      <w:numFmt w:val="decimal"/>
-      <w:lvlText w:val="%9."/>
-      <w:lvlJc w:val="left"/>
-      <w:pPr>
-        <w:tabs>
-          <w:tab w:val="num" w:pos="6480"/>
-        </w:tabs>
-        <w:ind w:left="6480" w:hanging="360"/>
-      </w:pPr>
-    </w:lvl>
-  </w:abstractNum>
-  <w:abstractNum w:abstractNumId="1" w15:restartNumberingAfterBreak="0">
-    <w:nsid w:val="63BF608A"/>
-    <w:multiLevelType w:val="multilevel"/>
-    <w:tmpl w:val="E2EC29B4"/>
+    <w:tmpl w:val="710425A6"/>
     <w:lvl w:ilvl="0">
       <w:start w:val="1"/>
       <w:numFmt w:val="decimal"/>
@@ -7288,10 +7331,239 @@
       </w:rPr>
     </w:lvl>
   </w:abstractNum>
+  <w:abstractNum w:abstractNumId="1" w15:restartNumberingAfterBreak="0">
+    <w:nsid w:val="4FA94085"/>
+    <w:multiLevelType w:val="multilevel"/>
+    <w:tmpl w:val="05BA321A"/>
+    <w:lvl w:ilvl="0">
+      <w:start w:val="1"/>
+      <w:numFmt w:val="decimal"/>
+      <w:lvlText w:val="%1."/>
+      <w:lvlJc w:val="left"/>
+      <w:pPr>
+        <w:tabs>
+          <w:tab w:val="num" w:pos="720"/>
+        </w:tabs>
+        <w:ind w:left="720" w:hanging="360"/>
+      </w:pPr>
+    </w:lvl>
+    <w:lvl w:ilvl="1" w:tentative="1">
+      <w:start w:val="1"/>
+      <w:numFmt w:val="decimal"/>
+      <w:lvlText w:val="%2."/>
+      <w:lvlJc w:val="left"/>
+      <w:pPr>
+        <w:tabs>
+          <w:tab w:val="num" w:pos="1440"/>
+        </w:tabs>
+        <w:ind w:left="1440" w:hanging="360"/>
+      </w:pPr>
+    </w:lvl>
+    <w:lvl w:ilvl="2" w:tentative="1">
+      <w:start w:val="1"/>
+      <w:numFmt w:val="decimal"/>
+      <w:lvlText w:val="%3."/>
+      <w:lvlJc w:val="left"/>
+      <w:pPr>
+        <w:tabs>
+          <w:tab w:val="num" w:pos="2160"/>
+        </w:tabs>
+        <w:ind w:left="2160" w:hanging="360"/>
+      </w:pPr>
+    </w:lvl>
+    <w:lvl w:ilvl="3" w:tentative="1">
+      <w:start w:val="1"/>
+      <w:numFmt w:val="decimal"/>
+      <w:lvlText w:val="%4."/>
+      <w:lvlJc w:val="left"/>
+      <w:pPr>
+        <w:tabs>
+          <w:tab w:val="num" w:pos="2880"/>
+        </w:tabs>
+        <w:ind w:left="2880" w:hanging="360"/>
+      </w:pPr>
+    </w:lvl>
+    <w:lvl w:ilvl="4" w:tentative="1">
+      <w:start w:val="1"/>
+      <w:numFmt w:val="decimal"/>
+      <w:lvlText w:val="%5."/>
+      <w:lvlJc w:val="left"/>
+      <w:pPr>
+        <w:tabs>
+          <w:tab w:val="num" w:pos="3600"/>
+        </w:tabs>
+        <w:ind w:left="3600" w:hanging="360"/>
+      </w:pPr>
+    </w:lvl>
+    <w:lvl w:ilvl="5" w:tentative="1">
+      <w:start w:val="1"/>
+      <w:numFmt w:val="decimal"/>
+      <w:lvlText w:val="%6."/>
+      <w:lvlJc w:val="left"/>
+      <w:pPr>
+        <w:tabs>
+          <w:tab w:val="num" w:pos="4320"/>
+        </w:tabs>
+        <w:ind w:left="4320" w:hanging="360"/>
+      </w:pPr>
+    </w:lvl>
+    <w:lvl w:ilvl="6" w:tentative="1">
+      <w:start w:val="1"/>
+      <w:numFmt w:val="decimal"/>
+      <w:lvlText w:val="%7."/>
+      <w:lvlJc w:val="left"/>
+      <w:pPr>
+        <w:tabs>
+          <w:tab w:val="num" w:pos="5040"/>
+        </w:tabs>
+        <w:ind w:left="5040" w:hanging="360"/>
+      </w:pPr>
+    </w:lvl>
+    <w:lvl w:ilvl="7" w:tentative="1">
+      <w:start w:val="1"/>
+      <w:numFmt w:val="decimal"/>
+      <w:lvlText w:val="%8."/>
+      <w:lvlJc w:val="left"/>
+      <w:pPr>
+        <w:tabs>
+          <w:tab w:val="num" w:pos="5760"/>
+        </w:tabs>
+        <w:ind w:left="5760" w:hanging="360"/>
+      </w:pPr>
+    </w:lvl>
+    <w:lvl w:ilvl="8" w:tentative="1">
+      <w:start w:val="1"/>
+      <w:numFmt w:val="decimal"/>
+      <w:lvlText w:val="%9."/>
+      <w:lvlJc w:val="left"/>
+      <w:pPr>
+        <w:tabs>
+          <w:tab w:val="num" w:pos="6480"/>
+        </w:tabs>
+        <w:ind w:left="6480" w:hanging="360"/>
+      </w:pPr>
+    </w:lvl>
+  </w:abstractNum>
+  <w:abstractNum w:abstractNumId="2" w15:restartNumberingAfterBreak="0">
+    <w:nsid w:val="63BF608A"/>
+    <w:multiLevelType w:val="multilevel"/>
+    <w:tmpl w:val="E2EC29B4"/>
+    <w:lvl w:ilvl="0">
+      <w:start w:val="1"/>
+      <w:numFmt w:val="decimal"/>
+      <w:lvlText w:val="%1"/>
+      <w:lvlJc w:val="left"/>
+      <w:pPr>
+        <w:ind w:left="360" w:hanging="360"/>
+      </w:pPr>
+      <w:rPr>
+        <w:rFonts w:hint="default"/>
+      </w:rPr>
+    </w:lvl>
+    <w:lvl w:ilvl="1">
+      <w:start w:val="1"/>
+      <w:numFmt w:val="decimal"/>
+      <w:lvlText w:val="%1.%2"/>
+      <w:lvlJc w:val="left"/>
+      <w:pPr>
+        <w:ind w:left="360" w:hanging="360"/>
+      </w:pPr>
+      <w:rPr>
+        <w:rFonts w:hint="default"/>
+      </w:rPr>
+    </w:lvl>
+    <w:lvl w:ilvl="2">
+      <w:start w:val="1"/>
+      <w:numFmt w:val="decimal"/>
+      <w:lvlText w:val="%1.%2.%3"/>
+      <w:lvlJc w:val="left"/>
+      <w:pPr>
+        <w:ind w:left="720" w:hanging="720"/>
+      </w:pPr>
+      <w:rPr>
+        <w:rFonts w:hint="default"/>
+      </w:rPr>
+    </w:lvl>
+    <w:lvl w:ilvl="3">
+      <w:start w:val="1"/>
+      <w:numFmt w:val="decimal"/>
+      <w:lvlText w:val="%1.%2.%3.%4"/>
+      <w:lvlJc w:val="left"/>
+      <w:pPr>
+        <w:ind w:left="720" w:hanging="720"/>
+      </w:pPr>
+      <w:rPr>
+        <w:rFonts w:hint="default"/>
+      </w:rPr>
+    </w:lvl>
+    <w:lvl w:ilvl="4">
+      <w:start w:val="1"/>
+      <w:numFmt w:val="decimal"/>
+      <w:lvlText w:val="%1.%2.%3.%4.%5"/>
+      <w:lvlJc w:val="left"/>
+      <w:pPr>
+        <w:ind w:left="1080" w:hanging="1080"/>
+      </w:pPr>
+      <w:rPr>
+        <w:rFonts w:hint="default"/>
+      </w:rPr>
+    </w:lvl>
+    <w:lvl w:ilvl="5">
+      <w:start w:val="1"/>
+      <w:numFmt w:val="decimal"/>
+      <w:lvlText w:val="%1.%2.%3.%4.%5.%6"/>
+      <w:lvlJc w:val="left"/>
+      <w:pPr>
+        <w:ind w:left="1080" w:hanging="1080"/>
+      </w:pPr>
+      <w:rPr>
+        <w:rFonts w:hint="default"/>
+      </w:rPr>
+    </w:lvl>
+    <w:lvl w:ilvl="6">
+      <w:start w:val="1"/>
+      <w:numFmt w:val="decimal"/>
+      <w:lvlText w:val="%1.%2.%3.%4.%5.%6.%7"/>
+      <w:lvlJc w:val="left"/>
+      <w:pPr>
+        <w:ind w:left="1440" w:hanging="1440"/>
+      </w:pPr>
+      <w:rPr>
+        <w:rFonts w:hint="default"/>
+      </w:rPr>
+    </w:lvl>
+    <w:lvl w:ilvl="7">
+      <w:start w:val="1"/>
+      <w:numFmt w:val="decimal"/>
+      <w:lvlText w:val="%1.%2.%3.%4.%5.%6.%7.%8"/>
+      <w:lvlJc w:val="left"/>
+      <w:pPr>
+        <w:ind w:left="1440" w:hanging="1440"/>
+      </w:pPr>
+      <w:rPr>
+        <w:rFonts w:hint="default"/>
+      </w:rPr>
+    </w:lvl>
+    <w:lvl w:ilvl="8">
+      <w:start w:val="1"/>
+      <w:numFmt w:val="decimal"/>
+      <w:lvlText w:val="%1.%2.%3.%4.%5.%6.%7.%8.%9"/>
+      <w:lvlJc w:val="left"/>
+      <w:pPr>
+        <w:ind w:left="1800" w:hanging="1800"/>
+      </w:pPr>
+      <w:rPr>
+        <w:rFonts w:hint="default"/>
+      </w:rPr>
+    </w:lvl>
+  </w:abstractNum>
   <w:num w:numId="1" w16cid:durableId="446389816">
+    <w:abstractNumId w:val="2"/>
+  </w:num>
+  <w:num w:numId="2" w16cid:durableId="1140683844">
     <w:abstractNumId w:val="1"/>
   </w:num>
-  <w:num w:numId="2" w16cid:durableId="1140683844">
+  <w:num w:numId="3" w16cid:durableId="1259559188">
     <w:abstractNumId w:val="0"/>
   </w:num>
 </w:numbering>
@@ -7908,7 +8180,6 @@
   <w:style w:type="character" w:default="1" w:styleId="Fuentedeprrafopredeter">
     <w:name w:val="Default Paragraph Font"/>
     <w:uiPriority w:val="1"/>
-    <w:semiHidden/>
     <w:unhideWhenUsed/>
   </w:style>
   <w:style w:type="table" w:default="1" w:styleId="Tablanormal">
@@ -8815,18 +9086,18 @@
 </file>
 
 <file path=customXml/item2.xml><?xml version="1.0" encoding="utf-8"?>
-<p:properties xmlns:p="http://schemas.microsoft.com/office/2006/metadata/properties" xmlns:xsi="http://www.w3.org/2001/XMLSchema-instance" xmlns:pc="http://schemas.microsoft.com/office/infopath/2007/PartnerControls">
-  <documentManagement/>
-</p:properties>
-</file>
-
-<file path=customXml/item3.xml><?xml version="1.0" encoding="utf-8"?>
 <?mso-contentType ?>
 <FormTemplates xmlns="http://schemas.microsoft.com/sharepoint/v3/contenttype/forms">
   <Display>DocumentLibraryForm</Display>
   <Edit>DocumentLibraryForm</Edit>
   <New>DocumentLibraryForm</New>
 </FormTemplates>
+</file>
+
+<file path=customXml/item3.xml><?xml version="1.0" encoding="utf-8"?>
+<p:properties xmlns:p="http://schemas.microsoft.com/office/2006/metadata/properties" xmlns:xsi="http://www.w3.org/2001/XMLSchema-instance" xmlns:pc="http://schemas.microsoft.com/office/infopath/2007/PartnerControls">
+  <documentManagement/>
+</p:properties>
 </file>
 
 <file path=customXml/itemProps1.xml><?xml version="1.0" encoding="utf-8"?>
@@ -8848,18 +9119,18 @@
 </file>
 
 <file path=customXml/itemProps2.xml><?xml version="1.0" encoding="utf-8"?>
+<ds:datastoreItem xmlns:ds="http://schemas.openxmlformats.org/officeDocument/2006/customXml" ds:itemID="{0E95F6D3-464D-4EF4-A884-64B7E16BCDAC}">
+  <ds:schemaRefs>
+    <ds:schemaRef ds:uri="http://schemas.microsoft.com/sharepoint/v3/contenttype/forms"/>
+  </ds:schemaRefs>
+</ds:datastoreItem>
+</file>
+
+<file path=customXml/itemProps3.xml><?xml version="1.0" encoding="utf-8"?>
 <ds:datastoreItem xmlns:ds="http://schemas.openxmlformats.org/officeDocument/2006/customXml" ds:itemID="{982FA805-0B52-43B1-8910-1BD67303419A}">
   <ds:schemaRefs>
     <ds:schemaRef ds:uri="http://schemas.microsoft.com/office/2006/metadata/properties"/>
     <ds:schemaRef ds:uri="http://schemas.microsoft.com/office/infopath/2007/PartnerControls"/>
   </ds:schemaRefs>
 </ds:datastoreItem>
-</file>
-
-<file path=customXml/itemProps3.xml><?xml version="1.0" encoding="utf-8"?>
-<ds:datastoreItem xmlns:ds="http://schemas.openxmlformats.org/officeDocument/2006/customXml" ds:itemID="{0E95F6D3-464D-4EF4-A884-64B7E16BCDAC}">
-  <ds:schemaRefs>
-    <ds:schemaRef ds:uri="http://schemas.microsoft.com/sharepoint/v3/contenttype/forms"/>
-  </ds:schemaRefs>
-</ds:datastoreItem>
 </file>
</xml_diff>

<commit_message>
actualizacion de fuentes 03 y 04 y el docx hasta el 2.1 corregido
</commit_message>
<xml_diff>
--- a/Proyecto Adquision.docx
+++ b/Proyecto Adquision.docx
@@ -927,158 +927,20 @@
         <w:rPr>
           <w:rFonts w:ascii="Times New Roman" w:hAnsi="Times New Roman" w:cs="Times New Roman"/>
         </w:rPr>
-        <w:t>Para el desarrollo del proyecto se seleccionaron tres fuentes independientes</w:t>
-      </w:r>
-      <w:r>
-        <w:rPr>
-          <w:rFonts w:ascii="Times New Roman" w:hAnsi="Times New Roman" w:cs="Times New Roman"/>
-        </w:rPr>
-        <w:t>:</w:t>
-      </w:r>
-      <w:r>
-        <w:rPr>
-          <w:rFonts w:ascii="Times New Roman" w:hAnsi="Times New Roman" w:cs="Times New Roman"/>
-        </w:rPr>
-        <w:t xml:space="preserve"> </w:t>
-      </w:r>
-      <w:r>
-        <w:rPr>
-          <w:rFonts w:ascii="Times New Roman" w:hAnsi="Times New Roman" w:cs="Times New Roman"/>
-        </w:rPr>
-        <w:t>l</w:t>
-      </w:r>
-      <w:r>
-        <w:rPr>
-          <w:rFonts w:ascii="Times New Roman" w:hAnsi="Times New Roman" w:cs="Times New Roman"/>
-        </w:rPr>
-        <w:t xml:space="preserve">a API de Siniestralidad </w:t>
-      </w:r>
-      <w:r>
-        <w:rPr>
-          <w:rFonts w:ascii="Times New Roman" w:hAnsi="Times New Roman" w:cs="Times New Roman"/>
-        </w:rPr>
-        <w:t xml:space="preserve">que </w:t>
-      </w:r>
-      <w:r>
-        <w:rPr>
-          <w:rFonts w:ascii="Times New Roman" w:hAnsi="Times New Roman" w:cs="Times New Roman"/>
-        </w:rPr>
-        <w:t>aporta los antecedentes históricos de los eventos viales</w:t>
-      </w:r>
-      <w:r>
-        <w:rPr>
-          <w:rFonts w:ascii="Times New Roman" w:hAnsi="Times New Roman" w:cs="Times New Roman"/>
-        </w:rPr>
-        <w:t>,</w:t>
-      </w:r>
-      <w:r>
-        <w:rPr>
-          <w:rFonts w:ascii="Times New Roman" w:hAnsi="Times New Roman" w:cs="Times New Roman"/>
-        </w:rPr>
-        <w:t xml:space="preserve"> la capa Segmento Vial - Flujo </w:t>
-      </w:r>
-      <w:r>
-        <w:rPr>
-          <w:rFonts w:ascii="Times New Roman" w:hAnsi="Times New Roman" w:cs="Times New Roman"/>
-        </w:rPr>
-        <w:t xml:space="preserve">que </w:t>
-      </w:r>
-      <w:r>
-        <w:rPr>
-          <w:rFonts w:ascii="Times New Roman" w:hAnsi="Times New Roman" w:cs="Times New Roman"/>
-        </w:rPr>
-        <w:t>permite representar la geometría y ubicación del tramo vial</w:t>
-      </w:r>
-      <w:r>
-        <w:rPr>
-          <w:rFonts w:ascii="Times New Roman" w:hAnsi="Times New Roman" w:cs="Times New Roman"/>
-        </w:rPr>
-        <w:t xml:space="preserve"> y por último</w:t>
-      </w:r>
-      <w:r>
-        <w:rPr>
-          <w:rFonts w:ascii="Times New Roman" w:hAnsi="Times New Roman" w:cs="Times New Roman"/>
-        </w:rPr>
-        <w:t xml:space="preserve"> el radar Doppler </w:t>
-      </w:r>
-      <w:r>
-        <w:rPr>
-          <w:rFonts w:ascii="Times New Roman" w:hAnsi="Times New Roman" w:cs="Times New Roman"/>
-        </w:rPr>
-        <w:t xml:space="preserve">que </w:t>
-      </w:r>
-      <w:r>
-        <w:rPr>
-          <w:rFonts w:ascii="Times New Roman" w:hAnsi="Times New Roman" w:cs="Times New Roman"/>
-        </w:rPr>
-        <w:t>aporta la variable de velocidad de circulación</w:t>
-      </w:r>
-      <w:r>
-        <w:rPr>
-          <w:rFonts w:ascii="Times New Roman" w:hAnsi="Times New Roman" w:cs="Times New Roman"/>
-        </w:rPr>
-        <w:t>.</w:t>
-      </w:r>
-    </w:p>
-    <w:p>
-      <w:pPr>
-        <w:rPr>
-          <w:rFonts w:ascii="Times New Roman" w:hAnsi="Times New Roman" w:cs="Times New Roman"/>
-        </w:rPr>
-      </w:pPr>
-      <w:r>
-        <w:rPr>
-          <w:rFonts w:ascii="Times New Roman" w:hAnsi="Times New Roman" w:cs="Times New Roman"/>
-        </w:rPr>
-        <w:t xml:space="preserve">Las dos fuentes públicas fueron consultadas a través de sus APIs REST y el sensor fue elegido y definido gracias a documentación técnica oficial del radar </w:t>
-      </w:r>
-      <w:r>
-        <w:rPr>
-          <w:rFonts w:ascii="Times New Roman" w:hAnsi="Times New Roman" w:cs="Times New Roman"/>
-        </w:rPr>
-        <w:t>OmniPreSense OPS243-A</w:t>
-      </w:r>
-      <w:r>
-        <w:rPr>
-          <w:rFonts w:ascii="Times New Roman" w:hAnsi="Times New Roman" w:cs="Times New Roman"/>
-        </w:rPr>
-        <w:t xml:space="preserve">. La evidencia de estas consultas está en los notebooks donde mostramos las llamadas a las APIs y sus respuestas, también para dejar documentada la investigación del radar: </w:t>
-      </w:r>
-      <w:r>
-        <w:rPr>
-          <w:rFonts w:ascii="Times New Roman" w:hAnsi="Times New Roman" w:cs="Times New Roman"/>
-        </w:rPr>
-        <w:t>01_API_Siniestralidad.ipynb</w:t>
-      </w:r>
-      <w:r>
-        <w:rPr>
-          <w:rFonts w:ascii="Times New Roman" w:hAnsi="Times New Roman" w:cs="Times New Roman"/>
-        </w:rPr>
-        <w:t xml:space="preserve">, </w:t>
-      </w:r>
-      <w:r>
-        <w:rPr>
-          <w:rFonts w:ascii="Times New Roman" w:hAnsi="Times New Roman" w:cs="Times New Roman"/>
-        </w:rPr>
-        <w:t>02_API_Segmento_Vial.ipynb</w:t>
-      </w:r>
-      <w:r>
-        <w:rPr>
-          <w:rFonts w:ascii="Times New Roman" w:hAnsi="Times New Roman" w:cs="Times New Roman"/>
-        </w:rPr>
-        <w:t xml:space="preserve">, </w:t>
-      </w:r>
-      <w:r>
-        <w:rPr>
-          <w:rFonts w:ascii="Times New Roman" w:hAnsi="Times New Roman" w:cs="Times New Roman"/>
-        </w:rPr>
-        <w:t>03_Radar_Doppler.ipynb</w:t>
-      </w:r>
-      <w:r>
-        <w:rPr>
-          <w:rFonts w:ascii="Times New Roman" w:hAnsi="Times New Roman" w:cs="Times New Roman"/>
-        </w:rPr>
-        <w:t xml:space="preserve"> </w:t>
+        <w:t>Para el desarrollo del proyecto se seleccionaron cuatro fuentes independientes: la API de Siniestralidad que aporta los antecedentes históricos de los eventos viales, la capa Segmento Vial - Flujo que permite representar la geometría y ubicación de los tramos viales, el radar Doppler que aporta la variable de velocidad de circulación y la API meteorológica de Open-Meteo que proporciona registros históricos de precipitación, temperatura y humedad.</w:t>
+      </w:r>
+    </w:p>
+    <w:p>
+      <w:pPr>
+        <w:rPr>
+          <w:rFonts w:ascii="Times New Roman" w:hAnsi="Times New Roman" w:cs="Times New Roman"/>
+        </w:rPr>
+      </w:pPr>
+      <w:r>
+        <w:rPr>
+          <w:rFonts w:ascii="Times New Roman" w:hAnsi="Times New Roman" w:cs="Times New Roman"/>
+        </w:rPr>
+        <w:t>Las tres fuentes públicas se consultan a través de sus APIs REST y los radares Doppler simulados fueron elegidos y definidos gracias a la documentación técnica oficial del OmniPreSense OPS243-A. La evidencia de las consultas y la definición de las fuentes se encuentra en los notebooks: 01_API_Siniestralidad.ipynb, 02_API_Segmento_Vial.ipynb, 03_Radar_Doppler.ipynb y 04_API_Meteorologia.ipynb.</w:t>
       </w:r>
     </w:p>
     <w:p>
@@ -1107,14 +969,11 @@
         </w:rPr>
       </w:pPr>
       <w:r>
-        <w:rPr>
-          <w:noProof/>
-        </w:rPr>
         <w:drawing>
-          <wp:inline distT="0" distB="0" distL="0" distR="0" wp14:anchorId="38F12F2F" wp14:editId="26A887E7">
-            <wp:extent cx="5612130" cy="2725420"/>
+          <wp:inline distT="0" distB="0" distL="0" distR="0" wp14:anchorId="78E9D895" wp14:editId="0598546D">
+            <wp:extent cx="5612130" cy="4076700"/>
             <wp:effectExtent l="0" t="0" r="7620" b="0"/>
-            <wp:docPr id="803433083" name="Imagen 1"/>
+            <wp:docPr id="1180426609" name="Imagen 6"/>
             <wp:cNvGraphicFramePr>
               <a:graphicFrameLocks xmlns:a="http://schemas.openxmlformats.org/drawingml/2006/main" noChangeAspect="1"/>
             </wp:cNvGraphicFramePr>
@@ -1122,7 +981,7 @@
               <a:graphicData uri="http://schemas.openxmlformats.org/drawingml/2006/picture">
                 <pic:pic xmlns:pic="http://schemas.openxmlformats.org/drawingml/2006/picture">
                   <pic:nvPicPr>
-                    <pic:cNvPr id="0" name="Picture 1"/>
+                    <pic:cNvPr id="0" name="Picture 6"/>
                     <pic:cNvPicPr>
                       <a:picLocks noChangeAspect="1" noChangeArrowheads="1"/>
                     </pic:cNvPicPr>
@@ -1143,7 +1002,7 @@
                   <pic:spPr bwMode="auto">
                     <a:xfrm>
                       <a:off x="0" y="0"/>
-                      <a:ext cx="5612130" cy="2725420"/>
+                      <a:ext cx="5612130" cy="4076700"/>
                     </a:xfrm>
                     <a:prstGeom prst="rect">
                       <a:avLst/>
@@ -1174,7 +1033,16 @@
           <w:sz w:val="24"/>
           <w:szCs w:val="24"/>
         </w:rPr>
-        <w:t>Selección de las variables clave: Para cada fuente se escogió la variable que aporta la información más importante para el análisis. En la API de Siniestralidad se tomó gravedad_siniestro, porque permite conocer el nivel de gravedad de los accidentes registrados. En Segmento Vial - Flujo se eligió shape, porque representa mediante una geometría la forma y ubicación del tramo vial dentro del mapa. Esto permite identificar espacialmente la vía que se está estudiando. En el radar Doppler se seleccionó velocidad_kmh, porque es el dato principal que entrega el sensor y permite conocer cómo se comporta la velocidad de los vehículos en el sector.</w:t>
+        <w:t xml:space="preserve">Selección de las variables clave: Para cada fuente se escogió la variable que aporta la información más importante para el análisis. En la API de Siniestralidad se tomó gravedad_siniestro, porque permite conocer el nivel de gravedad de los accidentes registrados. En Segmento Vial - Flujo se eligió shape, porque representa mediante una </w:t>
+      </w:r>
+      <w:r>
+        <w:rPr>
+          <w:rFonts w:ascii="Times New Roman" w:hAnsi="Times New Roman" w:cs="Times New Roman"/>
+          <w:sz w:val="24"/>
+          <w:szCs w:val="24"/>
+        </w:rPr>
+        <w:lastRenderedPageBreak/>
+        <w:t>geometría la forma y ubicación del tramo vial dentro del mapa. Esto permite identificar espacialmente la vía que se está estudiando. En el radar Doppler se seleccionó velocidad_kmh, porque es el dato principal que entrega el sensor y permite conocer cómo se comporta la velocidad de los vehículos en el sector.</w:t>
       </w:r>
     </w:p>
     <w:p>
@@ -1222,7 +1090,6 @@
           <w:sz w:val="24"/>
           <w:szCs w:val="24"/>
         </w:rPr>
-        <w:lastRenderedPageBreak/>
         <w:t>2.2 Variables clave.</w:t>
       </w:r>
       <w:r>
@@ -2362,6 +2229,7 @@
                 <w:sz w:val="24"/>
                 <w:szCs w:val="24"/>
               </w:rPr>
+              <w:lastRenderedPageBreak/>
               <w:t>API de Siniestralidad</w:t>
             </w:r>
           </w:p>
@@ -2677,7 +2545,6 @@
                 <w:sz w:val="24"/>
                 <w:szCs w:val="24"/>
               </w:rPr>
-              <w:lastRenderedPageBreak/>
               <w:t>Segmento Vial - Flujo</w:t>
             </w:r>
           </w:p>
@@ -3559,6 +3426,7 @@
                 <w:sz w:val="24"/>
                 <w:szCs w:val="24"/>
               </w:rPr>
+              <w:lastRenderedPageBreak/>
               <w:t>Radar Doppler + Siniestralidad + Segmento Vial</w:t>
             </w:r>
           </w:p>
@@ -3707,7 +3575,6 @@
           <w:sz w:val="24"/>
           <w:szCs w:val="24"/>
         </w:rPr>
-        <w:lastRenderedPageBreak/>
         <w:t>La fuente primaria del proyecto es un radar de velocidad: el OmniPreSense OPS243-A. Funciona parecido al radar que usa un policía de tránsito para medir qué tan rápido va un carro. Para el proyecto se plantea ubicarlo en un punto fijo de la curva de La Asomadera #2, sobre la Avenida Las Palmas, en las coordenadas 6.220055 de latitud y -75.562449 de longitud. Esta ubicación se encuentra entre las geometrías de las dos calzadas de Las Palmas obtenidas mediante la fuente Segmento Vial. El proceso de adquisición tiene tres pasos:</w:t>
       </w:r>
     </w:p>
@@ -4016,6 +3883,7 @@
                 <w:sz w:val="24"/>
                 <w:szCs w:val="24"/>
               </w:rPr>
+              <w:lastRenderedPageBreak/>
               <w:t>Timestamp</w:t>
             </w:r>
           </w:p>
@@ -4751,7 +4619,6 @@
                 <w:sz w:val="24"/>
                 <w:szCs w:val="24"/>
               </w:rPr>
-              <w:lastRenderedPageBreak/>
               <w:t>14/3/2026 07:32</w:t>
             </w:r>
           </w:p>
@@ -5240,6 +5107,7 @@
           <w:sz w:val="24"/>
           <w:szCs w:val="24"/>
         </w:rPr>
+        <w:lastRenderedPageBreak/>
         <w:t>¿Cuántos bits se requieren en el sensor?</w:t>
       </w:r>
     </w:p>
@@ -5493,7 +5361,6 @@
           <w:sz w:val="24"/>
           <w:szCs w:val="24"/>
         </w:rPr>
-        <w:lastRenderedPageBreak/>
         <w:t>Tabla 1. Calidad general de las fuentes de datos</w:t>
       </w:r>
     </w:p>
@@ -6478,6 +6345,7 @@
                 <w:sz w:val="24"/>
                 <w:szCs w:val="24"/>
               </w:rPr>
+              <w:lastRenderedPageBreak/>
               <w:t>Segmento Vial – Avenida Las Palmas</w:t>
             </w:r>
           </w:p>
@@ -7013,6 +6881,7 @@
           <w:sz w:val="24"/>
           <w:szCs w:val="24"/>
         </w:rPr>
+        <w:lastRenderedPageBreak/>
         <w:t xml:space="preserve">Alcaldía de Medellín - Secretaría de Movilidad. </w:t>
       </w:r>
       <w:r>
@@ -8180,6 +8049,7 @@
   <w:style w:type="character" w:default="1" w:styleId="Fuentedeprrafopredeter">
     <w:name w:val="Default Paragraph Font"/>
     <w:uiPriority w:val="1"/>
+    <w:semiHidden/>
     <w:unhideWhenUsed/>
   </w:style>
   <w:style w:type="table" w:default="1" w:styleId="Tablanormal">
@@ -8942,6 +8812,15 @@
 </file>
 
 <file path=customXml/item1.xml><?xml version="1.0" encoding="utf-8"?>
+<?mso-contentType ?>
+<FormTemplates xmlns="http://schemas.microsoft.com/sharepoint/v3/contenttype/forms">
+  <Display>DocumentLibraryForm</Display>
+  <Edit>DocumentLibraryForm</Edit>
+  <New>DocumentLibraryForm</New>
+</FormTemplates>
+</file>
+
+<file path=customXml/item2.xml><?xml version="1.0" encoding="utf-8"?>
 <ct:contentTypeSchema xmlns:ct="http://schemas.microsoft.com/office/2006/metadata/contentType" xmlns:ma="http://schemas.microsoft.com/office/2006/metadata/properties/metaAttributes" ct:_="" ma:_="" ma:contentTypeName="Document" ma:contentTypeID="0x01010071491DF3486FAD43B80CBD4E9CF607E1" ma:contentTypeVersion="4" ma:contentTypeDescription="Create a new document." ma:contentTypeScope="" ma:versionID="7f82c1472f0b596c07d0f359249e7e84">
   <xsd:schema xmlns:xsd="http://www.w3.org/2001/XMLSchema" xmlns:xs="http://www.w3.org/2001/XMLSchema" xmlns:p="http://schemas.microsoft.com/office/2006/metadata/properties" xmlns:ns3="d58a8c26-abb9-4ea0-9cff-f7835d20e172" targetNamespace="http://schemas.microsoft.com/office/2006/metadata/properties" ma:root="true" ma:fieldsID="aa53de99f8278bd269ff67295af1ffb5" ns3:_="">
     <xsd:import namespace="d58a8c26-abb9-4ea0-9cff-f7835d20e172"/>
@@ -9085,15 +8964,6 @@
 </ct:contentTypeSchema>
 </file>
 
-<file path=customXml/item2.xml><?xml version="1.0" encoding="utf-8"?>
-<?mso-contentType ?>
-<FormTemplates xmlns="http://schemas.microsoft.com/sharepoint/v3/contenttype/forms">
-  <Display>DocumentLibraryForm</Display>
-  <Edit>DocumentLibraryForm</Edit>
-  <New>DocumentLibraryForm</New>
-</FormTemplates>
-</file>
-
 <file path=customXml/item3.xml><?xml version="1.0" encoding="utf-8"?>
 <p:properties xmlns:p="http://schemas.microsoft.com/office/2006/metadata/properties" xmlns:xsi="http://www.w3.org/2001/XMLSchema-instance" xmlns:pc="http://schemas.microsoft.com/office/infopath/2007/PartnerControls">
   <documentManagement/>
@@ -9101,6 +8971,14 @@
 </file>
 
 <file path=customXml/itemProps1.xml><?xml version="1.0" encoding="utf-8"?>
+<ds:datastoreItem xmlns:ds="http://schemas.openxmlformats.org/officeDocument/2006/customXml" ds:itemID="{0E95F6D3-464D-4EF4-A884-64B7E16BCDAC}">
+  <ds:schemaRefs>
+    <ds:schemaRef ds:uri="http://schemas.microsoft.com/sharepoint/v3/contenttype/forms"/>
+  </ds:schemaRefs>
+</ds:datastoreItem>
+</file>
+
+<file path=customXml/itemProps2.xml><?xml version="1.0" encoding="utf-8"?>
 <ds:datastoreItem xmlns:ds="http://schemas.openxmlformats.org/officeDocument/2006/customXml" ds:itemID="{DA3D5E1E-7FEA-490B-BF15-FBFBDB49A455}">
   <ds:schemaRefs>
     <ds:schemaRef ds:uri="http://schemas.microsoft.com/office/2006/metadata/contentType"/>
@@ -9118,14 +8996,6 @@
 </ds:datastoreItem>
 </file>
 
-<file path=customXml/itemProps2.xml><?xml version="1.0" encoding="utf-8"?>
-<ds:datastoreItem xmlns:ds="http://schemas.openxmlformats.org/officeDocument/2006/customXml" ds:itemID="{0E95F6D3-464D-4EF4-A884-64B7E16BCDAC}">
-  <ds:schemaRefs>
-    <ds:schemaRef ds:uri="http://schemas.microsoft.com/sharepoint/v3/contenttype/forms"/>
-  </ds:schemaRefs>
-</ds:datastoreItem>
-</file>
-
 <file path=customXml/itemProps3.xml><?xml version="1.0" encoding="utf-8"?>
 <ds:datastoreItem xmlns:ds="http://schemas.openxmlformats.org/officeDocument/2006/customXml" ds:itemID="{982FA805-0B52-43B1-8910-1BD67303419A}">
   <ds:schemaRefs>

</xml_diff>

<commit_message>
se supone que ya todo el taller está corregido
</commit_message>
<xml_diff>
--- a/Proyecto Adquision.docx
+++ b/Proyecto Adquision.docx
@@ -4009,287 +4009,917 @@
           <w:sz w:val="24"/>
           <w:szCs w:val="24"/>
         </w:rPr>
-        <w:t>La fuente primaria del proyecto es un radar de velocidad: el OmniPreSense OPS243-A. Funciona parecido al radar que usa un policía de tránsito para medir qué tan rápido va un carro. Para el proyecto se plantea ubicarlo en un punto fijo de la curva de La Asomadera #2, sobre la Avenida Las Palmas, en las coordenadas 6.220055 de latitud y -75.562449 de longitud. Esta ubicación se encuentra entre las geometrías de las dos calzadas de Las Palmas obtenidas mediante la fuente Segmento Vial. El proceso de adquisición tiene tres pasos:</w:t>
-      </w:r>
-    </w:p>
-    <w:p>
-      <w:pPr>
-        <w:rPr>
-          <w:rFonts w:ascii="Times New Roman" w:hAnsi="Times New Roman" w:cs="Times New Roman"/>
-          <w:sz w:val="24"/>
-          <w:szCs w:val="24"/>
-        </w:rPr>
-      </w:pPr>
-      <w:r>
-        <w:rPr>
-          <w:rFonts w:ascii="Times New Roman" w:hAnsi="Times New Roman" w:cs="Times New Roman"/>
-          <w:b/>
-          <w:bCs/>
-          <w:sz w:val="24"/>
-          <w:szCs w:val="24"/>
-        </w:rPr>
-        <w:t>Magnitud física:</w:t>
-      </w:r>
-      <w:r>
-        <w:rPr>
-          <w:rFonts w:ascii="Times New Roman" w:hAnsi="Times New Roman" w:cs="Times New Roman"/>
-          <w:sz w:val="24"/>
-          <w:szCs w:val="24"/>
-        </w:rPr>
-        <w:t xml:space="preserve"> lo que queremos medir es la velocidad del vehículo cuando pasa por la curva</w:t>
-      </w:r>
-      <w:r>
-        <w:rPr>
-          <w:rFonts w:ascii="Times New Roman" w:hAnsi="Times New Roman" w:cs="Times New Roman"/>
-          <w:sz w:val="24"/>
-          <w:szCs w:val="24"/>
-        </w:rPr>
-        <w:t xml:space="preserve"> ( Asomadera #2).</w:t>
-      </w:r>
-    </w:p>
-    <w:p>
-      <w:pPr>
-        <w:rPr>
-          <w:rFonts w:ascii="Times New Roman" w:hAnsi="Times New Roman" w:cs="Times New Roman"/>
-          <w:sz w:val="24"/>
-          <w:szCs w:val="24"/>
-        </w:rPr>
-      </w:pPr>
-      <w:r>
-        <w:rPr>
-          <w:rFonts w:ascii="Times New Roman" w:hAnsi="Times New Roman" w:cs="Times New Roman"/>
-          <w:b/>
-          <w:bCs/>
-          <w:sz w:val="24"/>
-          <w:szCs w:val="24"/>
-        </w:rPr>
-        <w:t xml:space="preserve">Sensor: </w:t>
-      </w:r>
-      <w:r>
-        <w:rPr>
-          <w:rFonts w:ascii="Times New Roman" w:hAnsi="Times New Roman" w:cs="Times New Roman"/>
-          <w:sz w:val="24"/>
-          <w:szCs w:val="24"/>
-        </w:rPr>
-        <w:t>el radar emite una onda de radio</w:t>
-      </w:r>
-      <w:r>
-        <w:rPr>
-          <w:rFonts w:ascii="Times New Roman" w:hAnsi="Times New Roman" w:cs="Times New Roman"/>
-          <w:sz w:val="24"/>
-          <w:szCs w:val="24"/>
-        </w:rPr>
-        <w:t xml:space="preserve"> (aprox 24 GHz)</w:t>
-      </w:r>
-      <w:r>
-        <w:rPr>
-          <w:rFonts w:ascii="Times New Roman" w:hAnsi="Times New Roman" w:cs="Times New Roman"/>
-          <w:sz w:val="24"/>
-          <w:szCs w:val="24"/>
-        </w:rPr>
-        <w:t xml:space="preserve"> hacia los vehículos que pasan por la curva. Cuando esta onda choca con un carro, rebota y regresa al radar. Si el vehículo está en movimiento, la frecuencia de la onda que vuelve cambia un poco con respecto a la que fue enviada. A este cambio se le conoce como efecto Doppler. Si el vehículo se acerca, la frecuencia aumenta; si se aleja, disminuye. El radar identifica esa diferencia y, a partir de ella, calcula qué tan rápido se está moviendo el vehículo. Es parecido a lo que ocurre con la sirena de una ambulancia: el sonido se escucha diferente cuando se acerca y cuando se aleja.</w:t>
-      </w:r>
-    </w:p>
-    <w:p>
-      <w:pPr>
-        <w:rPr>
-          <w:rFonts w:ascii="Times New Roman" w:hAnsi="Times New Roman" w:cs="Times New Roman"/>
-          <w:sz w:val="24"/>
-          <w:szCs w:val="24"/>
-        </w:rPr>
-      </w:pPr>
-      <w:r>
-        <w:rPr>
-          <w:rFonts w:ascii="Times New Roman" w:hAnsi="Times New Roman" w:cs="Times New Roman"/>
-          <w:b/>
-          <w:bCs/>
-          <w:sz w:val="24"/>
-          <w:szCs w:val="24"/>
-        </w:rPr>
-        <w:t>Digitalización:</w:t>
-      </w:r>
-      <w:r>
-        <w:rPr>
-          <w:rFonts w:ascii="Times New Roman" w:hAnsi="Times New Roman" w:cs="Times New Roman"/>
-          <w:sz w:val="24"/>
-          <w:szCs w:val="24"/>
-        </w:rPr>
-        <w:t xml:space="preserve"> </w:t>
-      </w:r>
-      <w:r>
-        <w:rPr>
-          <w:rFonts w:ascii="Times New Roman" w:hAnsi="Times New Roman" w:cs="Times New Roman"/>
-          <w:sz w:val="24"/>
-          <w:szCs w:val="24"/>
-        </w:rPr>
-        <w:t xml:space="preserve">el radar puede reportar la velocidad y la dirección del movimiento. La documentación AN-010-AF permite configurar la salida de velocidad directamente en kilómetros por hora. </w:t>
-      </w:r>
-      <w:r>
-        <w:rPr>
-          <w:rFonts w:ascii="Times New Roman" w:hAnsi="Times New Roman" w:cs="Times New Roman"/>
-          <w:sz w:val="24"/>
-          <w:szCs w:val="24"/>
-        </w:rPr>
-        <w:t>A</w:t>
-      </w:r>
-      <w:r>
-        <w:rPr>
-          <w:rFonts w:ascii="Times New Roman" w:hAnsi="Times New Roman" w:cs="Times New Roman"/>
-          <w:sz w:val="24"/>
-          <w:szCs w:val="24"/>
-        </w:rPr>
-        <w:t xml:space="preserve"> cada medición se le agregará la fecha y hora del registro (timestamp)</w:t>
-      </w:r>
-      <w:r>
-        <w:rPr>
-          <w:rFonts w:ascii="Times New Roman" w:hAnsi="Times New Roman" w:cs="Times New Roman"/>
-          <w:sz w:val="24"/>
-          <w:szCs w:val="24"/>
-        </w:rPr>
-        <w:t xml:space="preserve">, </w:t>
-      </w:r>
-      <w:r>
-        <w:rPr>
-          <w:rFonts w:ascii="Times New Roman" w:hAnsi="Times New Roman" w:cs="Times New Roman"/>
-          <w:sz w:val="24"/>
-          <w:szCs w:val="24"/>
-        </w:rPr>
-        <w:t>el identificador del sensor (id_sensor</w:t>
-      </w:r>
-      <w:r>
-        <w:rPr>
-          <w:rFonts w:ascii="Times New Roman" w:hAnsi="Times New Roman" w:cs="Times New Roman"/>
-          <w:sz w:val="24"/>
-          <w:szCs w:val="24"/>
-        </w:rPr>
-        <w:t>)</w:t>
-      </w:r>
-      <w:r>
-        <w:rPr>
-          <w:rFonts w:ascii="Times New Roman" w:hAnsi="Times New Roman" w:cs="Times New Roman"/>
-          <w:sz w:val="24"/>
-          <w:szCs w:val="24"/>
-        </w:rPr>
-        <w:t xml:space="preserve"> </w:t>
-      </w:r>
-      <w:r>
-        <w:rPr>
-          <w:rFonts w:ascii="Times New Roman" w:hAnsi="Times New Roman" w:cs="Times New Roman"/>
-          <w:sz w:val="24"/>
-          <w:szCs w:val="24"/>
-        </w:rPr>
-        <w:t>y las coordenadas fijas de su ubicación (latitud_sensor y longitud_sensor).</w:t>
-      </w:r>
-    </w:p>
-    <w:p>
-      <w:pPr>
-        <w:rPr>
-          <w:rFonts w:ascii="Times New Roman" w:hAnsi="Times New Roman" w:cs="Times New Roman"/>
-          <w:sz w:val="24"/>
-          <w:szCs w:val="24"/>
-        </w:rPr>
-      </w:pPr>
-      <w:r>
-        <w:rPr>
-          <w:rFonts w:ascii="Times New Roman" w:hAnsi="Times New Roman" w:cs="Times New Roman"/>
-          <w:b/>
-          <w:bCs/>
-          <w:sz w:val="24"/>
-          <w:szCs w:val="24"/>
-        </w:rPr>
-        <w:t>Qué variable genera:</w:t>
-      </w:r>
-      <w:r>
-        <w:rPr>
-          <w:rFonts w:ascii="Times New Roman" w:hAnsi="Times New Roman" w:cs="Times New Roman"/>
-          <w:sz w:val="24"/>
-          <w:szCs w:val="24"/>
-        </w:rPr>
-        <w:t xml:space="preserve"> el dato principal es </w:t>
-      </w:r>
-      <w:r>
-        <w:rPr>
-          <w:rFonts w:ascii="Times New Roman" w:hAnsi="Times New Roman" w:cs="Times New Roman"/>
-          <w:b/>
-          <w:bCs/>
-          <w:sz w:val="24"/>
-          <w:szCs w:val="24"/>
-        </w:rPr>
-        <w:t>velocidad_kmh</w:t>
-      </w:r>
-      <w:r>
-        <w:rPr>
-          <w:rFonts w:ascii="Times New Roman" w:hAnsi="Times New Roman" w:cs="Times New Roman"/>
-          <w:sz w:val="24"/>
-          <w:szCs w:val="24"/>
-        </w:rPr>
-        <w:t xml:space="preserve"> (la velocidad en km/h), junto con hacia dónde iba el vehículo y a qué hora.</w:t>
-      </w:r>
-    </w:p>
-    <w:p>
-      <w:pPr>
-        <w:rPr>
-          <w:rFonts w:ascii="Times New Roman" w:hAnsi="Times New Roman" w:cs="Times New Roman"/>
-          <w:b/>
-          <w:bCs/>
-          <w:sz w:val="24"/>
-          <w:szCs w:val="24"/>
-        </w:rPr>
-      </w:pPr>
-      <w:r>
-        <w:rPr>
-          <w:rFonts w:ascii="Times New Roman" w:hAnsi="Times New Roman" w:cs="Times New Roman"/>
-          <w:b/>
-          <w:bCs/>
-          <w:sz w:val="24"/>
-          <w:szCs w:val="24"/>
-        </w:rPr>
-        <w:t>Cómo se guardan los datos</w:t>
-      </w:r>
-      <w:r>
-        <w:rPr>
-          <w:rFonts w:ascii="Times New Roman" w:hAnsi="Times New Roman" w:cs="Times New Roman"/>
-          <w:sz w:val="24"/>
-          <w:szCs w:val="24"/>
-        </w:rPr>
-        <w:t>: cada vez que un vehículo pasa, se guarda una fila en un archivo con la fecha y hora exacta, la velocidad, la dirección, el identificador del sensor y las coordenadas fijas de su ubicación.</w:t>
-      </w:r>
-    </w:p>
-    <w:p>
-      <w:pPr>
-        <w:rPr>
-          <w:rFonts w:ascii="Times New Roman" w:hAnsi="Times New Roman" w:cs="Times New Roman"/>
-          <w:b/>
-          <w:bCs/>
-          <w:sz w:val="24"/>
-          <w:szCs w:val="24"/>
-        </w:rPr>
-      </w:pPr>
-      <w:r>
-        <w:rPr>
-          <w:rFonts w:ascii="Times New Roman" w:hAnsi="Times New Roman" w:cs="Times New Roman"/>
-          <w:b/>
-          <w:bCs/>
-          <w:sz w:val="24"/>
-          <w:szCs w:val="24"/>
-        </w:rPr>
-        <w:lastRenderedPageBreak/>
-        <w:t>Ejemplo de cómo se vería esa información:</w:t>
+        <w:t>La fuente primaria del proyecto son cinco radares de velocidad simulados, basados en el OmniPreSense OPS243-A. Funcionan parecido al radar que usa un policía de tránsito para medir qué tan rápido va un carro. Para el proyecto se plantea ubicarlos conceptualmente en cinco puntos estratégicos de diferentes curvas de la Avenida Las Palmas, cuyas coordenadas se presentan en la siguiente tabla</w:t>
+      </w:r>
+      <w:r>
+        <w:rPr>
+          <w:rFonts w:ascii="Times New Roman" w:hAnsi="Times New Roman" w:cs="Times New Roman"/>
+          <w:sz w:val="24"/>
+          <w:szCs w:val="24"/>
+        </w:rPr>
+        <w:t>:</w:t>
       </w:r>
     </w:p>
     <w:tbl>
       <w:tblPr>
         <w:tblStyle w:val="Tablaconcuadrcula"/>
-        <w:tblW w:w="9351" w:type="dxa"/>
+        <w:tblW w:w="0" w:type="auto"/>
         <w:tblLook w:val="04A0" w:firstRow="1" w:lastRow="0" w:firstColumn="1" w:lastColumn="0" w:noHBand="0" w:noVBand="1"/>
       </w:tblPr>
       <w:tblGrid>
-        <w:gridCol w:w="1917"/>
-        <w:gridCol w:w="1221"/>
-        <w:gridCol w:w="1683"/>
-        <w:gridCol w:w="1837"/>
+        <w:gridCol w:w="1838"/>
         <w:gridCol w:w="1134"/>
-        <w:gridCol w:w="1559"/>
+        <w:gridCol w:w="1276"/>
+        <w:gridCol w:w="1417"/>
+      </w:tblGrid>
+      <w:tr>
+        <w:trPr>
+          <w:trHeight w:val="300"/>
+        </w:trPr>
+        <w:tc>
+          <w:tcPr>
+            <w:tcW w:w="1838" w:type="dxa"/>
+            <w:hideMark/>
+          </w:tcPr>
+          <w:p>
+            <w:pPr>
+              <w:rPr>
+                <w:rFonts w:ascii="Times New Roman" w:hAnsi="Times New Roman" w:cs="Times New Roman"/>
+                <w:b/>
+                <w:bCs/>
+                <w:sz w:val="24"/>
+                <w:szCs w:val="24"/>
+              </w:rPr>
+            </w:pPr>
+            <w:r>
+              <w:rPr>
+                <w:rFonts w:ascii="Times New Roman" w:hAnsi="Times New Roman" w:cs="Times New Roman"/>
+                <w:b/>
+                <w:bCs/>
+                <w:sz w:val="24"/>
+                <w:szCs w:val="24"/>
+              </w:rPr>
+              <w:t>Sensor</w:t>
+            </w:r>
+          </w:p>
+        </w:tc>
+        <w:tc>
+          <w:tcPr>
+            <w:tcW w:w="1134" w:type="dxa"/>
+            <w:hideMark/>
+          </w:tcPr>
+          <w:p>
+            <w:pPr>
+              <w:rPr>
+                <w:rFonts w:ascii="Times New Roman" w:hAnsi="Times New Roman" w:cs="Times New Roman"/>
+                <w:b/>
+                <w:bCs/>
+                <w:sz w:val="24"/>
+                <w:szCs w:val="24"/>
+              </w:rPr>
+            </w:pPr>
+            <w:r>
+              <w:rPr>
+                <w:rFonts w:ascii="Times New Roman" w:hAnsi="Times New Roman" w:cs="Times New Roman"/>
+                <w:b/>
+                <w:bCs/>
+                <w:sz w:val="24"/>
+                <w:szCs w:val="24"/>
+              </w:rPr>
+              <w:t>ID vial</w:t>
+            </w:r>
+          </w:p>
+        </w:tc>
+        <w:tc>
+          <w:tcPr>
+            <w:tcW w:w="1276" w:type="dxa"/>
+            <w:hideMark/>
+          </w:tcPr>
+          <w:p>
+            <w:pPr>
+              <w:rPr>
+                <w:rFonts w:ascii="Times New Roman" w:hAnsi="Times New Roman" w:cs="Times New Roman"/>
+                <w:b/>
+                <w:bCs/>
+                <w:sz w:val="24"/>
+                <w:szCs w:val="24"/>
+              </w:rPr>
+            </w:pPr>
+            <w:r>
+              <w:rPr>
+                <w:rFonts w:ascii="Times New Roman" w:hAnsi="Times New Roman" w:cs="Times New Roman"/>
+                <w:b/>
+                <w:bCs/>
+                <w:sz w:val="24"/>
+                <w:szCs w:val="24"/>
+              </w:rPr>
+              <w:t>Latitud</w:t>
+            </w:r>
+          </w:p>
+        </w:tc>
+        <w:tc>
+          <w:tcPr>
+            <w:tcW w:w="1417" w:type="dxa"/>
+            <w:hideMark/>
+          </w:tcPr>
+          <w:p>
+            <w:pPr>
+              <w:rPr>
+                <w:rFonts w:ascii="Times New Roman" w:hAnsi="Times New Roman" w:cs="Times New Roman"/>
+                <w:b/>
+                <w:bCs/>
+                <w:sz w:val="24"/>
+                <w:szCs w:val="24"/>
+              </w:rPr>
+            </w:pPr>
+            <w:r>
+              <w:rPr>
+                <w:rFonts w:ascii="Times New Roman" w:hAnsi="Times New Roman" w:cs="Times New Roman"/>
+                <w:b/>
+                <w:bCs/>
+                <w:sz w:val="24"/>
+                <w:szCs w:val="24"/>
+              </w:rPr>
+              <w:t>Longitud</w:t>
+            </w:r>
+          </w:p>
+        </w:tc>
+      </w:tr>
+      <w:tr>
+        <w:trPr>
+          <w:trHeight w:val="300"/>
+        </w:trPr>
+        <w:tc>
+          <w:tcPr>
+            <w:tcW w:w="1838" w:type="dxa"/>
+            <w:hideMark/>
+          </w:tcPr>
+          <w:p>
+            <w:pPr>
+              <w:rPr>
+                <w:rFonts w:ascii="Times New Roman" w:hAnsi="Times New Roman" w:cs="Times New Roman"/>
+                <w:sz w:val="24"/>
+                <w:szCs w:val="24"/>
+              </w:rPr>
+            </w:pPr>
+            <w:r>
+              <w:rPr>
+                <w:rFonts w:ascii="Times New Roman" w:hAnsi="Times New Roman" w:cs="Times New Roman"/>
+                <w:sz w:val="24"/>
+                <w:szCs w:val="24"/>
+              </w:rPr>
+              <w:t>RD-OPS243-01</w:t>
+            </w:r>
+          </w:p>
+        </w:tc>
+        <w:tc>
+          <w:tcPr>
+            <w:tcW w:w="1134" w:type="dxa"/>
+            <w:hideMark/>
+          </w:tcPr>
+          <w:p>
+            <w:pPr>
+              <w:rPr>
+                <w:rFonts w:ascii="Times New Roman" w:hAnsi="Times New Roman" w:cs="Times New Roman"/>
+                <w:sz w:val="24"/>
+                <w:szCs w:val="24"/>
+              </w:rPr>
+            </w:pPr>
+            <w:r>
+              <w:rPr>
+                <w:rFonts w:ascii="Times New Roman" w:hAnsi="Times New Roman" w:cs="Times New Roman"/>
+                <w:sz w:val="24"/>
+                <w:szCs w:val="24"/>
+              </w:rPr>
+              <w:t>112337</w:t>
+            </w:r>
+          </w:p>
+        </w:tc>
+        <w:tc>
+          <w:tcPr>
+            <w:tcW w:w="1276" w:type="dxa"/>
+            <w:hideMark/>
+          </w:tcPr>
+          <w:p>
+            <w:pPr>
+              <w:rPr>
+                <w:rFonts w:ascii="Times New Roman" w:hAnsi="Times New Roman" w:cs="Times New Roman"/>
+                <w:sz w:val="24"/>
+                <w:szCs w:val="24"/>
+              </w:rPr>
+            </w:pPr>
+            <w:r>
+              <w:rPr>
+                <w:rFonts w:ascii="Times New Roman" w:hAnsi="Times New Roman" w:cs="Times New Roman"/>
+                <w:sz w:val="24"/>
+                <w:szCs w:val="24"/>
+              </w:rPr>
+              <w:t>6.220055</w:t>
+            </w:r>
+          </w:p>
+        </w:tc>
+        <w:tc>
+          <w:tcPr>
+            <w:tcW w:w="1417" w:type="dxa"/>
+            <w:hideMark/>
+          </w:tcPr>
+          <w:p>
+            <w:pPr>
+              <w:rPr>
+                <w:rFonts w:ascii="Times New Roman" w:hAnsi="Times New Roman" w:cs="Times New Roman"/>
+                <w:sz w:val="24"/>
+                <w:szCs w:val="24"/>
+              </w:rPr>
+            </w:pPr>
+            <w:r>
+              <w:rPr>
+                <w:rFonts w:ascii="Times New Roman" w:hAnsi="Times New Roman" w:cs="Times New Roman"/>
+                <w:sz w:val="24"/>
+                <w:szCs w:val="24"/>
+              </w:rPr>
+              <w:t>-75.562449</w:t>
+            </w:r>
+          </w:p>
+        </w:tc>
+      </w:tr>
+      <w:tr>
+        <w:trPr>
+          <w:trHeight w:val="300"/>
+        </w:trPr>
+        <w:tc>
+          <w:tcPr>
+            <w:tcW w:w="1838" w:type="dxa"/>
+            <w:hideMark/>
+          </w:tcPr>
+          <w:p>
+            <w:pPr>
+              <w:rPr>
+                <w:rFonts w:ascii="Times New Roman" w:hAnsi="Times New Roman" w:cs="Times New Roman"/>
+                <w:sz w:val="24"/>
+                <w:szCs w:val="24"/>
+              </w:rPr>
+            </w:pPr>
+            <w:r>
+              <w:rPr>
+                <w:rFonts w:ascii="Times New Roman" w:hAnsi="Times New Roman" w:cs="Times New Roman"/>
+                <w:sz w:val="24"/>
+                <w:szCs w:val="24"/>
+              </w:rPr>
+              <w:t>RD-OPS243-02</w:t>
+            </w:r>
+          </w:p>
+        </w:tc>
+        <w:tc>
+          <w:tcPr>
+            <w:tcW w:w="1134" w:type="dxa"/>
+            <w:hideMark/>
+          </w:tcPr>
+          <w:p>
+            <w:pPr>
+              <w:rPr>
+                <w:rFonts w:ascii="Times New Roman" w:hAnsi="Times New Roman" w:cs="Times New Roman"/>
+                <w:sz w:val="24"/>
+                <w:szCs w:val="24"/>
+              </w:rPr>
+            </w:pPr>
+            <w:r>
+              <w:rPr>
+                <w:rFonts w:ascii="Times New Roman" w:hAnsi="Times New Roman" w:cs="Times New Roman"/>
+                <w:sz w:val="24"/>
+                <w:szCs w:val="24"/>
+              </w:rPr>
+              <w:t>112817</w:t>
+            </w:r>
+          </w:p>
+        </w:tc>
+        <w:tc>
+          <w:tcPr>
+            <w:tcW w:w="1276" w:type="dxa"/>
+            <w:hideMark/>
+          </w:tcPr>
+          <w:p>
+            <w:pPr>
+              <w:rPr>
+                <w:rFonts w:ascii="Times New Roman" w:hAnsi="Times New Roman" w:cs="Times New Roman"/>
+                <w:sz w:val="24"/>
+                <w:szCs w:val="24"/>
+              </w:rPr>
+            </w:pPr>
+            <w:r>
+              <w:rPr>
+                <w:rFonts w:ascii="Times New Roman" w:hAnsi="Times New Roman" w:cs="Times New Roman"/>
+                <w:sz w:val="24"/>
+                <w:szCs w:val="24"/>
+              </w:rPr>
+              <w:t>6.21395</w:t>
+            </w:r>
+          </w:p>
+        </w:tc>
+        <w:tc>
+          <w:tcPr>
+            <w:tcW w:w="1417" w:type="dxa"/>
+            <w:hideMark/>
+          </w:tcPr>
+          <w:p>
+            <w:pPr>
+              <w:rPr>
+                <w:rFonts w:ascii="Times New Roman" w:hAnsi="Times New Roman" w:cs="Times New Roman"/>
+                <w:sz w:val="24"/>
+                <w:szCs w:val="24"/>
+              </w:rPr>
+            </w:pPr>
+            <w:r>
+              <w:rPr>
+                <w:rFonts w:ascii="Times New Roman" w:hAnsi="Times New Roman" w:cs="Times New Roman"/>
+                <w:sz w:val="24"/>
+                <w:szCs w:val="24"/>
+              </w:rPr>
+              <w:t>-75.551318</w:t>
+            </w:r>
+          </w:p>
+        </w:tc>
+      </w:tr>
+      <w:tr>
+        <w:trPr>
+          <w:trHeight w:val="300"/>
+        </w:trPr>
+        <w:tc>
+          <w:tcPr>
+            <w:tcW w:w="1838" w:type="dxa"/>
+            <w:hideMark/>
+          </w:tcPr>
+          <w:p>
+            <w:pPr>
+              <w:rPr>
+                <w:rFonts w:ascii="Times New Roman" w:hAnsi="Times New Roman" w:cs="Times New Roman"/>
+                <w:sz w:val="24"/>
+                <w:szCs w:val="24"/>
+              </w:rPr>
+            </w:pPr>
+            <w:r>
+              <w:rPr>
+                <w:rFonts w:ascii="Times New Roman" w:hAnsi="Times New Roman" w:cs="Times New Roman"/>
+                <w:sz w:val="24"/>
+                <w:szCs w:val="24"/>
+              </w:rPr>
+              <w:t>RD-OPS243-03</w:t>
+            </w:r>
+          </w:p>
+        </w:tc>
+        <w:tc>
+          <w:tcPr>
+            <w:tcW w:w="1134" w:type="dxa"/>
+            <w:hideMark/>
+          </w:tcPr>
+          <w:p>
+            <w:pPr>
+              <w:rPr>
+                <w:rFonts w:ascii="Times New Roman" w:hAnsi="Times New Roman" w:cs="Times New Roman"/>
+                <w:sz w:val="24"/>
+                <w:szCs w:val="24"/>
+              </w:rPr>
+            </w:pPr>
+            <w:r>
+              <w:rPr>
+                <w:rFonts w:ascii="Times New Roman" w:hAnsi="Times New Roman" w:cs="Times New Roman"/>
+                <w:sz w:val="24"/>
+                <w:szCs w:val="24"/>
+              </w:rPr>
+              <w:t>117201</w:t>
+            </w:r>
+          </w:p>
+        </w:tc>
+        <w:tc>
+          <w:tcPr>
+            <w:tcW w:w="1276" w:type="dxa"/>
+            <w:hideMark/>
+          </w:tcPr>
+          <w:p>
+            <w:pPr>
+              <w:rPr>
+                <w:rFonts w:ascii="Times New Roman" w:hAnsi="Times New Roman" w:cs="Times New Roman"/>
+                <w:sz w:val="24"/>
+                <w:szCs w:val="24"/>
+              </w:rPr>
+            </w:pPr>
+            <w:r>
+              <w:rPr>
+                <w:rFonts w:ascii="Times New Roman" w:hAnsi="Times New Roman" w:cs="Times New Roman"/>
+                <w:sz w:val="24"/>
+                <w:szCs w:val="24"/>
+              </w:rPr>
+              <w:t>6.210226</w:t>
+            </w:r>
+          </w:p>
+        </w:tc>
+        <w:tc>
+          <w:tcPr>
+            <w:tcW w:w="1417" w:type="dxa"/>
+            <w:hideMark/>
+          </w:tcPr>
+          <w:p>
+            <w:pPr>
+              <w:rPr>
+                <w:rFonts w:ascii="Times New Roman" w:hAnsi="Times New Roman" w:cs="Times New Roman"/>
+                <w:sz w:val="24"/>
+                <w:szCs w:val="24"/>
+              </w:rPr>
+            </w:pPr>
+            <w:r>
+              <w:rPr>
+                <w:rFonts w:ascii="Times New Roman" w:hAnsi="Times New Roman" w:cs="Times New Roman"/>
+                <w:sz w:val="24"/>
+                <w:szCs w:val="24"/>
+              </w:rPr>
+              <w:t>-75.54587</w:t>
+            </w:r>
+          </w:p>
+        </w:tc>
+      </w:tr>
+      <w:tr>
+        <w:trPr>
+          <w:trHeight w:val="300"/>
+        </w:trPr>
+        <w:tc>
+          <w:tcPr>
+            <w:tcW w:w="1838" w:type="dxa"/>
+            <w:hideMark/>
+          </w:tcPr>
+          <w:p>
+            <w:pPr>
+              <w:rPr>
+                <w:rFonts w:ascii="Times New Roman" w:hAnsi="Times New Roman" w:cs="Times New Roman"/>
+                <w:sz w:val="24"/>
+                <w:szCs w:val="24"/>
+              </w:rPr>
+            </w:pPr>
+            <w:r>
+              <w:rPr>
+                <w:rFonts w:ascii="Times New Roman" w:hAnsi="Times New Roman" w:cs="Times New Roman"/>
+                <w:sz w:val="24"/>
+                <w:szCs w:val="24"/>
+              </w:rPr>
+              <w:t>RD-OPS243-04</w:t>
+            </w:r>
+          </w:p>
+        </w:tc>
+        <w:tc>
+          <w:tcPr>
+            <w:tcW w:w="1134" w:type="dxa"/>
+            <w:hideMark/>
+          </w:tcPr>
+          <w:p>
+            <w:pPr>
+              <w:rPr>
+                <w:rFonts w:ascii="Times New Roman" w:hAnsi="Times New Roman" w:cs="Times New Roman"/>
+                <w:sz w:val="24"/>
+                <w:szCs w:val="24"/>
+              </w:rPr>
+            </w:pPr>
+            <w:r>
+              <w:rPr>
+                <w:rFonts w:ascii="Times New Roman" w:hAnsi="Times New Roman" w:cs="Times New Roman"/>
+                <w:sz w:val="24"/>
+                <w:szCs w:val="24"/>
+              </w:rPr>
+              <w:t>114432</w:t>
+            </w:r>
+          </w:p>
+        </w:tc>
+        <w:tc>
+          <w:tcPr>
+            <w:tcW w:w="1276" w:type="dxa"/>
+            <w:hideMark/>
+          </w:tcPr>
+          <w:p>
+            <w:pPr>
+              <w:rPr>
+                <w:rFonts w:ascii="Times New Roman" w:hAnsi="Times New Roman" w:cs="Times New Roman"/>
+                <w:sz w:val="24"/>
+                <w:szCs w:val="24"/>
+              </w:rPr>
+            </w:pPr>
+            <w:r>
+              <w:rPr>
+                <w:rFonts w:ascii="Times New Roman" w:hAnsi="Times New Roman" w:cs="Times New Roman"/>
+                <w:sz w:val="24"/>
+                <w:szCs w:val="24"/>
+              </w:rPr>
+              <w:t>6.200411</w:t>
+            </w:r>
+          </w:p>
+        </w:tc>
+        <w:tc>
+          <w:tcPr>
+            <w:tcW w:w="1417" w:type="dxa"/>
+            <w:hideMark/>
+          </w:tcPr>
+          <w:p>
+            <w:pPr>
+              <w:rPr>
+                <w:rFonts w:ascii="Times New Roman" w:hAnsi="Times New Roman" w:cs="Times New Roman"/>
+                <w:sz w:val="24"/>
+                <w:szCs w:val="24"/>
+              </w:rPr>
+            </w:pPr>
+            <w:r>
+              <w:rPr>
+                <w:rFonts w:ascii="Times New Roman" w:hAnsi="Times New Roman" w:cs="Times New Roman"/>
+                <w:sz w:val="24"/>
+                <w:szCs w:val="24"/>
+              </w:rPr>
+              <w:t>-75.546391</w:t>
+            </w:r>
+          </w:p>
+        </w:tc>
+      </w:tr>
+      <w:tr>
+        <w:trPr>
+          <w:trHeight w:val="300"/>
+        </w:trPr>
+        <w:tc>
+          <w:tcPr>
+            <w:tcW w:w="1838" w:type="dxa"/>
+            <w:hideMark/>
+          </w:tcPr>
+          <w:p>
+            <w:pPr>
+              <w:rPr>
+                <w:rFonts w:ascii="Times New Roman" w:hAnsi="Times New Roman" w:cs="Times New Roman"/>
+                <w:sz w:val="24"/>
+                <w:szCs w:val="24"/>
+              </w:rPr>
+            </w:pPr>
+            <w:r>
+              <w:rPr>
+                <w:rFonts w:ascii="Times New Roman" w:hAnsi="Times New Roman" w:cs="Times New Roman"/>
+                <w:sz w:val="24"/>
+                <w:szCs w:val="24"/>
+              </w:rPr>
+              <w:t>RD-OPS243-05</w:t>
+            </w:r>
+          </w:p>
+        </w:tc>
+        <w:tc>
+          <w:tcPr>
+            <w:tcW w:w="1134" w:type="dxa"/>
+            <w:hideMark/>
+          </w:tcPr>
+          <w:p>
+            <w:pPr>
+              <w:rPr>
+                <w:rFonts w:ascii="Times New Roman" w:hAnsi="Times New Roman" w:cs="Times New Roman"/>
+                <w:sz w:val="24"/>
+                <w:szCs w:val="24"/>
+              </w:rPr>
+            </w:pPr>
+            <w:r>
+              <w:rPr>
+                <w:rFonts w:ascii="Times New Roman" w:hAnsi="Times New Roman" w:cs="Times New Roman"/>
+                <w:sz w:val="24"/>
+                <w:szCs w:val="24"/>
+              </w:rPr>
+              <w:t>111239</w:t>
+            </w:r>
+          </w:p>
+        </w:tc>
+        <w:tc>
+          <w:tcPr>
+            <w:tcW w:w="1276" w:type="dxa"/>
+            <w:hideMark/>
+          </w:tcPr>
+          <w:p>
+            <w:pPr>
+              <w:rPr>
+                <w:rFonts w:ascii="Times New Roman" w:hAnsi="Times New Roman" w:cs="Times New Roman"/>
+                <w:sz w:val="24"/>
+                <w:szCs w:val="24"/>
+              </w:rPr>
+            </w:pPr>
+            <w:r>
+              <w:rPr>
+                <w:rFonts w:ascii="Times New Roman" w:hAnsi="Times New Roman" w:cs="Times New Roman"/>
+                <w:sz w:val="24"/>
+                <w:szCs w:val="24"/>
+              </w:rPr>
+              <w:t>6.179181</w:t>
+            </w:r>
+          </w:p>
+        </w:tc>
+        <w:tc>
+          <w:tcPr>
+            <w:tcW w:w="1417" w:type="dxa"/>
+            <w:hideMark/>
+          </w:tcPr>
+          <w:p>
+            <w:pPr>
+              <w:rPr>
+                <w:rFonts w:ascii="Times New Roman" w:hAnsi="Times New Roman" w:cs="Times New Roman"/>
+                <w:sz w:val="24"/>
+                <w:szCs w:val="24"/>
+              </w:rPr>
+            </w:pPr>
+            <w:r>
+              <w:rPr>
+                <w:rFonts w:ascii="Times New Roman" w:hAnsi="Times New Roman" w:cs="Times New Roman"/>
+                <w:sz w:val="24"/>
+                <w:szCs w:val="24"/>
+              </w:rPr>
+              <w:t>-75.543121</w:t>
+            </w:r>
+          </w:p>
+        </w:tc>
+      </w:tr>
+    </w:tbl>
+    <w:p>
+      <w:pPr>
+        <w:rPr>
+          <w:rFonts w:ascii="Times New Roman" w:hAnsi="Times New Roman" w:cs="Times New Roman"/>
+          <w:sz w:val="24"/>
+          <w:szCs w:val="24"/>
+        </w:rPr>
+      </w:pPr>
+      <w:r>
+        <w:rPr>
+          <w:rFonts w:ascii="Times New Roman" w:hAnsi="Times New Roman" w:cs="Times New Roman"/>
+          <w:sz w:val="24"/>
+          <w:szCs w:val="24"/>
+        </w:rPr>
+        <w:t>Estas ubicaciones fueron seleccionadas a partir de las geometrías obtenidas mediante la fuente Segmento Vial. El proceso de adquisición tiene tres pasos:</w:t>
+      </w:r>
+    </w:p>
+    <w:p>
+      <w:pPr>
+        <w:rPr>
+          <w:rFonts w:ascii="Times New Roman" w:hAnsi="Times New Roman" w:cs="Times New Roman"/>
+          <w:sz w:val="24"/>
+          <w:szCs w:val="24"/>
+        </w:rPr>
+      </w:pPr>
+      <w:r>
+        <w:rPr>
+          <w:rFonts w:ascii="Times New Roman" w:hAnsi="Times New Roman" w:cs="Times New Roman"/>
+          <w:b/>
+          <w:bCs/>
+          <w:sz w:val="24"/>
+          <w:szCs w:val="24"/>
+        </w:rPr>
+        <w:t>Magnitud física:</w:t>
+      </w:r>
+      <w:r>
+        <w:rPr>
+          <w:rFonts w:ascii="Times New Roman" w:hAnsi="Times New Roman" w:cs="Times New Roman"/>
+          <w:b/>
+          <w:bCs/>
+          <w:sz w:val="24"/>
+          <w:szCs w:val="24"/>
+        </w:rPr>
+        <w:t xml:space="preserve"> </w:t>
+      </w:r>
+      <w:r>
+        <w:rPr>
+          <w:rFonts w:ascii="Times New Roman" w:hAnsi="Times New Roman" w:cs="Times New Roman"/>
+          <w:sz w:val="24"/>
+          <w:szCs w:val="24"/>
+        </w:rPr>
+        <w:t>lo que queremos medir es la velocidad de los vehículos cuando pasan por los diferentes tramos curvos seleccionados de la Avenida Las Palmas.</w:t>
+      </w:r>
+    </w:p>
+    <w:p>
+      <w:pPr>
+        <w:rPr>
+          <w:rFonts w:ascii="Times New Roman" w:hAnsi="Times New Roman" w:cs="Times New Roman"/>
+          <w:sz w:val="24"/>
+          <w:szCs w:val="24"/>
+        </w:rPr>
+      </w:pPr>
+      <w:r>
+        <w:rPr>
+          <w:rFonts w:ascii="Times New Roman" w:hAnsi="Times New Roman" w:cs="Times New Roman"/>
+          <w:b/>
+          <w:bCs/>
+          <w:sz w:val="24"/>
+          <w:szCs w:val="24"/>
+        </w:rPr>
+        <w:t xml:space="preserve">Sensor: </w:t>
+      </w:r>
+      <w:r>
+        <w:rPr>
+          <w:rFonts w:ascii="Times New Roman" w:hAnsi="Times New Roman" w:cs="Times New Roman"/>
+          <w:sz w:val="24"/>
+          <w:szCs w:val="24"/>
+        </w:rPr>
+        <w:t>el radar emite una onda de radio</w:t>
+      </w:r>
+      <w:r>
+        <w:rPr>
+          <w:rFonts w:ascii="Times New Roman" w:hAnsi="Times New Roman" w:cs="Times New Roman"/>
+          <w:sz w:val="24"/>
+          <w:szCs w:val="24"/>
+        </w:rPr>
+        <w:t xml:space="preserve"> (aprox 24 GHz)</w:t>
+      </w:r>
+      <w:r>
+        <w:rPr>
+          <w:rFonts w:ascii="Times New Roman" w:hAnsi="Times New Roman" w:cs="Times New Roman"/>
+          <w:sz w:val="24"/>
+          <w:szCs w:val="24"/>
+        </w:rPr>
+        <w:t xml:space="preserve"> hacia los vehículos que pasan por la curva. Cuando esta onda choca con un carro, rebota y regresa al radar. Si el vehículo está en movimiento, la frecuencia de la onda que vuelve cambia un poco con respecto a la que fue enviada. A este cambio se le conoce como efecto Doppler. Si el vehículo se acerca, la frecuencia aumenta; si se aleja, disminuye. El radar identifica esa diferencia y, a partir de ella, calcula qué tan rápido se está moviendo el vehículo. Es parecido a lo que ocurre con la sirena de una ambulancia: el sonido se escucha diferente cuando se acerca y cuando se aleja.</w:t>
+      </w:r>
+    </w:p>
+    <w:p>
+      <w:pPr>
+        <w:rPr>
+          <w:rFonts w:ascii="Times New Roman" w:hAnsi="Times New Roman" w:cs="Times New Roman"/>
+          <w:sz w:val="24"/>
+          <w:szCs w:val="24"/>
+        </w:rPr>
+      </w:pPr>
+      <w:r>
+        <w:rPr>
+          <w:rFonts w:ascii="Times New Roman" w:hAnsi="Times New Roman" w:cs="Times New Roman"/>
+          <w:b/>
+          <w:bCs/>
+          <w:sz w:val="24"/>
+          <w:szCs w:val="24"/>
+        </w:rPr>
+        <w:t>Digitalización:</w:t>
+      </w:r>
+      <w:r>
+        <w:rPr>
+          <w:rFonts w:ascii="Times New Roman" w:hAnsi="Times New Roman" w:cs="Times New Roman"/>
+          <w:sz w:val="24"/>
+          <w:szCs w:val="24"/>
+        </w:rPr>
+        <w:t xml:space="preserve"> </w:t>
+      </w:r>
+      <w:r>
+        <w:rPr>
+          <w:rFonts w:ascii="Times New Roman" w:hAnsi="Times New Roman" w:cs="Times New Roman"/>
+          <w:sz w:val="24"/>
+          <w:szCs w:val="24"/>
+        </w:rPr>
+        <w:t xml:space="preserve">el radar puede reportar la velocidad y la dirección del movimiento. La documentación AN-010-AF permite configurar la salida de velocidad directamente en kilómetros por hora. </w:t>
+      </w:r>
+      <w:r>
+        <w:rPr>
+          <w:rFonts w:ascii="Times New Roman" w:hAnsi="Times New Roman" w:cs="Times New Roman"/>
+          <w:sz w:val="24"/>
+          <w:szCs w:val="24"/>
+        </w:rPr>
+        <w:t>A</w:t>
+      </w:r>
+      <w:r>
+        <w:rPr>
+          <w:rFonts w:ascii="Times New Roman" w:hAnsi="Times New Roman" w:cs="Times New Roman"/>
+          <w:sz w:val="24"/>
+          <w:szCs w:val="24"/>
+        </w:rPr>
+        <w:t xml:space="preserve"> cada medición se le agregará la fecha y hora del registro (timestamp)</w:t>
+      </w:r>
+      <w:r>
+        <w:rPr>
+          <w:rFonts w:ascii="Times New Roman" w:hAnsi="Times New Roman" w:cs="Times New Roman"/>
+          <w:sz w:val="24"/>
+          <w:szCs w:val="24"/>
+        </w:rPr>
+        <w:t xml:space="preserve">, </w:t>
+      </w:r>
+      <w:r>
+        <w:rPr>
+          <w:rFonts w:ascii="Times New Roman" w:hAnsi="Times New Roman" w:cs="Times New Roman"/>
+          <w:sz w:val="24"/>
+          <w:szCs w:val="24"/>
+        </w:rPr>
+        <w:t>el identificador del sensor (id_sensor</w:t>
+      </w:r>
+      <w:r>
+        <w:rPr>
+          <w:rFonts w:ascii="Times New Roman" w:hAnsi="Times New Roman" w:cs="Times New Roman"/>
+          <w:sz w:val="24"/>
+          <w:szCs w:val="24"/>
+        </w:rPr>
+        <w:t xml:space="preserve">) </w:t>
+      </w:r>
+      <w:r>
+        <w:rPr>
+          <w:rFonts w:ascii="Times New Roman" w:hAnsi="Times New Roman" w:cs="Times New Roman"/>
+          <w:sz w:val="24"/>
+          <w:szCs w:val="24"/>
+        </w:rPr>
+        <w:t>y las coordenadas fijas de su ubicación (latitud_sensor y longitud_sensor).</w:t>
+      </w:r>
+    </w:p>
+    <w:p>
+      <w:pPr>
+        <w:rPr>
+          <w:rFonts w:ascii="Times New Roman" w:hAnsi="Times New Roman" w:cs="Times New Roman"/>
+          <w:sz w:val="24"/>
+          <w:szCs w:val="24"/>
+        </w:rPr>
+      </w:pPr>
+      <w:r>
+        <w:rPr>
+          <w:rFonts w:ascii="Times New Roman" w:hAnsi="Times New Roman" w:cs="Times New Roman"/>
+          <w:b/>
+          <w:bCs/>
+          <w:sz w:val="24"/>
+          <w:szCs w:val="24"/>
+        </w:rPr>
+        <w:lastRenderedPageBreak/>
+        <w:t>Qué variable genera:</w:t>
+      </w:r>
+      <w:r>
+        <w:rPr>
+          <w:rFonts w:ascii="Times New Roman" w:hAnsi="Times New Roman" w:cs="Times New Roman"/>
+          <w:sz w:val="24"/>
+          <w:szCs w:val="24"/>
+        </w:rPr>
+        <w:t xml:space="preserve"> el dato principal es </w:t>
+      </w:r>
+      <w:r>
+        <w:rPr>
+          <w:rFonts w:ascii="Times New Roman" w:hAnsi="Times New Roman" w:cs="Times New Roman"/>
+          <w:b/>
+          <w:bCs/>
+          <w:sz w:val="24"/>
+          <w:szCs w:val="24"/>
+        </w:rPr>
+        <w:t>velocidad_kmh</w:t>
+      </w:r>
+      <w:r>
+        <w:rPr>
+          <w:rFonts w:ascii="Times New Roman" w:hAnsi="Times New Roman" w:cs="Times New Roman"/>
+          <w:sz w:val="24"/>
+          <w:szCs w:val="24"/>
+        </w:rPr>
+        <w:t xml:space="preserve"> (la velocidad en km/h), junto con hacia dónde iba el vehículo y a qué hora.</w:t>
+      </w:r>
+    </w:p>
+    <w:p>
+      <w:pPr>
+        <w:rPr>
+          <w:rFonts w:ascii="Times New Roman" w:hAnsi="Times New Roman" w:cs="Times New Roman"/>
+          <w:b/>
+          <w:bCs/>
+          <w:sz w:val="24"/>
+          <w:szCs w:val="24"/>
+        </w:rPr>
+      </w:pPr>
+      <w:r>
+        <w:rPr>
+          <w:rFonts w:ascii="Times New Roman" w:hAnsi="Times New Roman" w:cs="Times New Roman"/>
+          <w:b/>
+          <w:bCs/>
+          <w:sz w:val="24"/>
+          <w:szCs w:val="24"/>
+        </w:rPr>
+        <w:t>Cómo se guardan los datos</w:t>
+      </w:r>
+      <w:r>
+        <w:rPr>
+          <w:rFonts w:ascii="Times New Roman" w:hAnsi="Times New Roman" w:cs="Times New Roman"/>
+          <w:sz w:val="24"/>
+          <w:szCs w:val="24"/>
+        </w:rPr>
+        <w:t>: cada vez que un vehículo pasa, se guarda una fila en un archivo con la fecha y hora exacta, la velocidad, la dirección, el identificador del sensor y las coordenadas fijas de su ubicación.</w:t>
+      </w:r>
+    </w:p>
+    <w:p>
+      <w:pPr>
+        <w:rPr>
+          <w:rFonts w:ascii="Times New Roman" w:hAnsi="Times New Roman" w:cs="Times New Roman"/>
+          <w:b/>
+          <w:bCs/>
+          <w:sz w:val="24"/>
+          <w:szCs w:val="24"/>
+        </w:rPr>
+      </w:pPr>
+      <w:r>
+        <w:rPr>
+          <w:rFonts w:ascii="Times New Roman" w:hAnsi="Times New Roman" w:cs="Times New Roman"/>
+          <w:b/>
+          <w:bCs/>
+          <w:sz w:val="24"/>
+          <w:szCs w:val="24"/>
+        </w:rPr>
+        <w:t>Ejemplo de cómo se vería esa información:</w:t>
+      </w:r>
+    </w:p>
+    <w:tbl>
+      <w:tblPr>
+        <w:tblStyle w:val="Tablaconcuadrcula"/>
+        <w:tblW w:w="9493" w:type="dxa"/>
+        <w:tblLook w:val="04A0" w:firstRow="1" w:lastRow="0" w:firstColumn="1" w:lastColumn="0" w:noHBand="0" w:noVBand="1"/>
+      </w:tblPr>
+      <w:tblGrid>
+        <w:gridCol w:w="1710"/>
+        <w:gridCol w:w="1504"/>
+        <w:gridCol w:w="1775"/>
+        <w:gridCol w:w="1669"/>
+        <w:gridCol w:w="1245"/>
+        <w:gridCol w:w="1590"/>
       </w:tblGrid>
       <w:tr>
         <w:trPr>
@@ -4297,7 +4927,7 @@
         </w:trPr>
         <w:tc>
           <w:tcPr>
-            <w:tcW w:w="1917" w:type="dxa"/>
+            <w:tcW w:w="1710" w:type="dxa"/>
             <w:hideMark/>
           </w:tcPr>
           <w:p>
@@ -4324,7 +4954,7 @@
         </w:tc>
         <w:tc>
           <w:tcPr>
-            <w:tcW w:w="1221" w:type="dxa"/>
+            <w:tcW w:w="1504" w:type="dxa"/>
             <w:hideMark/>
           </w:tcPr>
           <w:p>
@@ -4351,7 +4981,7 @@
         </w:tc>
         <w:tc>
           <w:tcPr>
-            <w:tcW w:w="1683" w:type="dxa"/>
+            <w:tcW w:w="1775" w:type="dxa"/>
             <w:hideMark/>
           </w:tcPr>
           <w:p>
@@ -4378,7 +5008,7 @@
         </w:tc>
         <w:tc>
           <w:tcPr>
-            <w:tcW w:w="1837" w:type="dxa"/>
+            <w:tcW w:w="1669" w:type="dxa"/>
             <w:hideMark/>
           </w:tcPr>
           <w:p>
@@ -4405,7 +5035,7 @@
         </w:tc>
         <w:tc>
           <w:tcPr>
-            <w:tcW w:w="1134" w:type="dxa"/>
+            <w:tcW w:w="1245" w:type="dxa"/>
             <w:hideMark/>
           </w:tcPr>
           <w:p>
@@ -4432,7 +5062,7 @@
         </w:tc>
         <w:tc>
           <w:tcPr>
-            <w:tcW w:w="1559" w:type="dxa"/>
+            <w:tcW w:w="1590" w:type="dxa"/>
             <w:hideMark/>
           </w:tcPr>
           <w:p>
@@ -4460,72 +5090,60 @@
       </w:tr>
       <w:tr>
         <w:trPr>
-          <w:trHeight w:val="600"/>
+          <w:trHeight w:val="300"/>
         </w:trPr>
         <w:tc>
           <w:tcPr>
-            <w:tcW w:w="1917" w:type="dxa"/>
-            <w:hideMark/>
-          </w:tcPr>
-          <w:p>
-            <w:pPr>
-              <w:rPr>
-                <w:rFonts w:ascii="Times New Roman" w:hAnsi="Times New Roman" w:cs="Times New Roman"/>
-                <w:sz w:val="24"/>
-                <w:szCs w:val="24"/>
-              </w:rPr>
-            </w:pPr>
-            <w:r>
-              <w:rPr>
-                <w:rFonts w:ascii="Times New Roman" w:hAnsi="Times New Roman" w:cs="Times New Roman"/>
-                <w:sz w:val="24"/>
-                <w:szCs w:val="24"/>
-              </w:rPr>
-              <w:t>14/3/2026 22:15</w:t>
-            </w:r>
-          </w:p>
-        </w:tc>
-        <w:tc>
-          <w:tcPr>
-            <w:tcW w:w="1221" w:type="dxa"/>
-            <w:hideMark/>
-          </w:tcPr>
-          <w:p>
-            <w:pPr>
-              <w:rPr>
-                <w:rFonts w:ascii="Times New Roman" w:hAnsi="Times New Roman" w:cs="Times New Roman"/>
-                <w:sz w:val="24"/>
-                <w:szCs w:val="24"/>
-              </w:rPr>
-            </w:pPr>
-            <w:r>
-              <w:rPr>
-                <w:rFonts w:ascii="Times New Roman" w:hAnsi="Times New Roman" w:cs="Times New Roman"/>
-                <w:sz w:val="24"/>
-                <w:szCs w:val="24"/>
-              </w:rPr>
-              <w:t>47.2</w:t>
-            </w:r>
-          </w:p>
-        </w:tc>
-        <w:tc>
-          <w:tcPr>
-            <w:tcW w:w="1683" w:type="dxa"/>
-            <w:hideMark/>
-          </w:tcPr>
-          <w:p>
-            <w:pPr>
-              <w:rPr>
-                <w:rFonts w:ascii="Times New Roman" w:hAnsi="Times New Roman" w:cs="Times New Roman"/>
-                <w:sz w:val="24"/>
-                <w:szCs w:val="24"/>
-              </w:rPr>
-            </w:pPr>
-            <w:r>
-              <w:rPr>
-                <w:rFonts w:ascii="Times New Roman" w:hAnsi="Times New Roman" w:cs="Times New Roman"/>
-                <w:sz w:val="24"/>
-                <w:szCs w:val="24"/>
+            <w:tcW w:w="1710" w:type="dxa"/>
+            <w:hideMark/>
+          </w:tcPr>
+          <w:p>
+            <w:pPr>
+              <w:rPr>
+                <w:rFonts w:ascii="Times New Roman" w:hAnsi="Times New Roman" w:cs="Times New Roman"/>
+              </w:rPr>
+            </w:pPr>
+            <w:r>
+              <w:rPr>
+                <w:rFonts w:ascii="Times New Roman" w:hAnsi="Times New Roman" w:cs="Times New Roman"/>
+              </w:rPr>
+              <w:t>14/3/2026 00:06</w:t>
+            </w:r>
+          </w:p>
+        </w:tc>
+        <w:tc>
+          <w:tcPr>
+            <w:tcW w:w="1504" w:type="dxa"/>
+            <w:hideMark/>
+          </w:tcPr>
+          <w:p>
+            <w:pPr>
+              <w:rPr>
+                <w:rFonts w:ascii="Times New Roman" w:hAnsi="Times New Roman" w:cs="Times New Roman"/>
+              </w:rPr>
+            </w:pPr>
+            <w:r>
+              <w:rPr>
+                <w:rFonts w:ascii="Times New Roman" w:hAnsi="Times New Roman" w:cs="Times New Roman"/>
+              </w:rPr>
+              <w:t>26.136</w:t>
+            </w:r>
+          </w:p>
+        </w:tc>
+        <w:tc>
+          <w:tcPr>
+            <w:tcW w:w="1775" w:type="dxa"/>
+            <w:hideMark/>
+          </w:tcPr>
+          <w:p>
+            <w:pPr>
+              <w:rPr>
+                <w:rFonts w:ascii="Times New Roman" w:hAnsi="Times New Roman" w:cs="Times New Roman"/>
+              </w:rPr>
+            </w:pPr>
+            <w:r>
+              <w:rPr>
+                <w:rFonts w:ascii="Times New Roman" w:hAnsi="Times New Roman" w:cs="Times New Roman"/>
               </w:rPr>
               <w:t>INBOUND</w:t>
             </w:r>
@@ -4533,22 +5151,18 @@
         </w:tc>
         <w:tc>
           <w:tcPr>
-            <w:tcW w:w="1837" w:type="dxa"/>
-            <w:hideMark/>
-          </w:tcPr>
-          <w:p>
-            <w:pPr>
-              <w:rPr>
-                <w:rFonts w:ascii="Times New Roman" w:hAnsi="Times New Roman" w:cs="Times New Roman"/>
-                <w:sz w:val="24"/>
-                <w:szCs w:val="24"/>
-              </w:rPr>
-            </w:pPr>
-            <w:r>
-              <w:rPr>
-                <w:rFonts w:ascii="Times New Roman" w:hAnsi="Times New Roman" w:cs="Times New Roman"/>
-                <w:sz w:val="24"/>
-                <w:szCs w:val="24"/>
+            <w:tcW w:w="1669" w:type="dxa"/>
+            <w:hideMark/>
+          </w:tcPr>
+          <w:p>
+            <w:pPr>
+              <w:rPr>
+                <w:rFonts w:ascii="Times New Roman" w:hAnsi="Times New Roman" w:cs="Times New Roman"/>
+              </w:rPr>
+            </w:pPr>
+            <w:r>
+              <w:rPr>
+                <w:rFonts w:ascii="Times New Roman" w:hAnsi="Times New Roman" w:cs="Times New Roman"/>
               </w:rPr>
               <w:t>RD-OPS243-01</w:t>
             </w:r>
@@ -4556,22 +5170,18 @@
         </w:tc>
         <w:tc>
           <w:tcPr>
-            <w:tcW w:w="1134" w:type="dxa"/>
-            <w:hideMark/>
-          </w:tcPr>
-          <w:p>
-            <w:pPr>
-              <w:rPr>
-                <w:rFonts w:ascii="Times New Roman" w:hAnsi="Times New Roman" w:cs="Times New Roman"/>
-                <w:sz w:val="24"/>
-                <w:szCs w:val="24"/>
-              </w:rPr>
-            </w:pPr>
-            <w:r>
-              <w:rPr>
-                <w:rFonts w:ascii="Times New Roman" w:hAnsi="Times New Roman" w:cs="Times New Roman"/>
-                <w:sz w:val="24"/>
-                <w:szCs w:val="24"/>
+            <w:tcW w:w="1245" w:type="dxa"/>
+            <w:hideMark/>
+          </w:tcPr>
+          <w:p>
+            <w:pPr>
+              <w:rPr>
+                <w:rFonts w:ascii="Times New Roman" w:hAnsi="Times New Roman" w:cs="Times New Roman"/>
+              </w:rPr>
+            </w:pPr>
+            <w:r>
+              <w:rPr>
+                <w:rFonts w:ascii="Times New Roman" w:hAnsi="Times New Roman" w:cs="Times New Roman"/>
               </w:rPr>
               <w:t>6.220055</w:t>
             </w:r>
@@ -4579,22 +5189,18 @@
         </w:tc>
         <w:tc>
           <w:tcPr>
-            <w:tcW w:w="1559" w:type="dxa"/>
-            <w:hideMark/>
-          </w:tcPr>
-          <w:p>
-            <w:pPr>
-              <w:rPr>
-                <w:rFonts w:ascii="Times New Roman" w:hAnsi="Times New Roman" w:cs="Times New Roman"/>
-                <w:sz w:val="24"/>
-                <w:szCs w:val="24"/>
-              </w:rPr>
-            </w:pPr>
-            <w:r>
-              <w:rPr>
-                <w:rFonts w:ascii="Times New Roman" w:hAnsi="Times New Roman" w:cs="Times New Roman"/>
-                <w:sz w:val="24"/>
-                <w:szCs w:val="24"/>
+            <w:tcW w:w="1590" w:type="dxa"/>
+            <w:hideMark/>
+          </w:tcPr>
+          <w:p>
+            <w:pPr>
+              <w:rPr>
+                <w:rFonts w:ascii="Times New Roman" w:hAnsi="Times New Roman" w:cs="Times New Roman"/>
+              </w:rPr>
+            </w:pPr>
+            <w:r>
+              <w:rPr>
+                <w:rFonts w:ascii="Times New Roman" w:hAnsi="Times New Roman" w:cs="Times New Roman"/>
               </w:rPr>
               <w:t>-75.562449</w:t>
             </w:r>
@@ -4603,72 +5209,60 @@
       </w:tr>
       <w:tr>
         <w:trPr>
-          <w:trHeight w:val="600"/>
+          <w:trHeight w:val="300"/>
         </w:trPr>
         <w:tc>
           <w:tcPr>
-            <w:tcW w:w="1917" w:type="dxa"/>
-            <w:hideMark/>
-          </w:tcPr>
-          <w:p>
-            <w:pPr>
-              <w:rPr>
-                <w:rFonts w:ascii="Times New Roman" w:hAnsi="Times New Roman" w:cs="Times New Roman"/>
-                <w:sz w:val="24"/>
-                <w:szCs w:val="24"/>
-              </w:rPr>
-            </w:pPr>
-            <w:r>
-              <w:rPr>
-                <w:rFonts w:ascii="Times New Roman" w:hAnsi="Times New Roman" w:cs="Times New Roman"/>
-                <w:sz w:val="24"/>
-                <w:szCs w:val="24"/>
-              </w:rPr>
-              <w:t>14/3/2026 22:15</w:t>
-            </w:r>
-          </w:p>
-        </w:tc>
-        <w:tc>
-          <w:tcPr>
-            <w:tcW w:w="1221" w:type="dxa"/>
-            <w:hideMark/>
-          </w:tcPr>
-          <w:p>
-            <w:pPr>
-              <w:rPr>
-                <w:rFonts w:ascii="Times New Roman" w:hAnsi="Times New Roman" w:cs="Times New Roman"/>
-                <w:sz w:val="24"/>
-                <w:szCs w:val="24"/>
-              </w:rPr>
-            </w:pPr>
-            <w:r>
-              <w:rPr>
-                <w:rFonts w:ascii="Times New Roman" w:hAnsi="Times New Roman" w:cs="Times New Roman"/>
-                <w:sz w:val="24"/>
-                <w:szCs w:val="24"/>
-              </w:rPr>
-              <w:t>58.9</w:t>
-            </w:r>
-          </w:p>
-        </w:tc>
-        <w:tc>
-          <w:tcPr>
-            <w:tcW w:w="1683" w:type="dxa"/>
-            <w:hideMark/>
-          </w:tcPr>
-          <w:p>
-            <w:pPr>
-              <w:rPr>
-                <w:rFonts w:ascii="Times New Roman" w:hAnsi="Times New Roman" w:cs="Times New Roman"/>
-                <w:sz w:val="24"/>
-                <w:szCs w:val="24"/>
-              </w:rPr>
-            </w:pPr>
-            <w:r>
-              <w:rPr>
-                <w:rFonts w:ascii="Times New Roman" w:hAnsi="Times New Roman" w:cs="Times New Roman"/>
-                <w:sz w:val="24"/>
-                <w:szCs w:val="24"/>
+            <w:tcW w:w="1710" w:type="dxa"/>
+            <w:hideMark/>
+          </w:tcPr>
+          <w:p>
+            <w:pPr>
+              <w:rPr>
+                <w:rFonts w:ascii="Times New Roman" w:hAnsi="Times New Roman" w:cs="Times New Roman"/>
+              </w:rPr>
+            </w:pPr>
+            <w:r>
+              <w:rPr>
+                <w:rFonts w:ascii="Times New Roman" w:hAnsi="Times New Roman" w:cs="Times New Roman"/>
+              </w:rPr>
+              <w:t>14/3/2026 00:00</w:t>
+            </w:r>
+          </w:p>
+        </w:tc>
+        <w:tc>
+          <w:tcPr>
+            <w:tcW w:w="1504" w:type="dxa"/>
+            <w:hideMark/>
+          </w:tcPr>
+          <w:p>
+            <w:pPr>
+              <w:rPr>
+                <w:rFonts w:ascii="Times New Roman" w:hAnsi="Times New Roman" w:cs="Times New Roman"/>
+              </w:rPr>
+            </w:pPr>
+            <w:r>
+              <w:rPr>
+                <w:rFonts w:ascii="Times New Roman" w:hAnsi="Times New Roman" w:cs="Times New Roman"/>
+              </w:rPr>
+              <w:t>105.4152</w:t>
+            </w:r>
+          </w:p>
+        </w:tc>
+        <w:tc>
+          <w:tcPr>
+            <w:tcW w:w="1775" w:type="dxa"/>
+            <w:hideMark/>
+          </w:tcPr>
+          <w:p>
+            <w:pPr>
+              <w:rPr>
+                <w:rFonts w:ascii="Times New Roman" w:hAnsi="Times New Roman" w:cs="Times New Roman"/>
+              </w:rPr>
+            </w:pPr>
+            <w:r>
+              <w:rPr>
+                <w:rFonts w:ascii="Times New Roman" w:hAnsi="Times New Roman" w:cs="Times New Roman"/>
               </w:rPr>
               <w:t>INBOUND</w:t>
             </w:r>
@@ -4676,142 +5270,124 @@
         </w:tc>
         <w:tc>
           <w:tcPr>
-            <w:tcW w:w="1837" w:type="dxa"/>
-            <w:hideMark/>
-          </w:tcPr>
-          <w:p>
-            <w:pPr>
-              <w:rPr>
-                <w:rFonts w:ascii="Times New Roman" w:hAnsi="Times New Roman" w:cs="Times New Roman"/>
-                <w:sz w:val="24"/>
-                <w:szCs w:val="24"/>
-              </w:rPr>
-            </w:pPr>
-            <w:r>
-              <w:rPr>
-                <w:rFonts w:ascii="Times New Roman" w:hAnsi="Times New Roman" w:cs="Times New Roman"/>
-                <w:sz w:val="24"/>
-                <w:szCs w:val="24"/>
-              </w:rPr>
-              <w:t>RD-OPS243-01</w:t>
-            </w:r>
-          </w:p>
-        </w:tc>
-        <w:tc>
-          <w:tcPr>
-            <w:tcW w:w="1134" w:type="dxa"/>
-            <w:hideMark/>
-          </w:tcPr>
-          <w:p>
-            <w:pPr>
-              <w:rPr>
-                <w:rFonts w:ascii="Times New Roman" w:hAnsi="Times New Roman" w:cs="Times New Roman"/>
-                <w:sz w:val="24"/>
-                <w:szCs w:val="24"/>
-              </w:rPr>
-            </w:pPr>
-            <w:r>
-              <w:rPr>
-                <w:rFonts w:ascii="Times New Roman" w:hAnsi="Times New Roman" w:cs="Times New Roman"/>
-                <w:sz w:val="24"/>
-                <w:szCs w:val="24"/>
-              </w:rPr>
-              <w:t>6.220055</w:t>
-            </w:r>
-          </w:p>
-        </w:tc>
-        <w:tc>
-          <w:tcPr>
-            <w:tcW w:w="1559" w:type="dxa"/>
-            <w:hideMark/>
-          </w:tcPr>
-          <w:p>
-            <w:pPr>
-              <w:rPr>
-                <w:rFonts w:ascii="Times New Roman" w:hAnsi="Times New Roman" w:cs="Times New Roman"/>
-                <w:sz w:val="24"/>
-                <w:szCs w:val="24"/>
-              </w:rPr>
-            </w:pPr>
-            <w:r>
-              <w:rPr>
-                <w:rFonts w:ascii="Times New Roman" w:hAnsi="Times New Roman" w:cs="Times New Roman"/>
-                <w:sz w:val="24"/>
-                <w:szCs w:val="24"/>
-              </w:rPr>
-              <w:t>-75.562449</w:t>
+            <w:tcW w:w="1669" w:type="dxa"/>
+            <w:hideMark/>
+          </w:tcPr>
+          <w:p>
+            <w:pPr>
+              <w:rPr>
+                <w:rFonts w:ascii="Times New Roman" w:hAnsi="Times New Roman" w:cs="Times New Roman"/>
+              </w:rPr>
+            </w:pPr>
+            <w:r>
+              <w:rPr>
+                <w:rFonts w:ascii="Times New Roman" w:hAnsi="Times New Roman" w:cs="Times New Roman"/>
+              </w:rPr>
+              <w:t>RD-OPS243-02</w:t>
+            </w:r>
+          </w:p>
+        </w:tc>
+        <w:tc>
+          <w:tcPr>
+            <w:tcW w:w="1245" w:type="dxa"/>
+            <w:hideMark/>
+          </w:tcPr>
+          <w:p>
+            <w:pPr>
+              <w:rPr>
+                <w:rFonts w:ascii="Times New Roman" w:hAnsi="Times New Roman" w:cs="Times New Roman"/>
+              </w:rPr>
+            </w:pPr>
+            <w:r>
+              <w:rPr>
+                <w:rFonts w:ascii="Times New Roman" w:hAnsi="Times New Roman" w:cs="Times New Roman"/>
+              </w:rPr>
+              <w:t>6.21395</w:t>
+            </w:r>
+            <w:r>
+              <w:rPr>
+                <w:rFonts w:ascii="Times New Roman" w:hAnsi="Times New Roman" w:cs="Times New Roman"/>
+              </w:rPr>
+              <w:t>0</w:t>
+            </w:r>
+          </w:p>
+        </w:tc>
+        <w:tc>
+          <w:tcPr>
+            <w:tcW w:w="1590" w:type="dxa"/>
+            <w:hideMark/>
+          </w:tcPr>
+          <w:p>
+            <w:pPr>
+              <w:rPr>
+                <w:rFonts w:ascii="Times New Roman" w:hAnsi="Times New Roman" w:cs="Times New Roman"/>
+              </w:rPr>
+            </w:pPr>
+            <w:r>
+              <w:rPr>
+                <w:rFonts w:ascii="Times New Roman" w:hAnsi="Times New Roman" w:cs="Times New Roman"/>
+              </w:rPr>
+              <w:t>-75.551318</w:t>
             </w:r>
           </w:p>
         </w:tc>
       </w:tr>
       <w:tr>
         <w:trPr>
-          <w:trHeight w:val="600"/>
+          <w:trHeight w:val="300"/>
         </w:trPr>
         <w:tc>
           <w:tcPr>
-            <w:tcW w:w="1917" w:type="dxa"/>
-            <w:hideMark/>
-          </w:tcPr>
-          <w:p>
-            <w:pPr>
-              <w:rPr>
-                <w:rFonts w:ascii="Times New Roman" w:hAnsi="Times New Roman" w:cs="Times New Roman"/>
-                <w:sz w:val="24"/>
-                <w:szCs w:val="24"/>
-              </w:rPr>
-            </w:pPr>
-            <w:r>
-              <w:rPr>
-                <w:rFonts w:ascii="Times New Roman" w:hAnsi="Times New Roman" w:cs="Times New Roman"/>
-                <w:sz w:val="24"/>
-                <w:szCs w:val="24"/>
-              </w:rPr>
-              <w:t>14/3/2026 22:16</w:t>
-            </w:r>
-          </w:p>
-        </w:tc>
-        <w:tc>
-          <w:tcPr>
-            <w:tcW w:w="1221" w:type="dxa"/>
-            <w:hideMark/>
-          </w:tcPr>
-          <w:p>
-            <w:pPr>
-              <w:rPr>
-                <w:rFonts w:ascii="Times New Roman" w:hAnsi="Times New Roman" w:cs="Times New Roman"/>
-                <w:sz w:val="24"/>
-                <w:szCs w:val="24"/>
-              </w:rPr>
-            </w:pPr>
-            <w:r>
-              <w:rPr>
-                <w:rFonts w:ascii="Times New Roman" w:hAnsi="Times New Roman" w:cs="Times New Roman"/>
-                <w:sz w:val="24"/>
-                <w:szCs w:val="24"/>
-              </w:rPr>
-              <w:t>39.5</w:t>
-            </w:r>
-          </w:p>
-        </w:tc>
-        <w:tc>
-          <w:tcPr>
-            <w:tcW w:w="1683" w:type="dxa"/>
-            <w:hideMark/>
-          </w:tcPr>
-          <w:p>
-            <w:pPr>
-              <w:rPr>
-                <w:rFonts w:ascii="Times New Roman" w:hAnsi="Times New Roman" w:cs="Times New Roman"/>
-                <w:sz w:val="24"/>
-                <w:szCs w:val="24"/>
-              </w:rPr>
-            </w:pPr>
-            <w:r>
-              <w:rPr>
-                <w:rFonts w:ascii="Times New Roman" w:hAnsi="Times New Roman" w:cs="Times New Roman"/>
-                <w:sz w:val="24"/>
-                <w:szCs w:val="24"/>
+            <w:tcW w:w="1710" w:type="dxa"/>
+            <w:hideMark/>
+          </w:tcPr>
+          <w:p>
+            <w:pPr>
+              <w:rPr>
+                <w:rFonts w:ascii="Times New Roman" w:hAnsi="Times New Roman" w:cs="Times New Roman"/>
+              </w:rPr>
+            </w:pPr>
+            <w:r>
+              <w:rPr>
+                <w:rFonts w:ascii="Times New Roman" w:hAnsi="Times New Roman" w:cs="Times New Roman"/>
+              </w:rPr>
+              <w:t>14/3/2026 00:00</w:t>
+            </w:r>
+          </w:p>
+        </w:tc>
+        <w:tc>
+          <w:tcPr>
+            <w:tcW w:w="1504" w:type="dxa"/>
+            <w:hideMark/>
+          </w:tcPr>
+          <w:p>
+            <w:pPr>
+              <w:rPr>
+                <w:rFonts w:ascii="Times New Roman" w:hAnsi="Times New Roman" w:cs="Times New Roman"/>
+              </w:rPr>
+            </w:pPr>
+            <w:r>
+              <w:rPr>
+                <w:rFonts w:ascii="Times New Roman" w:hAnsi="Times New Roman" w:cs="Times New Roman"/>
+              </w:rPr>
+              <w:t>101.9304</w:t>
+            </w:r>
+          </w:p>
+        </w:tc>
+        <w:tc>
+          <w:tcPr>
+            <w:tcW w:w="1775" w:type="dxa"/>
+            <w:hideMark/>
+          </w:tcPr>
+          <w:p>
+            <w:pPr>
+              <w:rPr>
+                <w:rFonts w:ascii="Times New Roman" w:hAnsi="Times New Roman" w:cs="Times New Roman"/>
+              </w:rPr>
+            </w:pPr>
+            <w:r>
+              <w:rPr>
+                <w:rFonts w:ascii="Times New Roman" w:hAnsi="Times New Roman" w:cs="Times New Roman"/>
               </w:rPr>
               <w:t>OUTBOUND</w:t>
             </w:r>
@@ -4819,285 +5395,243 @@
         </w:tc>
         <w:tc>
           <w:tcPr>
-            <w:tcW w:w="1837" w:type="dxa"/>
-            <w:hideMark/>
-          </w:tcPr>
-          <w:p>
-            <w:pPr>
-              <w:rPr>
-                <w:rFonts w:ascii="Times New Roman" w:hAnsi="Times New Roman" w:cs="Times New Roman"/>
-                <w:sz w:val="24"/>
-                <w:szCs w:val="24"/>
-              </w:rPr>
-            </w:pPr>
-            <w:r>
-              <w:rPr>
-                <w:rFonts w:ascii="Times New Roman" w:hAnsi="Times New Roman" w:cs="Times New Roman"/>
-                <w:sz w:val="24"/>
-                <w:szCs w:val="24"/>
-              </w:rPr>
-              <w:t>RD-OPS243-01</w:t>
-            </w:r>
-          </w:p>
-        </w:tc>
-        <w:tc>
-          <w:tcPr>
-            <w:tcW w:w="1134" w:type="dxa"/>
-            <w:hideMark/>
-          </w:tcPr>
-          <w:p>
-            <w:pPr>
-              <w:rPr>
-                <w:rFonts w:ascii="Times New Roman" w:hAnsi="Times New Roman" w:cs="Times New Roman"/>
-                <w:sz w:val="24"/>
-                <w:szCs w:val="24"/>
-              </w:rPr>
-            </w:pPr>
-            <w:r>
-              <w:rPr>
-                <w:rFonts w:ascii="Times New Roman" w:hAnsi="Times New Roman" w:cs="Times New Roman"/>
-                <w:sz w:val="24"/>
-                <w:szCs w:val="24"/>
-              </w:rPr>
-              <w:t>6.220055</w:t>
-            </w:r>
-          </w:p>
-        </w:tc>
-        <w:tc>
-          <w:tcPr>
-            <w:tcW w:w="1559" w:type="dxa"/>
-            <w:hideMark/>
-          </w:tcPr>
-          <w:p>
-            <w:pPr>
-              <w:rPr>
-                <w:rFonts w:ascii="Times New Roman" w:hAnsi="Times New Roman" w:cs="Times New Roman"/>
-                <w:sz w:val="24"/>
-                <w:szCs w:val="24"/>
-              </w:rPr>
-            </w:pPr>
-            <w:r>
-              <w:rPr>
-                <w:rFonts w:ascii="Times New Roman" w:hAnsi="Times New Roman" w:cs="Times New Roman"/>
-                <w:sz w:val="24"/>
-                <w:szCs w:val="24"/>
-              </w:rPr>
-              <w:t>-75.562449</w:t>
+            <w:tcW w:w="1669" w:type="dxa"/>
+            <w:hideMark/>
+          </w:tcPr>
+          <w:p>
+            <w:pPr>
+              <w:rPr>
+                <w:rFonts w:ascii="Times New Roman" w:hAnsi="Times New Roman" w:cs="Times New Roman"/>
+              </w:rPr>
+            </w:pPr>
+            <w:r>
+              <w:rPr>
+                <w:rFonts w:ascii="Times New Roman" w:hAnsi="Times New Roman" w:cs="Times New Roman"/>
+              </w:rPr>
+              <w:t>RD-OPS243-03</w:t>
+            </w:r>
+          </w:p>
+        </w:tc>
+        <w:tc>
+          <w:tcPr>
+            <w:tcW w:w="1245" w:type="dxa"/>
+            <w:hideMark/>
+          </w:tcPr>
+          <w:p>
+            <w:pPr>
+              <w:rPr>
+                <w:rFonts w:ascii="Times New Roman" w:hAnsi="Times New Roman" w:cs="Times New Roman"/>
+              </w:rPr>
+            </w:pPr>
+            <w:r>
+              <w:rPr>
+                <w:rFonts w:ascii="Times New Roman" w:hAnsi="Times New Roman" w:cs="Times New Roman"/>
+              </w:rPr>
+              <w:t>6.210226</w:t>
+            </w:r>
+          </w:p>
+        </w:tc>
+        <w:tc>
+          <w:tcPr>
+            <w:tcW w:w="1590" w:type="dxa"/>
+            <w:hideMark/>
+          </w:tcPr>
+          <w:p>
+            <w:pPr>
+              <w:rPr>
+                <w:rFonts w:ascii="Times New Roman" w:hAnsi="Times New Roman" w:cs="Times New Roman"/>
+              </w:rPr>
+            </w:pPr>
+            <w:r>
+              <w:rPr>
+                <w:rFonts w:ascii="Times New Roman" w:hAnsi="Times New Roman" w:cs="Times New Roman"/>
+              </w:rPr>
+              <w:t>-75.54587</w:t>
+            </w:r>
+            <w:r>
+              <w:rPr>
+                <w:rFonts w:ascii="Times New Roman" w:hAnsi="Times New Roman" w:cs="Times New Roman"/>
+              </w:rPr>
+              <w:t>0</w:t>
             </w:r>
           </w:p>
         </w:tc>
       </w:tr>
       <w:tr>
         <w:trPr>
-          <w:trHeight w:val="600"/>
+          <w:trHeight w:val="300"/>
         </w:trPr>
         <w:tc>
           <w:tcPr>
-            <w:tcW w:w="1917" w:type="dxa"/>
-            <w:hideMark/>
-          </w:tcPr>
-          <w:p>
-            <w:pPr>
-              <w:rPr>
-                <w:rFonts w:ascii="Times New Roman" w:hAnsi="Times New Roman" w:cs="Times New Roman"/>
-                <w:sz w:val="24"/>
-                <w:szCs w:val="24"/>
-              </w:rPr>
-            </w:pPr>
-            <w:r>
-              <w:rPr>
-                <w:rFonts w:ascii="Times New Roman" w:hAnsi="Times New Roman" w:cs="Times New Roman"/>
-                <w:sz w:val="24"/>
-                <w:szCs w:val="24"/>
-              </w:rPr>
-              <w:t>14/3/2026 23:58</w:t>
-            </w:r>
-          </w:p>
-        </w:tc>
-        <w:tc>
-          <w:tcPr>
-            <w:tcW w:w="1221" w:type="dxa"/>
-            <w:hideMark/>
-          </w:tcPr>
-          <w:p>
-            <w:pPr>
-              <w:rPr>
-                <w:rFonts w:ascii="Times New Roman" w:hAnsi="Times New Roman" w:cs="Times New Roman"/>
-                <w:sz w:val="24"/>
-                <w:szCs w:val="24"/>
-              </w:rPr>
-            </w:pPr>
-            <w:r>
-              <w:rPr>
-                <w:rFonts w:ascii="Times New Roman" w:hAnsi="Times New Roman" w:cs="Times New Roman"/>
-                <w:sz w:val="24"/>
-                <w:szCs w:val="24"/>
-              </w:rPr>
-              <w:t>78.4</w:t>
-            </w:r>
-          </w:p>
-        </w:tc>
-        <w:tc>
-          <w:tcPr>
-            <w:tcW w:w="1683" w:type="dxa"/>
-            <w:hideMark/>
-          </w:tcPr>
-          <w:p>
-            <w:pPr>
-              <w:rPr>
-                <w:rFonts w:ascii="Times New Roman" w:hAnsi="Times New Roman" w:cs="Times New Roman"/>
-                <w:sz w:val="24"/>
-                <w:szCs w:val="24"/>
-              </w:rPr>
-            </w:pPr>
-            <w:r>
-              <w:rPr>
-                <w:rFonts w:ascii="Times New Roman" w:hAnsi="Times New Roman" w:cs="Times New Roman"/>
-                <w:sz w:val="24"/>
-                <w:szCs w:val="24"/>
-              </w:rPr>
-              <w:t>INBOUND</w:t>
-            </w:r>
-          </w:p>
-        </w:tc>
-        <w:tc>
-          <w:tcPr>
-            <w:tcW w:w="1837" w:type="dxa"/>
-            <w:hideMark/>
-          </w:tcPr>
-          <w:p>
-            <w:pPr>
-              <w:rPr>
-                <w:rFonts w:ascii="Times New Roman" w:hAnsi="Times New Roman" w:cs="Times New Roman"/>
-                <w:sz w:val="24"/>
-                <w:szCs w:val="24"/>
-              </w:rPr>
-            </w:pPr>
-            <w:r>
-              <w:rPr>
-                <w:rFonts w:ascii="Times New Roman" w:hAnsi="Times New Roman" w:cs="Times New Roman"/>
-                <w:sz w:val="24"/>
-                <w:szCs w:val="24"/>
-              </w:rPr>
-              <w:t>RD-OPS243-01</w:t>
-            </w:r>
-          </w:p>
-        </w:tc>
-        <w:tc>
-          <w:tcPr>
-            <w:tcW w:w="1134" w:type="dxa"/>
-            <w:hideMark/>
-          </w:tcPr>
-          <w:p>
-            <w:pPr>
-              <w:rPr>
-                <w:rFonts w:ascii="Times New Roman" w:hAnsi="Times New Roman" w:cs="Times New Roman"/>
-                <w:sz w:val="24"/>
-                <w:szCs w:val="24"/>
-              </w:rPr>
-            </w:pPr>
-            <w:r>
-              <w:rPr>
-                <w:rFonts w:ascii="Times New Roman" w:hAnsi="Times New Roman" w:cs="Times New Roman"/>
-                <w:sz w:val="24"/>
-                <w:szCs w:val="24"/>
-              </w:rPr>
-              <w:t>6.220055</w:t>
-            </w:r>
-          </w:p>
-        </w:tc>
-        <w:tc>
-          <w:tcPr>
-            <w:tcW w:w="1559" w:type="dxa"/>
-            <w:hideMark/>
-          </w:tcPr>
-          <w:p>
-            <w:pPr>
-              <w:rPr>
-                <w:rFonts w:ascii="Times New Roman" w:hAnsi="Times New Roman" w:cs="Times New Roman"/>
-                <w:sz w:val="24"/>
-                <w:szCs w:val="24"/>
-              </w:rPr>
-            </w:pPr>
-            <w:r>
-              <w:rPr>
-                <w:rFonts w:ascii="Times New Roman" w:hAnsi="Times New Roman" w:cs="Times New Roman"/>
-                <w:sz w:val="24"/>
-                <w:szCs w:val="24"/>
-              </w:rPr>
-              <w:t>-75.562449</w:t>
+            <w:tcW w:w="1710" w:type="dxa"/>
+            <w:hideMark/>
+          </w:tcPr>
+          <w:p>
+            <w:pPr>
+              <w:rPr>
+                <w:rFonts w:ascii="Times New Roman" w:hAnsi="Times New Roman" w:cs="Times New Roman"/>
+              </w:rPr>
+            </w:pPr>
+            <w:r>
+              <w:rPr>
+                <w:rFonts w:ascii="Times New Roman" w:hAnsi="Times New Roman" w:cs="Times New Roman"/>
+              </w:rPr>
+              <w:t>14/3/2026 00:01</w:t>
+            </w:r>
+          </w:p>
+        </w:tc>
+        <w:tc>
+          <w:tcPr>
+            <w:tcW w:w="1504" w:type="dxa"/>
+            <w:hideMark/>
+          </w:tcPr>
+          <w:p>
+            <w:pPr>
+              <w:rPr>
+                <w:rFonts w:ascii="Times New Roman" w:hAnsi="Times New Roman" w:cs="Times New Roman"/>
+              </w:rPr>
+            </w:pPr>
+            <w:r>
+              <w:rPr>
+                <w:rFonts w:ascii="Times New Roman" w:hAnsi="Times New Roman" w:cs="Times New Roman"/>
+              </w:rPr>
+              <w:t>75.7944</w:t>
+            </w:r>
+          </w:p>
+        </w:tc>
+        <w:tc>
+          <w:tcPr>
+            <w:tcW w:w="1775" w:type="dxa"/>
+            <w:hideMark/>
+          </w:tcPr>
+          <w:p>
+            <w:pPr>
+              <w:rPr>
+                <w:rFonts w:ascii="Times New Roman" w:hAnsi="Times New Roman" w:cs="Times New Roman"/>
+              </w:rPr>
+            </w:pPr>
+            <w:r>
+              <w:rPr>
+                <w:rFonts w:ascii="Times New Roman" w:hAnsi="Times New Roman" w:cs="Times New Roman"/>
+              </w:rPr>
+              <w:t>OUTBOUND</w:t>
+            </w:r>
+          </w:p>
+        </w:tc>
+        <w:tc>
+          <w:tcPr>
+            <w:tcW w:w="1669" w:type="dxa"/>
+            <w:hideMark/>
+          </w:tcPr>
+          <w:p>
+            <w:pPr>
+              <w:rPr>
+                <w:rFonts w:ascii="Times New Roman" w:hAnsi="Times New Roman" w:cs="Times New Roman"/>
+              </w:rPr>
+            </w:pPr>
+            <w:r>
+              <w:rPr>
+                <w:rFonts w:ascii="Times New Roman" w:hAnsi="Times New Roman" w:cs="Times New Roman"/>
+              </w:rPr>
+              <w:t>RD-OPS243-04</w:t>
+            </w:r>
+          </w:p>
+        </w:tc>
+        <w:tc>
+          <w:tcPr>
+            <w:tcW w:w="1245" w:type="dxa"/>
+            <w:hideMark/>
+          </w:tcPr>
+          <w:p>
+            <w:pPr>
+              <w:rPr>
+                <w:rFonts w:ascii="Times New Roman" w:hAnsi="Times New Roman" w:cs="Times New Roman"/>
+              </w:rPr>
+            </w:pPr>
+            <w:r>
+              <w:rPr>
+                <w:rFonts w:ascii="Times New Roman" w:hAnsi="Times New Roman" w:cs="Times New Roman"/>
+              </w:rPr>
+              <w:t>6.200411</w:t>
+            </w:r>
+          </w:p>
+        </w:tc>
+        <w:tc>
+          <w:tcPr>
+            <w:tcW w:w="1590" w:type="dxa"/>
+            <w:hideMark/>
+          </w:tcPr>
+          <w:p>
+            <w:pPr>
+              <w:rPr>
+                <w:rFonts w:ascii="Times New Roman" w:hAnsi="Times New Roman" w:cs="Times New Roman"/>
+              </w:rPr>
+            </w:pPr>
+            <w:r>
+              <w:rPr>
+                <w:rFonts w:ascii="Times New Roman" w:hAnsi="Times New Roman" w:cs="Times New Roman"/>
+              </w:rPr>
+              <w:t>-75.546391</w:t>
             </w:r>
           </w:p>
         </w:tc>
       </w:tr>
       <w:tr>
         <w:trPr>
-          <w:trHeight w:val="600"/>
+          <w:trHeight w:val="300"/>
         </w:trPr>
         <w:tc>
           <w:tcPr>
-            <w:tcW w:w="1917" w:type="dxa"/>
-            <w:hideMark/>
-          </w:tcPr>
-          <w:p>
-            <w:pPr>
-              <w:rPr>
-                <w:rFonts w:ascii="Times New Roman" w:hAnsi="Times New Roman" w:cs="Times New Roman"/>
-                <w:sz w:val="24"/>
-                <w:szCs w:val="24"/>
-              </w:rPr>
-            </w:pPr>
-            <w:r>
-              <w:rPr>
-                <w:rFonts w:ascii="Times New Roman" w:hAnsi="Times New Roman" w:cs="Times New Roman"/>
-                <w:sz w:val="24"/>
-                <w:szCs w:val="24"/>
-              </w:rPr>
-              <w:t>14/3/2026 07:32</w:t>
-            </w:r>
-          </w:p>
-        </w:tc>
-        <w:tc>
-          <w:tcPr>
-            <w:tcW w:w="1221" w:type="dxa"/>
-            <w:hideMark/>
-          </w:tcPr>
-          <w:p>
-            <w:pPr>
-              <w:rPr>
-                <w:rFonts w:ascii="Times New Roman" w:hAnsi="Times New Roman" w:cs="Times New Roman"/>
-                <w:sz w:val="24"/>
-                <w:szCs w:val="24"/>
-              </w:rPr>
-            </w:pPr>
-            <w:r>
-              <w:rPr>
-                <w:rFonts w:ascii="Times New Roman" w:hAnsi="Times New Roman" w:cs="Times New Roman"/>
-                <w:sz w:val="24"/>
-                <w:szCs w:val="24"/>
-              </w:rPr>
-              <w:t>44.1</w:t>
-            </w:r>
-          </w:p>
-        </w:tc>
-        <w:tc>
-          <w:tcPr>
-            <w:tcW w:w="1683" w:type="dxa"/>
-            <w:hideMark/>
-          </w:tcPr>
-          <w:p>
-            <w:pPr>
-              <w:rPr>
-                <w:rFonts w:ascii="Times New Roman" w:hAnsi="Times New Roman" w:cs="Times New Roman"/>
-                <w:sz w:val="24"/>
-                <w:szCs w:val="24"/>
-              </w:rPr>
-            </w:pPr>
-            <w:r>
-              <w:rPr>
-                <w:rFonts w:ascii="Times New Roman" w:hAnsi="Times New Roman" w:cs="Times New Roman"/>
-                <w:sz w:val="24"/>
-                <w:szCs w:val="24"/>
+            <w:tcW w:w="1710" w:type="dxa"/>
+            <w:hideMark/>
+          </w:tcPr>
+          <w:p>
+            <w:pPr>
+              <w:rPr>
+                <w:rFonts w:ascii="Times New Roman" w:hAnsi="Times New Roman" w:cs="Times New Roman"/>
+              </w:rPr>
+            </w:pPr>
+            <w:r>
+              <w:rPr>
+                <w:rFonts w:ascii="Times New Roman" w:hAnsi="Times New Roman" w:cs="Times New Roman"/>
+              </w:rPr>
+              <w:t>14/3/2026 00:00</w:t>
+            </w:r>
+          </w:p>
+        </w:tc>
+        <w:tc>
+          <w:tcPr>
+            <w:tcW w:w="1504" w:type="dxa"/>
+            <w:hideMark/>
+          </w:tcPr>
+          <w:p>
+            <w:pPr>
+              <w:rPr>
+                <w:rFonts w:ascii="Times New Roman" w:hAnsi="Times New Roman" w:cs="Times New Roman"/>
+              </w:rPr>
+            </w:pPr>
+            <w:r>
+              <w:rPr>
+                <w:rFonts w:ascii="Times New Roman" w:hAnsi="Times New Roman" w:cs="Times New Roman"/>
+              </w:rPr>
+              <w:t>74.4876</w:t>
+            </w:r>
+          </w:p>
+        </w:tc>
+        <w:tc>
+          <w:tcPr>
+            <w:tcW w:w="1775" w:type="dxa"/>
+            <w:hideMark/>
+          </w:tcPr>
+          <w:p>
+            <w:pPr>
+              <w:rPr>
+                <w:rFonts w:ascii="Times New Roman" w:hAnsi="Times New Roman" w:cs="Times New Roman"/>
+              </w:rPr>
+            </w:pPr>
+            <w:r>
+              <w:rPr>
+                <w:rFonts w:ascii="Times New Roman" w:hAnsi="Times New Roman" w:cs="Times New Roman"/>
               </w:rPr>
               <w:t>OUTBOUND</w:t>
             </w:r>
@@ -5105,70 +5639,58 @@
         </w:tc>
         <w:tc>
           <w:tcPr>
-            <w:tcW w:w="1837" w:type="dxa"/>
-            <w:hideMark/>
-          </w:tcPr>
-          <w:p>
-            <w:pPr>
-              <w:rPr>
-                <w:rFonts w:ascii="Times New Roman" w:hAnsi="Times New Roman" w:cs="Times New Roman"/>
-                <w:sz w:val="24"/>
-                <w:szCs w:val="24"/>
-              </w:rPr>
-            </w:pPr>
-            <w:r>
-              <w:rPr>
-                <w:rFonts w:ascii="Times New Roman" w:hAnsi="Times New Roman" w:cs="Times New Roman"/>
-                <w:sz w:val="24"/>
-                <w:szCs w:val="24"/>
-              </w:rPr>
-              <w:t>RD-OPS243-01</w:t>
-            </w:r>
-          </w:p>
-        </w:tc>
-        <w:tc>
-          <w:tcPr>
-            <w:tcW w:w="1134" w:type="dxa"/>
-            <w:hideMark/>
-          </w:tcPr>
-          <w:p>
-            <w:pPr>
-              <w:rPr>
-                <w:rFonts w:ascii="Times New Roman" w:hAnsi="Times New Roman" w:cs="Times New Roman"/>
-                <w:sz w:val="24"/>
-                <w:szCs w:val="24"/>
-              </w:rPr>
-            </w:pPr>
-            <w:r>
-              <w:rPr>
-                <w:rFonts w:ascii="Times New Roman" w:hAnsi="Times New Roman" w:cs="Times New Roman"/>
-                <w:sz w:val="24"/>
-                <w:szCs w:val="24"/>
-              </w:rPr>
-              <w:t>6.220055</w:t>
-            </w:r>
-          </w:p>
-        </w:tc>
-        <w:tc>
-          <w:tcPr>
-            <w:tcW w:w="1559" w:type="dxa"/>
-            <w:hideMark/>
-          </w:tcPr>
-          <w:p>
-            <w:pPr>
-              <w:rPr>
-                <w:rFonts w:ascii="Times New Roman" w:hAnsi="Times New Roman" w:cs="Times New Roman"/>
-                <w:sz w:val="24"/>
-                <w:szCs w:val="24"/>
-              </w:rPr>
-            </w:pPr>
-            <w:r>
-              <w:rPr>
-                <w:rFonts w:ascii="Times New Roman" w:hAnsi="Times New Roman" w:cs="Times New Roman"/>
-                <w:sz w:val="24"/>
-                <w:szCs w:val="24"/>
-              </w:rPr>
-              <w:t>-75.562449</w:t>
+            <w:tcW w:w="1669" w:type="dxa"/>
+            <w:hideMark/>
+          </w:tcPr>
+          <w:p>
+            <w:pPr>
+              <w:rPr>
+                <w:rFonts w:ascii="Times New Roman" w:hAnsi="Times New Roman" w:cs="Times New Roman"/>
+              </w:rPr>
+            </w:pPr>
+            <w:r>
+              <w:rPr>
+                <w:rFonts w:ascii="Times New Roman" w:hAnsi="Times New Roman" w:cs="Times New Roman"/>
+              </w:rPr>
+              <w:t>RD-OPS243-05</w:t>
+            </w:r>
+          </w:p>
+        </w:tc>
+        <w:tc>
+          <w:tcPr>
+            <w:tcW w:w="1245" w:type="dxa"/>
+            <w:hideMark/>
+          </w:tcPr>
+          <w:p>
+            <w:pPr>
+              <w:rPr>
+                <w:rFonts w:ascii="Times New Roman" w:hAnsi="Times New Roman" w:cs="Times New Roman"/>
+              </w:rPr>
+            </w:pPr>
+            <w:r>
+              <w:rPr>
+                <w:rFonts w:ascii="Times New Roman" w:hAnsi="Times New Roman" w:cs="Times New Roman"/>
+              </w:rPr>
+              <w:t>6.179181</w:t>
+            </w:r>
+          </w:p>
+        </w:tc>
+        <w:tc>
+          <w:tcPr>
+            <w:tcW w:w="1590" w:type="dxa"/>
+            <w:hideMark/>
+          </w:tcPr>
+          <w:p>
+            <w:pPr>
+              <w:rPr>
+                <w:rFonts w:ascii="Times New Roman" w:hAnsi="Times New Roman" w:cs="Times New Roman"/>
+              </w:rPr>
+            </w:pPr>
+            <w:r>
+              <w:rPr>
+                <w:rFonts w:ascii="Times New Roman" w:hAnsi="Times New Roman" w:cs="Times New Roman"/>
+              </w:rPr>
+              <w:t>-75.543121</w:t>
             </w:r>
           </w:p>
         </w:tc>
@@ -5184,17 +5706,6 @@
           <w:szCs w:val="24"/>
         </w:rPr>
       </w:pPr>
-    </w:p>
-    <w:p>
-      <w:pPr>
-        <w:rPr>
-          <w:rFonts w:ascii="Times New Roman" w:hAnsi="Times New Roman" w:cs="Times New Roman"/>
-          <w:b/>
-          <w:bCs/>
-          <w:sz w:val="24"/>
-          <w:szCs w:val="24"/>
-        </w:rPr>
-      </w:pPr>
       <w:r>
         <w:rPr>
           <w:rFonts w:ascii="Times New Roman" w:hAnsi="Times New Roman" w:cs="Times New Roman"/>
@@ -5226,7 +5737,7 @@
           <w:szCs w:val="24"/>
         </w:rPr>
         <w:drawing>
-          <wp:inline distT="0" distB="0" distL="0" distR="0" wp14:anchorId="283BA38F" wp14:editId="42976E8F">
+          <wp:inline distT="0" distB="0" distL="0" distR="0" wp14:anchorId="2DF5EECE" wp14:editId="4ED717F9">
             <wp:extent cx="6509747" cy="1533525"/>
             <wp:effectExtent l="0" t="0" r="5715" b="0"/>
             <wp:docPr id="1182355219" name="Imagen 1"/>
@@ -5362,23 +5873,7 @@
           <w:sz w:val="24"/>
           <w:szCs w:val="24"/>
         </w:rPr>
-        <w:t xml:space="preserve">Según </w:t>
-      </w:r>
-      <w:r>
-        <w:rPr>
-          <w:rFonts w:ascii="Times New Roman" w:hAnsi="Times New Roman" w:cs="Times New Roman"/>
-          <w:sz w:val="24"/>
-          <w:szCs w:val="24"/>
-        </w:rPr>
-        <w:t>Nyquist, es</w:t>
-      </w:r>
-      <w:r>
-        <w:rPr>
-          <w:rFonts w:ascii="Times New Roman" w:hAnsi="Times New Roman" w:cs="Times New Roman"/>
-          <w:sz w:val="24"/>
-          <w:szCs w:val="24"/>
-        </w:rPr>
-        <w:t xml:space="preserve"> necesario tomar muestras al menos al doble de su frecuencia máxima</w:t>
+        <w:t>Según Nyquist, es necesario tomar muestras al menos al doble de su frecuencia máxima</w:t>
       </w:r>
       <w:r>
         <w:rPr>
@@ -5639,39 +6134,15 @@
           <w:sz w:val="24"/>
           <w:szCs w:val="24"/>
         </w:rPr>
-        <w:t>4</w:t>
-      </w:r>
-      <w:r>
-        <w:rPr>
-          <w:rFonts w:ascii="Times New Roman" w:hAnsi="Times New Roman" w:cs="Times New Roman"/>
-          <w:sz w:val="24"/>
-          <w:szCs w:val="24"/>
-        </w:rPr>
-        <w:t>60</w:t>
-      </w:r>
-      <w:r>
-        <w:rPr>
-          <w:rFonts w:ascii="Times New Roman" w:hAnsi="Times New Roman" w:cs="Times New Roman"/>
-          <w:sz w:val="24"/>
-          <w:szCs w:val="24"/>
-        </w:rPr>
-        <w:t xml:space="preserve"> </w:t>
-      </w:r>
-      <w:r>
-        <w:rPr>
-          <w:rFonts w:ascii="Times New Roman" w:hAnsi="Times New Roman" w:cs="Times New Roman"/>
-          <w:sz w:val="24"/>
-          <w:szCs w:val="24"/>
-        </w:rPr>
-        <w:t>niveles</w:t>
-      </w:r>
-      <w:r>
-        <w:rPr>
-          <w:rFonts w:ascii="Times New Roman" w:hAnsi="Times New Roman" w:cs="Times New Roman"/>
-          <w:sz w:val="24"/>
-          <w:szCs w:val="24"/>
-        </w:rPr>
-        <w:t xml:space="preserve"> distintos</w:t>
+        <w:t xml:space="preserve">460 </w:t>
+      </w:r>
+      <w:r>
+        <w:rPr>
+          <w:rFonts w:ascii="Times New Roman" w:hAnsi="Times New Roman" w:cs="Times New Roman"/>
+          <w:sz w:val="24"/>
+          <w:szCs w:val="24"/>
+        </w:rPr>
+        <w:t>niveles distintos</w:t>
       </w:r>
       <w:r>
         <w:rPr>
@@ -5703,15 +6174,7 @@
           <w:sz w:val="24"/>
           <w:szCs w:val="24"/>
         </w:rPr>
-        <w:t>4</w:t>
-      </w:r>
-      <w:r>
-        <w:rPr>
-          <w:rFonts w:ascii="Times New Roman" w:hAnsi="Times New Roman" w:cs="Times New Roman"/>
-          <w:sz w:val="24"/>
-          <w:szCs w:val="24"/>
-        </w:rPr>
-        <w:t xml:space="preserve">60 </w:t>
+        <w:t xml:space="preserve">460 </w:t>
       </w:r>
       <w:r>
         <w:rPr>
@@ -5778,7 +6241,7 @@
           <w:sz w:val="24"/>
           <w:szCs w:val="24"/>
         </w:rPr>
-        <w:t>Si analizamos las 3 fuentes con todas las variables podemos obtener la siguiente tabla:</w:t>
+        <w:t>Se analizaron las cuatro fuentes de datos con todas sus variables para identificar registros con información faltante, valores inválidos o inconsistencias. Los resultados obtenidos en los notebooks se presentan en la siguiente tabla:</w:t>
       </w:r>
     </w:p>
     <w:p>
@@ -5801,15 +6264,15 @@
     <w:tbl>
       <w:tblPr>
         <w:tblStyle w:val="Tablaconcuadrcula"/>
-        <w:tblW w:w="9300" w:type="dxa"/>
+        <w:tblW w:w="8926" w:type="dxa"/>
         <w:tblLook w:val="04A0" w:firstRow="1" w:lastRow="0" w:firstColumn="1" w:lastColumn="0" w:noHBand="0" w:noVBand="1"/>
       </w:tblPr>
       <w:tblGrid>
-        <w:gridCol w:w="2148"/>
-        <w:gridCol w:w="1845"/>
-        <w:gridCol w:w="1738"/>
-        <w:gridCol w:w="1810"/>
-        <w:gridCol w:w="1759"/>
+        <w:gridCol w:w="1960"/>
+        <w:gridCol w:w="1685"/>
+        <w:gridCol w:w="1830"/>
+        <w:gridCol w:w="1092"/>
+        <w:gridCol w:w="2359"/>
       </w:tblGrid>
       <w:tr>
         <w:trPr>
@@ -5817,7 +6280,7 @@
         </w:trPr>
         <w:tc>
           <w:tcPr>
-            <w:tcW w:w="2148" w:type="dxa"/>
+            <w:tcW w:w="1988" w:type="dxa"/>
             <w:hideMark/>
           </w:tcPr>
           <w:p>
@@ -5826,8 +6289,6 @@
                 <w:rFonts w:ascii="Times New Roman" w:hAnsi="Times New Roman" w:cs="Times New Roman"/>
                 <w:b/>
                 <w:bCs/>
-                <w:sz w:val="24"/>
-                <w:szCs w:val="24"/>
               </w:rPr>
             </w:pPr>
             <w:r>
@@ -5835,8 +6296,6 @@
                 <w:rFonts w:ascii="Times New Roman" w:hAnsi="Times New Roman" w:cs="Times New Roman"/>
                 <w:b/>
                 <w:bCs/>
-                <w:sz w:val="24"/>
-                <w:szCs w:val="24"/>
               </w:rPr>
               <w:t>Nombre de la fuente</w:t>
             </w:r>
@@ -5844,7 +6303,7 @@
         </w:tc>
         <w:tc>
           <w:tcPr>
-            <w:tcW w:w="1845" w:type="dxa"/>
+            <w:tcW w:w="1711" w:type="dxa"/>
             <w:hideMark/>
           </w:tcPr>
           <w:p>
@@ -5853,8 +6312,6 @@
                 <w:rFonts w:ascii="Times New Roman" w:hAnsi="Times New Roman" w:cs="Times New Roman"/>
                 <w:b/>
                 <w:bCs/>
-                <w:sz w:val="24"/>
-                <w:szCs w:val="24"/>
               </w:rPr>
             </w:pPr>
             <w:r>
@@ -5862,8 +6319,6 @@
                 <w:rFonts w:ascii="Times New Roman" w:hAnsi="Times New Roman" w:cs="Times New Roman"/>
                 <w:b/>
                 <w:bCs/>
-                <w:sz w:val="24"/>
-                <w:szCs w:val="24"/>
               </w:rPr>
               <w:t>Registros analizados</w:t>
             </w:r>
@@ -5871,7 +6326,7 @@
         </w:tc>
         <w:tc>
           <w:tcPr>
-            <w:tcW w:w="1738" w:type="dxa"/>
+            <w:tcW w:w="1870" w:type="dxa"/>
             <w:hideMark/>
           </w:tcPr>
           <w:p>
@@ -5880,8 +6335,6 @@
                 <w:rFonts w:ascii="Times New Roman" w:hAnsi="Times New Roman" w:cs="Times New Roman"/>
                 <w:b/>
                 <w:bCs/>
-                <w:sz w:val="24"/>
-                <w:szCs w:val="24"/>
               </w:rPr>
             </w:pPr>
             <w:r>
@@ -5889,8 +6342,6 @@
                 <w:rFonts w:ascii="Times New Roman" w:hAnsi="Times New Roman" w:cs="Times New Roman"/>
                 <w:b/>
                 <w:bCs/>
-                <w:sz w:val="24"/>
-                <w:szCs w:val="24"/>
               </w:rPr>
               <w:t>Registros con datos faltantes</w:t>
             </w:r>
@@ -5898,7 +6349,7 @@
         </w:tc>
         <w:tc>
           <w:tcPr>
-            <w:tcW w:w="1810" w:type="dxa"/>
+            <w:tcW w:w="947" w:type="dxa"/>
             <w:hideMark/>
           </w:tcPr>
           <w:p>
@@ -5907,8 +6358,6 @@
                 <w:rFonts w:ascii="Times New Roman" w:hAnsi="Times New Roman" w:cs="Times New Roman"/>
                 <w:b/>
                 <w:bCs/>
-                <w:sz w:val="24"/>
-                <w:szCs w:val="24"/>
               </w:rPr>
             </w:pPr>
             <w:r>
@@ -5916,8 +6365,6 @@
                 <w:rFonts w:ascii="Times New Roman" w:hAnsi="Times New Roman" w:cs="Times New Roman"/>
                 <w:b/>
                 <w:bCs/>
-                <w:sz w:val="24"/>
-                <w:szCs w:val="24"/>
               </w:rPr>
               <w:t>Registros con error</w:t>
             </w:r>
@@ -5925,7 +6372,7 @@
         </w:tc>
         <w:tc>
           <w:tcPr>
-            <w:tcW w:w="1759" w:type="dxa"/>
+            <w:tcW w:w="2410" w:type="dxa"/>
             <w:hideMark/>
           </w:tcPr>
           <w:p>
@@ -5934,8 +6381,6 @@
                 <w:rFonts w:ascii="Times New Roman" w:hAnsi="Times New Roman" w:cs="Times New Roman"/>
                 <w:b/>
                 <w:bCs/>
-                <w:sz w:val="24"/>
-                <w:szCs w:val="24"/>
               </w:rPr>
             </w:pPr>
             <w:r>
@@ -5943,8 +6388,6 @@
                 <w:rFonts w:ascii="Times New Roman" w:hAnsi="Times New Roman" w:cs="Times New Roman"/>
                 <w:b/>
                 <w:bCs/>
-                <w:sz w:val="24"/>
-                <w:szCs w:val="24"/>
               </w:rPr>
               <w:t>Problema de calidad más frecuente</w:t>
             </w:r>
@@ -5953,26 +6396,22 @@
       </w:tr>
       <w:tr>
         <w:trPr>
-          <w:trHeight w:val="1110"/>
+          <w:trHeight w:val="910"/>
         </w:trPr>
         <w:tc>
           <w:tcPr>
-            <w:tcW w:w="2148" w:type="dxa"/>
-            <w:hideMark/>
-          </w:tcPr>
-          <w:p>
-            <w:pPr>
-              <w:rPr>
-                <w:rFonts w:ascii="Times New Roman" w:hAnsi="Times New Roman" w:cs="Times New Roman"/>
-                <w:sz w:val="24"/>
-                <w:szCs w:val="24"/>
-              </w:rPr>
-            </w:pPr>
-            <w:r>
-              <w:rPr>
-                <w:rFonts w:ascii="Times New Roman" w:hAnsi="Times New Roman" w:cs="Times New Roman"/>
-                <w:sz w:val="24"/>
-                <w:szCs w:val="24"/>
+            <w:tcW w:w="1988" w:type="dxa"/>
+            <w:hideMark/>
+          </w:tcPr>
+          <w:p>
+            <w:pPr>
+              <w:rPr>
+                <w:rFonts w:ascii="Times New Roman" w:hAnsi="Times New Roman" w:cs="Times New Roman"/>
+              </w:rPr>
+            </w:pPr>
+            <w:r>
+              <w:rPr>
+                <w:rFonts w:ascii="Times New Roman" w:hAnsi="Times New Roman" w:cs="Times New Roman"/>
               </w:rPr>
               <w:t>API de Siniestralidad de Medellín</w:t>
             </w:r>
@@ -5980,45 +6419,37 @@
         </w:tc>
         <w:tc>
           <w:tcPr>
-            <w:tcW w:w="1845" w:type="dxa"/>
-            <w:hideMark/>
-          </w:tcPr>
-          <w:p>
-            <w:pPr>
-              <w:rPr>
-                <w:rFonts w:ascii="Times New Roman" w:hAnsi="Times New Roman" w:cs="Times New Roman"/>
-                <w:sz w:val="24"/>
-                <w:szCs w:val="24"/>
-              </w:rPr>
-            </w:pPr>
-            <w:r>
-              <w:rPr>
-                <w:rFonts w:ascii="Times New Roman" w:hAnsi="Times New Roman" w:cs="Times New Roman"/>
-                <w:sz w:val="24"/>
-                <w:szCs w:val="24"/>
-              </w:rPr>
-              <w:t>235820</w:t>
-            </w:r>
-          </w:p>
-        </w:tc>
-        <w:tc>
-          <w:tcPr>
-            <w:tcW w:w="1738" w:type="dxa"/>
-            <w:hideMark/>
-          </w:tcPr>
-          <w:p>
-            <w:pPr>
-              <w:rPr>
-                <w:rFonts w:ascii="Times New Roman" w:hAnsi="Times New Roman" w:cs="Times New Roman"/>
-                <w:sz w:val="24"/>
-                <w:szCs w:val="24"/>
-              </w:rPr>
-            </w:pPr>
-            <w:r>
-              <w:rPr>
-                <w:rFonts w:ascii="Times New Roman" w:hAnsi="Times New Roman" w:cs="Times New Roman"/>
-                <w:sz w:val="24"/>
-                <w:szCs w:val="24"/>
+            <w:tcW w:w="1711" w:type="dxa"/>
+            <w:hideMark/>
+          </w:tcPr>
+          <w:p>
+            <w:pPr>
+              <w:rPr>
+                <w:rFonts w:ascii="Times New Roman" w:hAnsi="Times New Roman" w:cs="Times New Roman"/>
+              </w:rPr>
+            </w:pPr>
+            <w:r>
+              <w:rPr>
+                <w:rFonts w:ascii="Times New Roman" w:hAnsi="Times New Roman" w:cs="Times New Roman"/>
+              </w:rPr>
+              <w:t>235.820</w:t>
+            </w:r>
+          </w:p>
+        </w:tc>
+        <w:tc>
+          <w:tcPr>
+            <w:tcW w:w="1870" w:type="dxa"/>
+            <w:hideMark/>
+          </w:tcPr>
+          <w:p>
+            <w:pPr>
+              <w:rPr>
+                <w:rFonts w:ascii="Times New Roman" w:hAnsi="Times New Roman" w:cs="Times New Roman"/>
+              </w:rPr>
+            </w:pPr>
+            <w:r>
+              <w:rPr>
+                <w:rFonts w:ascii="Times New Roman" w:hAnsi="Times New Roman" w:cs="Times New Roman"/>
               </w:rPr>
               <w:t>473</w:t>
             </w:r>
@@ -6026,22 +6457,18 @@
         </w:tc>
         <w:tc>
           <w:tcPr>
-            <w:tcW w:w="1810" w:type="dxa"/>
-            <w:hideMark/>
-          </w:tcPr>
-          <w:p>
-            <w:pPr>
-              <w:rPr>
-                <w:rFonts w:ascii="Times New Roman" w:hAnsi="Times New Roman" w:cs="Times New Roman"/>
-                <w:sz w:val="24"/>
-                <w:szCs w:val="24"/>
-              </w:rPr>
-            </w:pPr>
-            <w:r>
-              <w:rPr>
-                <w:rFonts w:ascii="Times New Roman" w:hAnsi="Times New Roman" w:cs="Times New Roman"/>
-                <w:sz w:val="24"/>
-                <w:szCs w:val="24"/>
+            <w:tcW w:w="947" w:type="dxa"/>
+            <w:hideMark/>
+          </w:tcPr>
+          <w:p>
+            <w:pPr>
+              <w:rPr>
+                <w:rFonts w:ascii="Times New Roman" w:hAnsi="Times New Roman" w:cs="Times New Roman"/>
+              </w:rPr>
+            </w:pPr>
+            <w:r>
+              <w:rPr>
+                <w:rFonts w:ascii="Times New Roman" w:hAnsi="Times New Roman" w:cs="Times New Roman"/>
               </w:rPr>
               <w:t>0</w:t>
             </w:r>
@@ -6049,24 +6476,506 @@
         </w:tc>
         <w:tc>
           <w:tcPr>
-            <w:tcW w:w="1759" w:type="dxa"/>
-            <w:hideMark/>
-          </w:tcPr>
-          <w:p>
-            <w:pPr>
-              <w:rPr>
-                <w:rFonts w:ascii="Times New Roman" w:hAnsi="Times New Roman" w:cs="Times New Roman"/>
-                <w:sz w:val="24"/>
-                <w:szCs w:val="24"/>
-              </w:rPr>
-            </w:pPr>
-            <w:r>
-              <w:rPr>
-                <w:rFonts w:ascii="Times New Roman" w:hAnsi="Times New Roman" w:cs="Times New Roman"/>
-                <w:sz w:val="24"/>
-                <w:szCs w:val="24"/>
+            <w:tcW w:w="2410" w:type="dxa"/>
+            <w:hideMark/>
+          </w:tcPr>
+          <w:p>
+            <w:pPr>
+              <w:rPr>
+                <w:rFonts w:ascii="Times New Roman" w:hAnsi="Times New Roman" w:cs="Times New Roman"/>
+              </w:rPr>
+            </w:pPr>
+            <w:r>
+              <w:rPr>
+                <w:rFonts w:ascii="Times New Roman" w:hAnsi="Times New Roman" w:cs="Times New Roman"/>
               </w:rPr>
               <w:t>Valores ND en nom_comuna</w:t>
+            </w:r>
+          </w:p>
+        </w:tc>
+      </w:tr>
+      <w:tr>
+        <w:trPr>
+          <w:trHeight w:val="921"/>
+        </w:trPr>
+        <w:tc>
+          <w:tcPr>
+            <w:tcW w:w="1988" w:type="dxa"/>
+            <w:hideMark/>
+          </w:tcPr>
+          <w:p>
+            <w:pPr>
+              <w:rPr>
+                <w:rFonts w:ascii="Times New Roman" w:hAnsi="Times New Roman" w:cs="Times New Roman"/>
+              </w:rPr>
+            </w:pPr>
+            <w:r>
+              <w:rPr>
+                <w:rFonts w:ascii="Times New Roman" w:hAnsi="Times New Roman" w:cs="Times New Roman"/>
+              </w:rPr>
+              <w:t>Segmento Vial – Avenida Las Palmas</w:t>
+            </w:r>
+          </w:p>
+        </w:tc>
+        <w:tc>
+          <w:tcPr>
+            <w:tcW w:w="1711" w:type="dxa"/>
+            <w:hideMark/>
+          </w:tcPr>
+          <w:p>
+            <w:pPr>
+              <w:rPr>
+                <w:rFonts w:ascii="Times New Roman" w:hAnsi="Times New Roman" w:cs="Times New Roman"/>
+              </w:rPr>
+            </w:pPr>
+            <w:r>
+              <w:rPr>
+                <w:rFonts w:ascii="Times New Roman" w:hAnsi="Times New Roman" w:cs="Times New Roman"/>
+              </w:rPr>
+              <w:t>87</w:t>
+            </w:r>
+          </w:p>
+        </w:tc>
+        <w:tc>
+          <w:tcPr>
+            <w:tcW w:w="1870" w:type="dxa"/>
+            <w:hideMark/>
+          </w:tcPr>
+          <w:p>
+            <w:pPr>
+              <w:rPr>
+                <w:rFonts w:ascii="Times New Roman" w:hAnsi="Times New Roman" w:cs="Times New Roman"/>
+              </w:rPr>
+            </w:pPr>
+            <w:r>
+              <w:rPr>
+                <w:rFonts w:ascii="Times New Roman" w:hAnsi="Times New Roman" w:cs="Times New Roman"/>
+              </w:rPr>
+              <w:t>87</w:t>
+            </w:r>
+          </w:p>
+        </w:tc>
+        <w:tc>
+          <w:tcPr>
+            <w:tcW w:w="947" w:type="dxa"/>
+            <w:hideMark/>
+          </w:tcPr>
+          <w:p>
+            <w:pPr>
+              <w:rPr>
+                <w:rFonts w:ascii="Times New Roman" w:hAnsi="Times New Roman" w:cs="Times New Roman"/>
+              </w:rPr>
+            </w:pPr>
+            <w:r>
+              <w:rPr>
+                <w:rFonts w:ascii="Times New Roman" w:hAnsi="Times New Roman" w:cs="Times New Roman"/>
+              </w:rPr>
+              <w:t>0</w:t>
+            </w:r>
+          </w:p>
+        </w:tc>
+        <w:tc>
+          <w:tcPr>
+            <w:tcW w:w="2410" w:type="dxa"/>
+            <w:hideMark/>
+          </w:tcPr>
+          <w:p>
+            <w:pPr>
+              <w:rPr>
+                <w:rFonts w:ascii="Times New Roman" w:hAnsi="Times New Roman" w:cs="Times New Roman"/>
+              </w:rPr>
+            </w:pPr>
+            <w:r>
+              <w:rPr>
+                <w:rFonts w:ascii="Times New Roman" w:hAnsi="Times New Roman" w:cs="Times New Roman"/>
+              </w:rPr>
+              <w:t>Campo observ sin información</w:t>
+            </w:r>
+          </w:p>
+        </w:tc>
+      </w:tr>
+      <w:tr>
+        <w:trPr>
+          <w:trHeight w:val="947"/>
+        </w:trPr>
+        <w:tc>
+          <w:tcPr>
+            <w:tcW w:w="1988" w:type="dxa"/>
+            <w:hideMark/>
+          </w:tcPr>
+          <w:p>
+            <w:pPr>
+              <w:rPr>
+                <w:rFonts w:ascii="Times New Roman" w:hAnsi="Times New Roman" w:cs="Times New Roman"/>
+              </w:rPr>
+            </w:pPr>
+            <w:r>
+              <w:rPr>
+                <w:rFonts w:ascii="Times New Roman" w:hAnsi="Times New Roman" w:cs="Times New Roman"/>
+              </w:rPr>
+              <w:t>Radar Doppler OPS243-A simulado</w:t>
+            </w:r>
+          </w:p>
+        </w:tc>
+        <w:tc>
+          <w:tcPr>
+            <w:tcW w:w="1711" w:type="dxa"/>
+            <w:hideMark/>
+          </w:tcPr>
+          <w:p>
+            <w:pPr>
+              <w:rPr>
+                <w:rFonts w:ascii="Times New Roman" w:hAnsi="Times New Roman" w:cs="Times New Roman"/>
+              </w:rPr>
+            </w:pPr>
+            <w:r>
+              <w:rPr>
+                <w:rFonts w:ascii="Times New Roman" w:hAnsi="Times New Roman" w:cs="Times New Roman"/>
+              </w:rPr>
+              <w:t>5.000</w:t>
+            </w:r>
+          </w:p>
+        </w:tc>
+        <w:tc>
+          <w:tcPr>
+            <w:tcW w:w="1870" w:type="dxa"/>
+            <w:hideMark/>
+          </w:tcPr>
+          <w:p>
+            <w:pPr>
+              <w:rPr>
+                <w:rFonts w:ascii="Times New Roman" w:hAnsi="Times New Roman" w:cs="Times New Roman"/>
+              </w:rPr>
+            </w:pPr>
+            <w:r>
+              <w:rPr>
+                <w:rFonts w:ascii="Times New Roman" w:hAnsi="Times New Roman" w:cs="Times New Roman"/>
+              </w:rPr>
+              <w:t>0</w:t>
+            </w:r>
+          </w:p>
+        </w:tc>
+        <w:tc>
+          <w:tcPr>
+            <w:tcW w:w="947" w:type="dxa"/>
+            <w:hideMark/>
+          </w:tcPr>
+          <w:p>
+            <w:pPr>
+              <w:rPr>
+                <w:rFonts w:ascii="Times New Roman" w:hAnsi="Times New Roman" w:cs="Times New Roman"/>
+              </w:rPr>
+            </w:pPr>
+            <w:r>
+              <w:rPr>
+                <w:rFonts w:ascii="Times New Roman" w:hAnsi="Times New Roman" w:cs="Times New Roman"/>
+              </w:rPr>
+              <w:t>0</w:t>
+            </w:r>
+          </w:p>
+        </w:tc>
+        <w:tc>
+          <w:tcPr>
+            <w:tcW w:w="2410" w:type="dxa"/>
+            <w:hideMark/>
+          </w:tcPr>
+          <w:p>
+            <w:pPr>
+              <w:rPr>
+                <w:rFonts w:ascii="Times New Roman" w:hAnsi="Times New Roman" w:cs="Times New Roman"/>
+              </w:rPr>
+            </w:pPr>
+            <w:r>
+              <w:rPr>
+                <w:rFonts w:ascii="Times New Roman" w:hAnsi="Times New Roman" w:cs="Times New Roman"/>
+              </w:rPr>
+              <w:t>No se identificaron problemas</w:t>
+            </w:r>
+          </w:p>
+        </w:tc>
+      </w:tr>
+      <w:tr>
+        <w:trPr>
+          <w:trHeight w:val="935"/>
+        </w:trPr>
+        <w:tc>
+          <w:tcPr>
+            <w:tcW w:w="1988" w:type="dxa"/>
+            <w:hideMark/>
+          </w:tcPr>
+          <w:p>
+            <w:pPr>
+              <w:rPr>
+                <w:rFonts w:ascii="Times New Roman" w:hAnsi="Times New Roman" w:cs="Times New Roman"/>
+              </w:rPr>
+            </w:pPr>
+            <w:r>
+              <w:rPr>
+                <w:rFonts w:ascii="Times New Roman" w:hAnsi="Times New Roman" w:cs="Times New Roman"/>
+              </w:rPr>
+              <w:t>API de Meteorología – Open-Meteo</w:t>
+            </w:r>
+          </w:p>
+        </w:tc>
+        <w:tc>
+          <w:tcPr>
+            <w:tcW w:w="1711" w:type="dxa"/>
+            <w:hideMark/>
+          </w:tcPr>
+          <w:p>
+            <w:pPr>
+              <w:rPr>
+                <w:rFonts w:ascii="Times New Roman" w:hAnsi="Times New Roman" w:cs="Times New Roman"/>
+              </w:rPr>
+            </w:pPr>
+            <w:r>
+              <w:rPr>
+                <w:rFonts w:ascii="Times New Roman" w:hAnsi="Times New Roman" w:cs="Times New Roman"/>
+              </w:rPr>
+              <w:t>184.104</w:t>
+            </w:r>
+          </w:p>
+        </w:tc>
+        <w:tc>
+          <w:tcPr>
+            <w:tcW w:w="1870" w:type="dxa"/>
+            <w:hideMark/>
+          </w:tcPr>
+          <w:p>
+            <w:pPr>
+              <w:rPr>
+                <w:rFonts w:ascii="Times New Roman" w:hAnsi="Times New Roman" w:cs="Times New Roman"/>
+              </w:rPr>
+            </w:pPr>
+            <w:r>
+              <w:rPr>
+                <w:rFonts w:ascii="Times New Roman" w:hAnsi="Times New Roman" w:cs="Times New Roman"/>
+              </w:rPr>
+              <w:t>0</w:t>
+            </w:r>
+          </w:p>
+        </w:tc>
+        <w:tc>
+          <w:tcPr>
+            <w:tcW w:w="947" w:type="dxa"/>
+            <w:hideMark/>
+          </w:tcPr>
+          <w:p>
+            <w:pPr>
+              <w:rPr>
+                <w:rFonts w:ascii="Times New Roman" w:hAnsi="Times New Roman" w:cs="Times New Roman"/>
+              </w:rPr>
+            </w:pPr>
+            <w:r>
+              <w:rPr>
+                <w:rFonts w:ascii="Times New Roman" w:hAnsi="Times New Roman" w:cs="Times New Roman"/>
+              </w:rPr>
+              <w:t>0</w:t>
+            </w:r>
+          </w:p>
+        </w:tc>
+        <w:tc>
+          <w:tcPr>
+            <w:tcW w:w="2410" w:type="dxa"/>
+            <w:hideMark/>
+          </w:tcPr>
+          <w:p>
+            <w:pPr>
+              <w:rPr>
+                <w:rFonts w:ascii="Times New Roman" w:hAnsi="Times New Roman" w:cs="Times New Roman"/>
+              </w:rPr>
+            </w:pPr>
+            <w:r>
+              <w:rPr>
+                <w:rFonts w:ascii="Times New Roman" w:hAnsi="Times New Roman" w:cs="Times New Roman"/>
+              </w:rPr>
+              <w:t>No se identificaron problemas</w:t>
+            </w:r>
+          </w:p>
+        </w:tc>
+      </w:tr>
+    </w:tbl>
+    <w:p>
+      <w:pPr>
+        <w:rPr>
+          <w:rFonts w:ascii="Times New Roman" w:hAnsi="Times New Roman" w:cs="Times New Roman"/>
+          <w:sz w:val="24"/>
+          <w:szCs w:val="24"/>
+        </w:rPr>
+      </w:pPr>
+    </w:p>
+    <w:p>
+      <w:pPr>
+        <w:rPr>
+          <w:rFonts w:ascii="Times New Roman" w:hAnsi="Times New Roman" w:cs="Times New Roman"/>
+          <w:sz w:val="24"/>
+          <w:szCs w:val="24"/>
+        </w:rPr>
+      </w:pPr>
+      <w:r>
+        <w:rPr>
+          <w:rFonts w:ascii="Times New Roman" w:hAnsi="Times New Roman" w:cs="Times New Roman"/>
+          <w:sz w:val="24"/>
+          <w:szCs w:val="24"/>
+        </w:rPr>
+        <w:t>Las anomalías identificadas corresponden principalmente a variables opcionales que no intervienen directamente en el análisis del proyecto. Por esta razón, se realizó una segunda revisión considerando únicamente las variables relevantes para el proyecto y la integración de las cuatro fuentes:</w:t>
+      </w:r>
+    </w:p>
+    <w:p>
+      <w:pPr>
+        <w:rPr>
+          <w:rFonts w:ascii="Times New Roman" w:hAnsi="Times New Roman" w:cs="Times New Roman"/>
+          <w:sz w:val="24"/>
+          <w:szCs w:val="24"/>
+        </w:rPr>
+      </w:pPr>
+      <w:r>
+        <w:rPr>
+          <w:rFonts w:ascii="Times New Roman" w:hAnsi="Times New Roman" w:cs="Times New Roman"/>
+          <w:sz w:val="24"/>
+          <w:szCs w:val="24"/>
+        </w:rPr>
+        <w:t>Tabla 2. Calidad de las variables relevantes para el proyecto</w:t>
+      </w:r>
+      <w:r>
+        <w:rPr>
+          <w:rFonts w:ascii="Times New Roman" w:hAnsi="Times New Roman" w:cs="Times New Roman"/>
+          <w:sz w:val="24"/>
+          <w:szCs w:val="24"/>
+        </w:rPr>
+        <w:t xml:space="preserve"> </w:t>
+      </w:r>
+    </w:p>
+    <w:tbl>
+      <w:tblPr>
+        <w:tblStyle w:val="Tablaconcuadrcula"/>
+        <w:tblW w:w="0" w:type="auto"/>
+        <w:tblLook w:val="04A0" w:firstRow="1" w:lastRow="0" w:firstColumn="1" w:lastColumn="0" w:noHBand="0" w:noVBand="1"/>
+      </w:tblPr>
+      <w:tblGrid>
+        <w:gridCol w:w="2001"/>
+        <w:gridCol w:w="1797"/>
+        <w:gridCol w:w="1919"/>
+        <w:gridCol w:w="1771"/>
+        <w:gridCol w:w="1340"/>
+      </w:tblGrid>
+      <w:tr>
+        <w:trPr>
+          <w:trHeight w:val="1200"/>
+        </w:trPr>
+        <w:tc>
+          <w:tcPr>
+            <w:tcW w:w="2001" w:type="dxa"/>
+            <w:hideMark/>
+          </w:tcPr>
+          <w:p>
+            <w:pPr>
+              <w:rPr>
+                <w:rFonts w:ascii="Times New Roman" w:hAnsi="Times New Roman" w:cs="Times New Roman"/>
+                <w:b/>
+                <w:bCs/>
+              </w:rPr>
+            </w:pPr>
+            <w:r>
+              <w:rPr>
+                <w:rFonts w:ascii="Times New Roman" w:hAnsi="Times New Roman" w:cs="Times New Roman"/>
+                <w:b/>
+                <w:bCs/>
+              </w:rPr>
+              <w:lastRenderedPageBreak/>
+              <w:t>Nombre de la fuente</w:t>
+            </w:r>
+          </w:p>
+        </w:tc>
+        <w:tc>
+          <w:tcPr>
+            <w:tcW w:w="1797" w:type="dxa"/>
+            <w:hideMark/>
+          </w:tcPr>
+          <w:p>
+            <w:pPr>
+              <w:rPr>
+                <w:rFonts w:ascii="Times New Roman" w:hAnsi="Times New Roman" w:cs="Times New Roman"/>
+                <w:b/>
+                <w:bCs/>
+              </w:rPr>
+            </w:pPr>
+            <w:r>
+              <w:rPr>
+                <w:rFonts w:ascii="Times New Roman" w:hAnsi="Times New Roman" w:cs="Times New Roman"/>
+                <w:b/>
+                <w:bCs/>
+              </w:rPr>
+              <w:t>Variables relevantes analizadas</w:t>
+            </w:r>
+          </w:p>
+        </w:tc>
+        <w:tc>
+          <w:tcPr>
+            <w:tcW w:w="1919" w:type="dxa"/>
+            <w:hideMark/>
+          </w:tcPr>
+          <w:p>
+            <w:pPr>
+              <w:rPr>
+                <w:rFonts w:ascii="Times New Roman" w:hAnsi="Times New Roman" w:cs="Times New Roman"/>
+                <w:b/>
+                <w:bCs/>
+              </w:rPr>
+            </w:pPr>
+            <w:r>
+              <w:rPr>
+                <w:rFonts w:ascii="Times New Roman" w:hAnsi="Times New Roman" w:cs="Times New Roman"/>
+                <w:b/>
+                <w:bCs/>
+              </w:rPr>
+              <w:t>Registros con datos faltantes</w:t>
+            </w:r>
+          </w:p>
+        </w:tc>
+        <w:tc>
+          <w:tcPr>
+            <w:tcW w:w="1771" w:type="dxa"/>
+            <w:hideMark/>
+          </w:tcPr>
+          <w:p>
+            <w:pPr>
+              <w:rPr>
+                <w:rFonts w:ascii="Times New Roman" w:hAnsi="Times New Roman" w:cs="Times New Roman"/>
+                <w:b/>
+                <w:bCs/>
+              </w:rPr>
+            </w:pPr>
+            <w:r>
+              <w:rPr>
+                <w:rFonts w:ascii="Times New Roman" w:hAnsi="Times New Roman" w:cs="Times New Roman"/>
+                <w:b/>
+                <w:bCs/>
+              </w:rPr>
+              <w:t>Registros con error</w:t>
+            </w:r>
+          </w:p>
+        </w:tc>
+        <w:tc>
+          <w:tcPr>
+            <w:tcW w:w="1340" w:type="dxa"/>
+            <w:hideMark/>
+          </w:tcPr>
+          <w:p>
+            <w:pPr>
+              <w:rPr>
+                <w:rFonts w:ascii="Times New Roman" w:hAnsi="Times New Roman" w:cs="Times New Roman"/>
+                <w:b/>
+                <w:bCs/>
+              </w:rPr>
+            </w:pPr>
+            <w:r>
+              <w:rPr>
+                <w:rFonts w:ascii="Times New Roman" w:hAnsi="Times New Roman" w:cs="Times New Roman"/>
+                <w:b/>
+                <w:bCs/>
+              </w:rPr>
+              <w:t>Problema de calidad más frecuente</w:t>
             </w:r>
           </w:p>
         </w:tc>
@@ -6077,91 +6986,56 @@
         </w:trPr>
         <w:tc>
           <w:tcPr>
-            <w:tcW w:w="2148" w:type="dxa"/>
-            <w:hideMark/>
-          </w:tcPr>
-          <w:p>
-            <w:pPr>
-              <w:rPr>
-                <w:rFonts w:ascii="Times New Roman" w:hAnsi="Times New Roman" w:cs="Times New Roman"/>
-                <w:sz w:val="24"/>
-                <w:szCs w:val="24"/>
-              </w:rPr>
-            </w:pPr>
-            <w:r>
-              <w:rPr>
-                <w:rFonts w:ascii="Times New Roman" w:hAnsi="Times New Roman" w:cs="Times New Roman"/>
-                <w:sz w:val="24"/>
-                <w:szCs w:val="24"/>
-              </w:rPr>
-              <w:t>Segmento Vial – Avenida Las Palmas</w:t>
-            </w:r>
-          </w:p>
-        </w:tc>
-        <w:tc>
-          <w:tcPr>
-            <w:tcW w:w="1845" w:type="dxa"/>
-            <w:hideMark/>
-          </w:tcPr>
-          <w:p>
-            <w:pPr>
-              <w:rPr>
-                <w:rFonts w:ascii="Times New Roman" w:hAnsi="Times New Roman" w:cs="Times New Roman"/>
-                <w:sz w:val="24"/>
-                <w:szCs w:val="24"/>
-              </w:rPr>
-            </w:pPr>
-            <w:r>
-              <w:rPr>
-                <w:rFonts w:ascii="Times New Roman" w:hAnsi="Times New Roman" w:cs="Times New Roman"/>
-                <w:sz w:val="24"/>
-                <w:szCs w:val="24"/>
-              </w:rPr>
-              <w:t>87</w:t>
-            </w:r>
-          </w:p>
-        </w:tc>
-        <w:tc>
-          <w:tcPr>
-            <w:tcW w:w="1738" w:type="dxa"/>
-            <w:hideMark/>
-          </w:tcPr>
-          <w:p>
-            <w:pPr>
-              <w:rPr>
-                <w:rFonts w:ascii="Times New Roman" w:hAnsi="Times New Roman" w:cs="Times New Roman"/>
-                <w:sz w:val="24"/>
-                <w:szCs w:val="24"/>
-              </w:rPr>
-            </w:pPr>
-            <w:r>
-              <w:rPr>
-                <w:rFonts w:ascii="Times New Roman" w:hAnsi="Times New Roman" w:cs="Times New Roman"/>
-                <w:sz w:val="24"/>
-                <w:szCs w:val="24"/>
-              </w:rPr>
-              <w:t>87</w:t>
-            </w:r>
-          </w:p>
-        </w:tc>
-        <w:tc>
-          <w:tcPr>
-            <w:tcW w:w="1810" w:type="dxa"/>
-            <w:hideMark/>
-          </w:tcPr>
-          <w:p>
-            <w:pPr>
-              <w:rPr>
-                <w:rFonts w:ascii="Times New Roman" w:hAnsi="Times New Roman" w:cs="Times New Roman"/>
-                <w:sz w:val="24"/>
-                <w:szCs w:val="24"/>
-              </w:rPr>
-            </w:pPr>
-            <w:r>
-              <w:rPr>
-                <w:rFonts w:ascii="Times New Roman" w:hAnsi="Times New Roman" w:cs="Times New Roman"/>
-                <w:sz w:val="24"/>
-                <w:szCs w:val="24"/>
+            <w:tcW w:w="2001" w:type="dxa"/>
+            <w:hideMark/>
+          </w:tcPr>
+          <w:p>
+            <w:pPr>
+              <w:rPr>
+                <w:rFonts w:ascii="Times New Roman" w:hAnsi="Times New Roman" w:cs="Times New Roman"/>
+              </w:rPr>
+            </w:pPr>
+            <w:r>
+              <w:rPr>
+                <w:rFonts w:ascii="Times New Roman" w:hAnsi="Times New Roman" w:cs="Times New Roman"/>
+              </w:rPr>
+              <w:t>API de Siniestralidad de Medellín</w:t>
+            </w:r>
+          </w:p>
+        </w:tc>
+        <w:tc>
+          <w:tcPr>
+            <w:tcW w:w="1797" w:type="dxa"/>
+            <w:hideMark/>
+          </w:tcPr>
+          <w:p>
+            <w:pPr>
+              <w:rPr>
+                <w:rFonts w:ascii="Times New Roman" w:hAnsi="Times New Roman" w:cs="Times New Roman"/>
+              </w:rPr>
+            </w:pPr>
+            <w:r>
+              <w:rPr>
+                <w:rFonts w:ascii="Times New Roman" w:hAnsi="Times New Roman" w:cs="Times New Roman"/>
+              </w:rPr>
+              <w:t>Fecha, hora, clase, gravedad, latitud y longitud</w:t>
+            </w:r>
+          </w:p>
+        </w:tc>
+        <w:tc>
+          <w:tcPr>
+            <w:tcW w:w="1919" w:type="dxa"/>
+            <w:hideMark/>
+          </w:tcPr>
+          <w:p>
+            <w:pPr>
+              <w:rPr>
+                <w:rFonts w:ascii="Times New Roman" w:hAnsi="Times New Roman" w:cs="Times New Roman"/>
+              </w:rPr>
+            </w:pPr>
+            <w:r>
+              <w:rPr>
+                <w:rFonts w:ascii="Times New Roman" w:hAnsi="Times New Roman" w:cs="Times New Roman"/>
               </w:rPr>
               <w:t>0</w:t>
             </w:r>
@@ -6169,24 +7043,39 @@
         </w:tc>
         <w:tc>
           <w:tcPr>
-            <w:tcW w:w="1759" w:type="dxa"/>
-            <w:hideMark/>
-          </w:tcPr>
-          <w:p>
-            <w:pPr>
-              <w:rPr>
-                <w:rFonts w:ascii="Times New Roman" w:hAnsi="Times New Roman" w:cs="Times New Roman"/>
-                <w:sz w:val="24"/>
-                <w:szCs w:val="24"/>
-              </w:rPr>
-            </w:pPr>
-            <w:r>
-              <w:rPr>
-                <w:rFonts w:ascii="Times New Roman" w:hAnsi="Times New Roman" w:cs="Times New Roman"/>
-                <w:sz w:val="24"/>
-                <w:szCs w:val="24"/>
-              </w:rPr>
-              <w:t>Campo observ sin información</w:t>
+            <w:tcW w:w="1771" w:type="dxa"/>
+            <w:hideMark/>
+          </w:tcPr>
+          <w:p>
+            <w:pPr>
+              <w:rPr>
+                <w:rFonts w:ascii="Times New Roman" w:hAnsi="Times New Roman" w:cs="Times New Roman"/>
+              </w:rPr>
+            </w:pPr>
+            <w:r>
+              <w:rPr>
+                <w:rFonts w:ascii="Times New Roman" w:hAnsi="Times New Roman" w:cs="Times New Roman"/>
+              </w:rPr>
+              <w:t>0</w:t>
+            </w:r>
+          </w:p>
+        </w:tc>
+        <w:tc>
+          <w:tcPr>
+            <w:tcW w:w="1340" w:type="dxa"/>
+            <w:hideMark/>
+          </w:tcPr>
+          <w:p>
+            <w:pPr>
+              <w:rPr>
+                <w:rFonts w:ascii="Times New Roman" w:hAnsi="Times New Roman" w:cs="Times New Roman"/>
+              </w:rPr>
+            </w:pPr>
+            <w:r>
+              <w:rPr>
+                <w:rFonts w:ascii="Times New Roman" w:hAnsi="Times New Roman" w:cs="Times New Roman"/>
+              </w:rPr>
+              <w:t>No se identificaron problemas</w:t>
             </w:r>
           </w:p>
         </w:tc>
@@ -6197,68 +7086,75 @@
         </w:trPr>
         <w:tc>
           <w:tcPr>
-            <w:tcW w:w="2148" w:type="dxa"/>
-            <w:hideMark/>
-          </w:tcPr>
-          <w:p>
-            <w:pPr>
-              <w:rPr>
-                <w:rFonts w:ascii="Times New Roman" w:hAnsi="Times New Roman" w:cs="Times New Roman"/>
-                <w:sz w:val="24"/>
-                <w:szCs w:val="24"/>
-              </w:rPr>
-            </w:pPr>
-            <w:r>
-              <w:rPr>
-                <w:rFonts w:ascii="Times New Roman" w:hAnsi="Times New Roman" w:cs="Times New Roman"/>
-                <w:sz w:val="24"/>
-                <w:szCs w:val="24"/>
-              </w:rPr>
-              <w:t>Radar Doppler OPS243-A simulado</w:t>
-            </w:r>
-          </w:p>
-        </w:tc>
-        <w:tc>
-          <w:tcPr>
-            <w:tcW w:w="1845" w:type="dxa"/>
-            <w:hideMark/>
-          </w:tcPr>
-          <w:p>
-            <w:pPr>
-              <w:rPr>
-                <w:rFonts w:ascii="Times New Roman" w:hAnsi="Times New Roman" w:cs="Times New Roman"/>
-                <w:sz w:val="24"/>
-                <w:szCs w:val="24"/>
-              </w:rPr>
-            </w:pPr>
-            <w:r>
-              <w:rPr>
-                <w:rFonts w:ascii="Times New Roman" w:hAnsi="Times New Roman" w:cs="Times New Roman"/>
-                <w:sz w:val="24"/>
-                <w:szCs w:val="24"/>
-              </w:rPr>
-              <w:t>1000</w:t>
-            </w:r>
-          </w:p>
-        </w:tc>
-        <w:tc>
-          <w:tcPr>
-            <w:tcW w:w="1738" w:type="dxa"/>
-            <w:hideMark/>
-          </w:tcPr>
-          <w:p>
-            <w:pPr>
-              <w:rPr>
-                <w:rFonts w:ascii="Times New Roman" w:hAnsi="Times New Roman" w:cs="Times New Roman"/>
-                <w:sz w:val="24"/>
-                <w:szCs w:val="24"/>
-              </w:rPr>
-            </w:pPr>
-            <w:r>
-              <w:rPr>
-                <w:rFonts w:ascii="Times New Roman" w:hAnsi="Times New Roman" w:cs="Times New Roman"/>
-                <w:sz w:val="24"/>
-                <w:szCs w:val="24"/>
+            <w:tcW w:w="2001" w:type="dxa"/>
+            <w:hideMark/>
+          </w:tcPr>
+          <w:p>
+            <w:pPr>
+              <w:rPr>
+                <w:rFonts w:ascii="Times New Roman" w:hAnsi="Times New Roman" w:cs="Times New Roman"/>
+              </w:rPr>
+            </w:pPr>
+            <w:r>
+              <w:rPr>
+                <w:rFonts w:ascii="Times New Roman" w:hAnsi="Times New Roman" w:cs="Times New Roman"/>
+              </w:rPr>
+              <w:t>Segmento Vial – Avenida Las Palmas</w:t>
+            </w:r>
+          </w:p>
+        </w:tc>
+        <w:tc>
+          <w:tcPr>
+            <w:tcW w:w="1797" w:type="dxa"/>
+            <w:hideMark/>
+          </w:tcPr>
+          <w:p>
+            <w:pPr>
+              <w:rPr>
+                <w:rFonts w:ascii="Times New Roman" w:hAnsi="Times New Roman" w:cs="Times New Roman"/>
+              </w:rPr>
+            </w:pPr>
+            <w:r>
+              <w:rPr>
+                <w:rFonts w:ascii="Times New Roman" w:hAnsi="Times New Roman" w:cs="Times New Roman"/>
+              </w:rPr>
+              <w:t>ID vial, nombre, sentido, número de carriles, longitud y geometría</w:t>
+            </w:r>
+          </w:p>
+        </w:tc>
+        <w:tc>
+          <w:tcPr>
+            <w:tcW w:w="1919" w:type="dxa"/>
+            <w:hideMark/>
+          </w:tcPr>
+          <w:p>
+            <w:pPr>
+              <w:rPr>
+                <w:rFonts w:ascii="Times New Roman" w:hAnsi="Times New Roman" w:cs="Times New Roman"/>
+              </w:rPr>
+            </w:pPr>
+            <w:r>
+              <w:rPr>
+                <w:rFonts w:ascii="Times New Roman" w:hAnsi="Times New Roman" w:cs="Times New Roman"/>
+              </w:rPr>
+              <w:t>36</w:t>
+            </w:r>
+          </w:p>
+        </w:tc>
+        <w:tc>
+          <w:tcPr>
+            <w:tcW w:w="1771" w:type="dxa"/>
+            <w:hideMark/>
+          </w:tcPr>
+          <w:p>
+            <w:pPr>
+              <w:rPr>
+                <w:rFonts w:ascii="Times New Roman" w:hAnsi="Times New Roman" w:cs="Times New Roman"/>
+              </w:rPr>
+            </w:pPr>
+            <w:r>
+              <w:rPr>
+                <w:rFonts w:ascii="Times New Roman" w:hAnsi="Times New Roman" w:cs="Times New Roman"/>
               </w:rPr>
               <w:t>0</w:t>
             </w:r>
@@ -6266,364 +7162,20 @@
         </w:tc>
         <w:tc>
           <w:tcPr>
-            <w:tcW w:w="1810" w:type="dxa"/>
-            <w:hideMark/>
-          </w:tcPr>
-          <w:p>
-            <w:pPr>
-              <w:rPr>
-                <w:rFonts w:ascii="Times New Roman" w:hAnsi="Times New Roman" w:cs="Times New Roman"/>
-                <w:sz w:val="24"/>
-                <w:szCs w:val="24"/>
-              </w:rPr>
-            </w:pPr>
-            <w:r>
-              <w:rPr>
-                <w:rFonts w:ascii="Times New Roman" w:hAnsi="Times New Roman" w:cs="Times New Roman"/>
-                <w:sz w:val="24"/>
-                <w:szCs w:val="24"/>
-              </w:rPr>
-              <w:t>0</w:t>
-            </w:r>
-          </w:p>
-        </w:tc>
-        <w:tc>
-          <w:tcPr>
-            <w:tcW w:w="1759" w:type="dxa"/>
-            <w:hideMark/>
-          </w:tcPr>
-          <w:p>
-            <w:pPr>
-              <w:rPr>
-                <w:rFonts w:ascii="Times New Roman" w:hAnsi="Times New Roman" w:cs="Times New Roman"/>
-                <w:sz w:val="24"/>
-                <w:szCs w:val="24"/>
-              </w:rPr>
-            </w:pPr>
-            <w:r>
-              <w:rPr>
-                <w:rFonts w:ascii="Times New Roman" w:hAnsi="Times New Roman" w:cs="Times New Roman"/>
-                <w:sz w:val="24"/>
-                <w:szCs w:val="24"/>
-              </w:rPr>
-              <w:t>No se identificaron problemas</w:t>
-            </w:r>
-          </w:p>
-        </w:tc>
-      </w:tr>
-    </w:tbl>
-    <w:p>
-      <w:pPr>
-        <w:rPr>
-          <w:rFonts w:ascii="Times New Roman" w:hAnsi="Times New Roman" w:cs="Times New Roman"/>
-          <w:sz w:val="24"/>
-          <w:szCs w:val="24"/>
-        </w:rPr>
-      </w:pPr>
-    </w:p>
-    <w:p>
-      <w:pPr>
-        <w:rPr>
-          <w:rFonts w:ascii="Times New Roman" w:hAnsi="Times New Roman" w:cs="Times New Roman"/>
-          <w:sz w:val="24"/>
-          <w:szCs w:val="24"/>
-        </w:rPr>
-      </w:pPr>
-      <w:r>
-        <w:rPr>
-          <w:rFonts w:ascii="Times New Roman" w:hAnsi="Times New Roman" w:cs="Times New Roman"/>
-          <w:sz w:val="24"/>
-          <w:szCs w:val="24"/>
-        </w:rPr>
-        <w:t xml:space="preserve">Pero estas anomalías son más que nada de variables que </w:t>
-      </w:r>
-      <w:r>
-        <w:rPr>
-          <w:rFonts w:ascii="Times New Roman" w:hAnsi="Times New Roman" w:cs="Times New Roman"/>
-          <w:sz w:val="24"/>
-          <w:szCs w:val="24"/>
-        </w:rPr>
-        <w:t>son más bien opcionales</w:t>
-      </w:r>
-      <w:r>
-        <w:rPr>
-          <w:rFonts w:ascii="Times New Roman" w:hAnsi="Times New Roman" w:cs="Times New Roman"/>
-          <w:sz w:val="24"/>
-          <w:szCs w:val="24"/>
-        </w:rPr>
-        <w:t xml:space="preserve"> </w:t>
-      </w:r>
-      <w:r>
-        <w:rPr>
-          <w:rFonts w:ascii="Times New Roman" w:hAnsi="Times New Roman" w:cs="Times New Roman"/>
-          <w:sz w:val="24"/>
-          <w:szCs w:val="24"/>
-        </w:rPr>
-        <w:t>ya que no intervienen en el análisis del proyecto</w:t>
-      </w:r>
-      <w:r>
-        <w:rPr>
-          <w:rFonts w:ascii="Times New Roman" w:hAnsi="Times New Roman" w:cs="Times New Roman"/>
-          <w:sz w:val="24"/>
-          <w:szCs w:val="24"/>
-        </w:rPr>
-        <w:t xml:space="preserve">, entonces </w:t>
-      </w:r>
-      <w:r>
-        <w:rPr>
-          <w:rFonts w:ascii="Times New Roman" w:hAnsi="Times New Roman" w:cs="Times New Roman"/>
-          <w:sz w:val="24"/>
-          <w:szCs w:val="24"/>
-        </w:rPr>
-        <w:t>decidimos realizar una segunda</w:t>
-      </w:r>
-      <w:r>
-        <w:rPr>
-          <w:rFonts w:ascii="Times New Roman" w:hAnsi="Times New Roman" w:cs="Times New Roman"/>
-          <w:sz w:val="24"/>
-          <w:szCs w:val="24"/>
-        </w:rPr>
-        <w:t xml:space="preserve"> tabla </w:t>
-      </w:r>
-      <w:r>
-        <w:rPr>
-          <w:rFonts w:ascii="Times New Roman" w:hAnsi="Times New Roman" w:cs="Times New Roman"/>
-          <w:sz w:val="24"/>
-          <w:szCs w:val="24"/>
-        </w:rPr>
-        <w:t xml:space="preserve">ahora </w:t>
-      </w:r>
-      <w:r>
-        <w:rPr>
-          <w:rFonts w:ascii="Times New Roman" w:hAnsi="Times New Roman" w:cs="Times New Roman"/>
-          <w:sz w:val="24"/>
-          <w:szCs w:val="24"/>
-        </w:rPr>
-        <w:t>con l</w:t>
-      </w:r>
-      <w:r>
-        <w:rPr>
-          <w:rFonts w:ascii="Times New Roman" w:hAnsi="Times New Roman" w:cs="Times New Roman"/>
-          <w:sz w:val="24"/>
-          <w:szCs w:val="24"/>
-        </w:rPr>
-        <w:t>as</w:t>
-      </w:r>
-      <w:r>
-        <w:rPr>
-          <w:rFonts w:ascii="Times New Roman" w:hAnsi="Times New Roman" w:cs="Times New Roman"/>
-          <w:sz w:val="24"/>
-          <w:szCs w:val="24"/>
-        </w:rPr>
-        <w:t xml:space="preserve"> va</w:t>
-      </w:r>
-      <w:r>
-        <w:rPr>
-          <w:rFonts w:ascii="Times New Roman" w:hAnsi="Times New Roman" w:cs="Times New Roman"/>
-          <w:sz w:val="24"/>
-          <w:szCs w:val="24"/>
-        </w:rPr>
-        <w:t>riables</w:t>
-      </w:r>
-      <w:r>
-        <w:rPr>
-          <w:rFonts w:ascii="Times New Roman" w:hAnsi="Times New Roman" w:cs="Times New Roman"/>
-          <w:sz w:val="24"/>
-          <w:szCs w:val="24"/>
-        </w:rPr>
-        <w:t xml:space="preserve"> que si son relevantes</w:t>
-      </w:r>
-      <w:r>
-        <w:rPr>
-          <w:rFonts w:ascii="Times New Roman" w:hAnsi="Times New Roman" w:cs="Times New Roman"/>
-          <w:sz w:val="24"/>
-          <w:szCs w:val="24"/>
-        </w:rPr>
-        <w:t xml:space="preserve"> para el proyecto y la integración</w:t>
-      </w:r>
-      <w:r>
-        <w:rPr>
-          <w:rFonts w:ascii="Times New Roman" w:hAnsi="Times New Roman" w:cs="Times New Roman"/>
-          <w:sz w:val="24"/>
-          <w:szCs w:val="24"/>
-        </w:rPr>
-        <w:t>:</w:t>
-      </w:r>
-    </w:p>
-    <w:p>
-      <w:pPr>
-        <w:rPr>
-          <w:rFonts w:ascii="Times New Roman" w:hAnsi="Times New Roman" w:cs="Times New Roman"/>
-          <w:sz w:val="24"/>
-          <w:szCs w:val="24"/>
-        </w:rPr>
-      </w:pPr>
-      <w:r>
-        <w:rPr>
-          <w:rFonts w:ascii="Times New Roman" w:hAnsi="Times New Roman" w:cs="Times New Roman"/>
-          <w:sz w:val="24"/>
-          <w:szCs w:val="24"/>
-        </w:rPr>
-        <w:t>Tabla 2. Calidad de las variables relevantes para el proyecto</w:t>
-      </w:r>
-      <w:r>
-        <w:rPr>
-          <w:rFonts w:ascii="Times New Roman" w:hAnsi="Times New Roman" w:cs="Times New Roman"/>
-          <w:sz w:val="24"/>
-          <w:szCs w:val="24"/>
-        </w:rPr>
-        <w:t xml:space="preserve"> </w:t>
-      </w:r>
-    </w:p>
-    <w:tbl>
-      <w:tblPr>
-        <w:tblStyle w:val="Tablaconcuadrcula"/>
-        <w:tblW w:w="9634" w:type="dxa"/>
-        <w:tblLook w:val="04A0" w:firstRow="1" w:lastRow="0" w:firstColumn="1" w:lastColumn="0" w:noHBand="0" w:noVBand="1"/>
-      </w:tblPr>
-      <w:tblGrid>
-        <w:gridCol w:w="2160"/>
-        <w:gridCol w:w="1875"/>
-        <w:gridCol w:w="1489"/>
-        <w:gridCol w:w="1559"/>
-        <w:gridCol w:w="2551"/>
-      </w:tblGrid>
-      <w:tr>
-        <w:trPr>
-          <w:trHeight w:val="1200"/>
-        </w:trPr>
-        <w:tc>
-          <w:tcPr>
-            <w:tcW w:w="2160" w:type="dxa"/>
-            <w:hideMark/>
-          </w:tcPr>
-          <w:p>
-            <w:pPr>
-              <w:rPr>
-                <w:rFonts w:ascii="Times New Roman" w:hAnsi="Times New Roman" w:cs="Times New Roman"/>
-                <w:b/>
-                <w:bCs/>
-                <w:sz w:val="24"/>
-                <w:szCs w:val="24"/>
-              </w:rPr>
-            </w:pPr>
-            <w:r>
-              <w:rPr>
-                <w:rFonts w:ascii="Times New Roman" w:hAnsi="Times New Roman" w:cs="Times New Roman"/>
-                <w:b/>
-                <w:bCs/>
-                <w:sz w:val="24"/>
-                <w:szCs w:val="24"/>
-              </w:rPr>
-              <w:t>Nombre de la fuente</w:t>
-            </w:r>
-          </w:p>
-        </w:tc>
-        <w:tc>
-          <w:tcPr>
-            <w:tcW w:w="1875" w:type="dxa"/>
-            <w:hideMark/>
-          </w:tcPr>
-          <w:p>
-            <w:pPr>
-              <w:rPr>
-                <w:rFonts w:ascii="Times New Roman" w:hAnsi="Times New Roman" w:cs="Times New Roman"/>
-                <w:b/>
-                <w:bCs/>
-                <w:sz w:val="24"/>
-                <w:szCs w:val="24"/>
-              </w:rPr>
-            </w:pPr>
-            <w:r>
-              <w:rPr>
-                <w:rFonts w:ascii="Times New Roman" w:hAnsi="Times New Roman" w:cs="Times New Roman"/>
-                <w:b/>
-                <w:bCs/>
-                <w:sz w:val="24"/>
-                <w:szCs w:val="24"/>
-              </w:rPr>
-              <w:t>Variables relevantes analizadas</w:t>
-            </w:r>
-          </w:p>
-        </w:tc>
-        <w:tc>
-          <w:tcPr>
-            <w:tcW w:w="1489" w:type="dxa"/>
-            <w:hideMark/>
-          </w:tcPr>
-          <w:p>
-            <w:pPr>
-              <w:rPr>
-                <w:rFonts w:ascii="Times New Roman" w:hAnsi="Times New Roman" w:cs="Times New Roman"/>
-                <w:b/>
-                <w:bCs/>
-                <w:sz w:val="24"/>
-                <w:szCs w:val="24"/>
-              </w:rPr>
-            </w:pPr>
-            <w:r>
-              <w:rPr>
-                <w:rFonts w:ascii="Times New Roman" w:hAnsi="Times New Roman" w:cs="Times New Roman"/>
-                <w:b/>
-                <w:bCs/>
-                <w:sz w:val="24"/>
-                <w:szCs w:val="24"/>
-              </w:rPr>
-              <w:t>Registros con datos faltantes</w:t>
-            </w:r>
-          </w:p>
-        </w:tc>
-        <w:tc>
-          <w:tcPr>
-            <w:tcW w:w="1559" w:type="dxa"/>
-            <w:hideMark/>
-          </w:tcPr>
-          <w:p>
-            <w:pPr>
-              <w:rPr>
-                <w:rFonts w:ascii="Times New Roman" w:hAnsi="Times New Roman" w:cs="Times New Roman"/>
-                <w:b/>
-                <w:bCs/>
-                <w:sz w:val="24"/>
-                <w:szCs w:val="24"/>
-              </w:rPr>
-            </w:pPr>
-            <w:r>
-              <w:rPr>
-                <w:rFonts w:ascii="Times New Roman" w:hAnsi="Times New Roman" w:cs="Times New Roman"/>
-                <w:b/>
-                <w:bCs/>
-                <w:sz w:val="24"/>
-                <w:szCs w:val="24"/>
-              </w:rPr>
-              <w:t>Registros con error</w:t>
-            </w:r>
-          </w:p>
-        </w:tc>
-        <w:tc>
-          <w:tcPr>
-            <w:tcW w:w="2551" w:type="dxa"/>
-            <w:hideMark/>
-          </w:tcPr>
-          <w:p>
-            <w:pPr>
-              <w:rPr>
-                <w:rFonts w:ascii="Times New Roman" w:hAnsi="Times New Roman" w:cs="Times New Roman"/>
-                <w:b/>
-                <w:bCs/>
-                <w:sz w:val="24"/>
-                <w:szCs w:val="24"/>
-              </w:rPr>
-            </w:pPr>
-            <w:r>
-              <w:rPr>
-                <w:rFonts w:ascii="Times New Roman" w:hAnsi="Times New Roman" w:cs="Times New Roman"/>
-                <w:b/>
-                <w:bCs/>
-                <w:sz w:val="24"/>
-                <w:szCs w:val="24"/>
-              </w:rPr>
-              <w:t>Problema de calidad más frecuente</w:t>
+            <w:tcW w:w="1340" w:type="dxa"/>
+            <w:hideMark/>
+          </w:tcPr>
+          <w:p>
+            <w:pPr>
+              <w:rPr>
+                <w:rFonts w:ascii="Times New Roman" w:hAnsi="Times New Roman" w:cs="Times New Roman"/>
+              </w:rPr>
+            </w:pPr>
+            <w:r>
+              <w:rPr>
+                <w:rFonts w:ascii="Times New Roman" w:hAnsi="Times New Roman" w:cs="Times New Roman"/>
+              </w:rPr>
+              <w:t>Datos faltantes en nro_carriles</w:t>
             </w:r>
           </w:p>
         </w:tc>
@@ -6634,73 +7186,56 @@
         </w:trPr>
         <w:tc>
           <w:tcPr>
-            <w:tcW w:w="2160" w:type="dxa"/>
-            <w:hideMark/>
-          </w:tcPr>
-          <w:p>
-            <w:pPr>
-              <w:rPr>
-                <w:rFonts w:ascii="Times New Roman" w:hAnsi="Times New Roman" w:cs="Times New Roman"/>
-                <w:sz w:val="24"/>
-                <w:szCs w:val="24"/>
-              </w:rPr>
-            </w:pPr>
-            <w:r>
-              <w:rPr>
-                <w:rFonts w:ascii="Times New Roman" w:hAnsi="Times New Roman" w:cs="Times New Roman"/>
-                <w:sz w:val="24"/>
-                <w:szCs w:val="24"/>
-              </w:rPr>
-              <w:lastRenderedPageBreak/>
-              <w:t>API de Siniestralidad de Medellín</w:t>
-            </w:r>
-          </w:p>
-        </w:tc>
-        <w:tc>
-          <w:tcPr>
-            <w:tcW w:w="1875" w:type="dxa"/>
-            <w:hideMark/>
-          </w:tcPr>
-          <w:p>
-            <w:pPr>
-              <w:rPr>
-                <w:rFonts w:ascii="Times New Roman" w:hAnsi="Times New Roman" w:cs="Times New Roman"/>
-                <w:sz w:val="24"/>
-                <w:szCs w:val="24"/>
-              </w:rPr>
-            </w:pPr>
-            <w:r>
-              <w:rPr>
-                <w:rFonts w:ascii="Times New Roman" w:hAnsi="Times New Roman" w:cs="Times New Roman"/>
-                <w:sz w:val="24"/>
-                <w:szCs w:val="24"/>
-              </w:rPr>
-              <w:t>Fecha, hora, clase, gravedad, latitud y longitud</w:t>
-            </w:r>
-          </w:p>
-        </w:tc>
-        <w:tc>
-          <w:tcPr>
-            <w:tcW w:w="1489" w:type="dxa"/>
-            <w:hideMark/>
-          </w:tcPr>
-          <w:p>
-            <w:pPr>
-              <w:rPr>
-                <w:rFonts w:ascii="Times New Roman" w:hAnsi="Times New Roman" w:cs="Times New Roman"/>
-                <w:b/>
-                <w:bCs/>
-                <w:sz w:val="24"/>
-                <w:szCs w:val="24"/>
-              </w:rPr>
-            </w:pPr>
-            <w:r>
-              <w:rPr>
-                <w:rFonts w:ascii="Times New Roman" w:hAnsi="Times New Roman" w:cs="Times New Roman"/>
-                <w:b/>
-                <w:bCs/>
-                <w:sz w:val="24"/>
-                <w:szCs w:val="24"/>
+            <w:tcW w:w="2001" w:type="dxa"/>
+            <w:hideMark/>
+          </w:tcPr>
+          <w:p>
+            <w:pPr>
+              <w:rPr>
+                <w:rFonts w:ascii="Times New Roman" w:hAnsi="Times New Roman" w:cs="Times New Roman"/>
+              </w:rPr>
+            </w:pPr>
+            <w:r>
+              <w:rPr>
+                <w:rFonts w:ascii="Times New Roman" w:hAnsi="Times New Roman" w:cs="Times New Roman"/>
+              </w:rPr>
+              <w:t>Radar Doppler OPS243-A simulado</w:t>
+            </w:r>
+          </w:p>
+        </w:tc>
+        <w:tc>
+          <w:tcPr>
+            <w:tcW w:w="1797" w:type="dxa"/>
+            <w:hideMark/>
+          </w:tcPr>
+          <w:p>
+            <w:pPr>
+              <w:rPr>
+                <w:rFonts w:ascii="Times New Roman" w:hAnsi="Times New Roman" w:cs="Times New Roman"/>
+              </w:rPr>
+            </w:pPr>
+            <w:r>
+              <w:rPr>
+                <w:rFonts w:ascii="Times New Roman" w:hAnsi="Times New Roman" w:cs="Times New Roman"/>
+              </w:rPr>
+              <w:t>Timestamp, velocidad, dirección, sensor, latitud y longitud</w:t>
+            </w:r>
+          </w:p>
+        </w:tc>
+        <w:tc>
+          <w:tcPr>
+            <w:tcW w:w="1919" w:type="dxa"/>
+            <w:hideMark/>
+          </w:tcPr>
+          <w:p>
+            <w:pPr>
+              <w:rPr>
+                <w:rFonts w:ascii="Times New Roman" w:hAnsi="Times New Roman" w:cs="Times New Roman"/>
+              </w:rPr>
+            </w:pPr>
+            <w:r>
+              <w:rPr>
+                <w:rFonts w:ascii="Times New Roman" w:hAnsi="Times New Roman" w:cs="Times New Roman"/>
               </w:rPr>
               <w:t>0</w:t>
             </w:r>
@@ -6708,26 +7243,18 @@
         </w:tc>
         <w:tc>
           <w:tcPr>
-            <w:tcW w:w="1559" w:type="dxa"/>
-            <w:hideMark/>
-          </w:tcPr>
-          <w:p>
-            <w:pPr>
-              <w:rPr>
-                <w:rFonts w:ascii="Times New Roman" w:hAnsi="Times New Roman" w:cs="Times New Roman"/>
-                <w:b/>
-                <w:bCs/>
-                <w:sz w:val="24"/>
-                <w:szCs w:val="24"/>
-              </w:rPr>
-            </w:pPr>
-            <w:r>
-              <w:rPr>
-                <w:rFonts w:ascii="Times New Roman" w:hAnsi="Times New Roman" w:cs="Times New Roman"/>
-                <w:b/>
-                <w:bCs/>
-                <w:sz w:val="24"/>
-                <w:szCs w:val="24"/>
+            <w:tcW w:w="1771" w:type="dxa"/>
+            <w:hideMark/>
+          </w:tcPr>
+          <w:p>
+            <w:pPr>
+              <w:rPr>
+                <w:rFonts w:ascii="Times New Roman" w:hAnsi="Times New Roman" w:cs="Times New Roman"/>
+              </w:rPr>
+            </w:pPr>
+            <w:r>
+              <w:rPr>
+                <w:rFonts w:ascii="Times New Roman" w:hAnsi="Times New Roman" w:cs="Times New Roman"/>
               </w:rPr>
               <w:t>0</w:t>
             </w:r>
@@ -6735,22 +7262,18 @@
         </w:tc>
         <w:tc>
           <w:tcPr>
-            <w:tcW w:w="2551" w:type="dxa"/>
-            <w:hideMark/>
-          </w:tcPr>
-          <w:p>
-            <w:pPr>
-              <w:rPr>
-                <w:rFonts w:ascii="Times New Roman" w:hAnsi="Times New Roman" w:cs="Times New Roman"/>
-                <w:sz w:val="24"/>
-                <w:szCs w:val="24"/>
-              </w:rPr>
-            </w:pPr>
-            <w:r>
-              <w:rPr>
-                <w:rFonts w:ascii="Times New Roman" w:hAnsi="Times New Roman" w:cs="Times New Roman"/>
-                <w:sz w:val="24"/>
-                <w:szCs w:val="24"/>
+            <w:tcW w:w="1340" w:type="dxa"/>
+            <w:hideMark/>
+          </w:tcPr>
+          <w:p>
+            <w:pPr>
+              <w:rPr>
+                <w:rFonts w:ascii="Times New Roman" w:hAnsi="Times New Roman" w:cs="Times New Roman"/>
+              </w:rPr>
+            </w:pPr>
+            <w:r>
+              <w:rPr>
+                <w:rFonts w:ascii="Times New Roman" w:hAnsi="Times New Roman" w:cs="Times New Roman"/>
               </w:rPr>
               <w:t>No se identificaron problemas</w:t>
             </w:r>
@@ -6759,103 +7282,60 @@
       </w:tr>
       <w:tr>
         <w:trPr>
-          <w:trHeight w:val="1200"/>
+          <w:trHeight w:val="2100"/>
         </w:trPr>
         <w:tc>
           <w:tcPr>
-            <w:tcW w:w="2160" w:type="dxa"/>
-            <w:hideMark/>
-          </w:tcPr>
-          <w:p>
-            <w:pPr>
-              <w:rPr>
-                <w:rFonts w:ascii="Times New Roman" w:hAnsi="Times New Roman" w:cs="Times New Roman"/>
-                <w:sz w:val="24"/>
-                <w:szCs w:val="24"/>
-              </w:rPr>
-            </w:pPr>
-            <w:r>
-              <w:rPr>
-                <w:rFonts w:ascii="Times New Roman" w:hAnsi="Times New Roman" w:cs="Times New Roman"/>
-                <w:sz w:val="24"/>
-                <w:szCs w:val="24"/>
-              </w:rPr>
-              <w:t>Segmento Vial – Avenida Las Palmas</w:t>
-            </w:r>
-          </w:p>
-        </w:tc>
-        <w:tc>
-          <w:tcPr>
-            <w:tcW w:w="1875" w:type="dxa"/>
-            <w:hideMark/>
-          </w:tcPr>
-          <w:p>
-            <w:pPr>
-              <w:rPr>
-                <w:rFonts w:ascii="Times New Roman" w:hAnsi="Times New Roman" w:cs="Times New Roman"/>
-                <w:sz w:val="24"/>
-                <w:szCs w:val="24"/>
-              </w:rPr>
-            </w:pPr>
-            <w:r>
-              <w:rPr>
-                <w:rFonts w:ascii="Times New Roman" w:hAnsi="Times New Roman" w:cs="Times New Roman"/>
-                <w:sz w:val="24"/>
-                <w:szCs w:val="24"/>
-              </w:rPr>
-              <w:t>ID vial, nombre, sentido, número de carriles, longitud y geometría</w:t>
-            </w:r>
-          </w:p>
-        </w:tc>
-        <w:tc>
-          <w:tcPr>
-            <w:tcW w:w="1489" w:type="dxa"/>
-            <w:hideMark/>
-          </w:tcPr>
-          <w:p>
-            <w:pPr>
-              <w:rPr>
-                <w:rFonts w:ascii="Times New Roman" w:hAnsi="Times New Roman" w:cs="Times New Roman"/>
-                <w:b/>
-                <w:bCs/>
-                <w:sz w:val="24"/>
-                <w:szCs w:val="24"/>
-              </w:rPr>
-            </w:pPr>
-            <w:r>
-              <w:rPr>
-                <w:rFonts w:ascii="Times New Roman" w:hAnsi="Times New Roman" w:cs="Times New Roman"/>
-                <w:b/>
-                <w:bCs/>
-                <w:sz w:val="24"/>
-                <w:szCs w:val="24"/>
-              </w:rPr>
-              <w:t>36</w:t>
-            </w:r>
-          </w:p>
-        </w:tc>
-        <w:tc>
-          <w:tcPr>
-            <w:tcW w:w="1559" w:type="dxa"/>
-            <w:hideMark/>
-          </w:tcPr>
-          <w:p>
-            <w:pPr>
-              <w:rPr>
-                <w:rFonts w:ascii="Times New Roman" w:hAnsi="Times New Roman" w:cs="Times New Roman"/>
-                <w:b/>
-                <w:bCs/>
-                <w:sz w:val="24"/>
-                <w:szCs w:val="24"/>
-              </w:rPr>
-            </w:pPr>
-            <w:r>
-              <w:rPr>
-                <w:rFonts w:ascii="Times New Roman" w:hAnsi="Times New Roman" w:cs="Times New Roman"/>
-                <w:b/>
-                <w:bCs/>
-                <w:sz w:val="24"/>
-                <w:szCs w:val="24"/>
+            <w:tcW w:w="2001" w:type="dxa"/>
+            <w:hideMark/>
+          </w:tcPr>
+          <w:p>
+            <w:pPr>
+              <w:rPr>
+                <w:rFonts w:ascii="Times New Roman" w:hAnsi="Times New Roman" w:cs="Times New Roman"/>
+              </w:rPr>
+            </w:pPr>
+            <w:r>
+              <w:rPr>
+                <w:rFonts w:ascii="Times New Roman" w:hAnsi="Times New Roman" w:cs="Times New Roman"/>
+              </w:rPr>
+              <w:t>API de Meteorología – Open-Meteo</w:t>
+            </w:r>
+          </w:p>
+        </w:tc>
+        <w:tc>
+          <w:tcPr>
+            <w:tcW w:w="1797" w:type="dxa"/>
+            <w:hideMark/>
+          </w:tcPr>
+          <w:p>
+            <w:pPr>
+              <w:rPr>
+                <w:rFonts w:ascii="Times New Roman" w:hAnsi="Times New Roman" w:cs="Times New Roman"/>
+              </w:rPr>
+            </w:pPr>
+            <w:r>
+              <w:rPr>
+                <w:rFonts w:ascii="Times New Roman" w:hAnsi="Times New Roman" w:cs="Times New Roman"/>
+              </w:rPr>
+              <w:t>Fecha y hora, precipitación, temperatura, humedad, ID del punto climático, latitud y longitud de referencia</w:t>
+            </w:r>
+          </w:p>
+        </w:tc>
+        <w:tc>
+          <w:tcPr>
+            <w:tcW w:w="1919" w:type="dxa"/>
+            <w:hideMark/>
+          </w:tcPr>
+          <w:p>
+            <w:pPr>
+              <w:rPr>
+                <w:rFonts w:ascii="Times New Roman" w:hAnsi="Times New Roman" w:cs="Times New Roman"/>
+              </w:rPr>
+            </w:pPr>
+            <w:r>
+              <w:rPr>
+                <w:rFonts w:ascii="Times New Roman" w:hAnsi="Times New Roman" w:cs="Times New Roman"/>
               </w:rPr>
               <w:t>0</w:t>
             </w:r>
@@ -6863,100 +7343,18 @@
         </w:tc>
         <w:tc>
           <w:tcPr>
-            <w:tcW w:w="2551" w:type="dxa"/>
-            <w:hideMark/>
-          </w:tcPr>
-          <w:p>
-            <w:pPr>
-              <w:rPr>
-                <w:rFonts w:ascii="Times New Roman" w:hAnsi="Times New Roman" w:cs="Times New Roman"/>
-                <w:sz w:val="24"/>
-                <w:szCs w:val="24"/>
-              </w:rPr>
-            </w:pPr>
-            <w:r>
-              <w:rPr>
-                <w:rFonts w:ascii="Times New Roman" w:hAnsi="Times New Roman" w:cs="Times New Roman"/>
-                <w:sz w:val="24"/>
-                <w:szCs w:val="24"/>
-              </w:rPr>
-              <w:t>Datos faltantes en nro_carriles</w:t>
-            </w:r>
-          </w:p>
-        </w:tc>
-      </w:tr>
-      <w:tr>
-        <w:trPr>
-          <w:trHeight w:val="1417"/>
-        </w:trPr>
-        <w:tc>
-          <w:tcPr>
-            <w:tcW w:w="2160" w:type="dxa"/>
-            <w:hideMark/>
-          </w:tcPr>
-          <w:p>
-            <w:pPr>
-              <w:rPr>
-                <w:rFonts w:ascii="Times New Roman" w:hAnsi="Times New Roman" w:cs="Times New Roman"/>
-                <w:sz w:val="24"/>
-                <w:szCs w:val="24"/>
-              </w:rPr>
-            </w:pPr>
-            <w:r>
-              <w:rPr>
-                <w:rFonts w:ascii="Times New Roman" w:hAnsi="Times New Roman" w:cs="Times New Roman"/>
-                <w:sz w:val="24"/>
-                <w:szCs w:val="24"/>
-              </w:rPr>
-              <w:t>Radar Doppler OPS243-A simulado</w:t>
-            </w:r>
-          </w:p>
-        </w:tc>
-        <w:tc>
-          <w:tcPr>
-            <w:tcW w:w="1875" w:type="dxa"/>
-            <w:hideMark/>
-          </w:tcPr>
-          <w:p>
-            <w:pPr>
-              <w:rPr>
-                <w:rFonts w:ascii="Times New Roman" w:hAnsi="Times New Roman" w:cs="Times New Roman"/>
-                <w:sz w:val="24"/>
-                <w:szCs w:val="24"/>
-              </w:rPr>
-            </w:pPr>
-            <w:r>
-              <w:rPr>
-                <w:rFonts w:ascii="Times New Roman" w:hAnsi="Times New Roman" w:cs="Times New Roman"/>
-                <w:sz w:val="24"/>
-                <w:szCs w:val="24"/>
-              </w:rPr>
-              <w:t>Timestamp, velocidad, dirección, sensor, latitud y longitud</w:t>
-            </w:r>
-          </w:p>
-        </w:tc>
-        <w:tc>
-          <w:tcPr>
-            <w:tcW w:w="1489" w:type="dxa"/>
-            <w:hideMark/>
-          </w:tcPr>
-          <w:p>
-            <w:pPr>
-              <w:rPr>
-                <w:rFonts w:ascii="Times New Roman" w:hAnsi="Times New Roman" w:cs="Times New Roman"/>
-                <w:b/>
-                <w:bCs/>
-                <w:sz w:val="24"/>
-                <w:szCs w:val="24"/>
-              </w:rPr>
-            </w:pPr>
-            <w:r>
-              <w:rPr>
-                <w:rFonts w:ascii="Times New Roman" w:hAnsi="Times New Roman" w:cs="Times New Roman"/>
-                <w:b/>
-                <w:bCs/>
-                <w:sz w:val="24"/>
-                <w:szCs w:val="24"/>
+            <w:tcW w:w="1771" w:type="dxa"/>
+            <w:hideMark/>
+          </w:tcPr>
+          <w:p>
+            <w:pPr>
+              <w:rPr>
+                <w:rFonts w:ascii="Times New Roman" w:hAnsi="Times New Roman" w:cs="Times New Roman"/>
+              </w:rPr>
+            </w:pPr>
+            <w:r>
+              <w:rPr>
+                <w:rFonts w:ascii="Times New Roman" w:hAnsi="Times New Roman" w:cs="Times New Roman"/>
               </w:rPr>
               <w:t>0</w:t>
             </w:r>
@@ -6964,49 +7362,18 @@
         </w:tc>
         <w:tc>
           <w:tcPr>
-            <w:tcW w:w="1559" w:type="dxa"/>
-            <w:hideMark/>
-          </w:tcPr>
-          <w:p>
-            <w:pPr>
-              <w:rPr>
-                <w:rFonts w:ascii="Times New Roman" w:hAnsi="Times New Roman" w:cs="Times New Roman"/>
-                <w:b/>
-                <w:bCs/>
-                <w:sz w:val="24"/>
-                <w:szCs w:val="24"/>
-              </w:rPr>
-            </w:pPr>
-            <w:r>
-              <w:rPr>
-                <w:rFonts w:ascii="Times New Roman" w:hAnsi="Times New Roman" w:cs="Times New Roman"/>
-                <w:b/>
-                <w:bCs/>
-                <w:sz w:val="24"/>
-                <w:szCs w:val="24"/>
-              </w:rPr>
-              <w:t>0</w:t>
-            </w:r>
-          </w:p>
-        </w:tc>
-        <w:tc>
-          <w:tcPr>
-            <w:tcW w:w="2551" w:type="dxa"/>
-            <w:hideMark/>
-          </w:tcPr>
-          <w:p>
-            <w:pPr>
-              <w:rPr>
-                <w:rFonts w:ascii="Times New Roman" w:hAnsi="Times New Roman" w:cs="Times New Roman"/>
-                <w:sz w:val="24"/>
-                <w:szCs w:val="24"/>
-              </w:rPr>
-            </w:pPr>
-            <w:r>
-              <w:rPr>
-                <w:rFonts w:ascii="Times New Roman" w:hAnsi="Times New Roman" w:cs="Times New Roman"/>
-                <w:sz w:val="24"/>
-                <w:szCs w:val="24"/>
+            <w:tcW w:w="1340" w:type="dxa"/>
+            <w:hideMark/>
+          </w:tcPr>
+          <w:p>
+            <w:pPr>
+              <w:rPr>
+                <w:rFonts w:ascii="Times New Roman" w:hAnsi="Times New Roman" w:cs="Times New Roman"/>
+              </w:rPr>
+            </w:pPr>
+            <w:r>
+              <w:rPr>
+                <w:rFonts w:ascii="Times New Roman" w:hAnsi="Times New Roman" w:cs="Times New Roman"/>
               </w:rPr>
               <w:t>No se identificaron problemas</w:t>
             </w:r>
@@ -7022,6 +7389,14 @@
           <w:szCs w:val="24"/>
         </w:rPr>
       </w:pPr>
+      <w:r>
+        <w:rPr>
+          <w:rFonts w:ascii="Times New Roman" w:hAnsi="Times New Roman" w:cs="Times New Roman"/>
+          <w:sz w:val="24"/>
+          <w:szCs w:val="24"/>
+        </w:rPr>
+        <w:t>Los resultados muestran que las variables principales de las cuatro fuentes no presentan errores de calidad. Únicamente se identificaron 36 registros sin información del número de carriles en Segmento Vial, lo cual no impide utilizar las geometrías de los tramos seleccionados. Por lo tanto, los datos disponibles permiten continuar con el proceso de integración espacial y temporal planteado en el proyecto.</w:t>
+      </w:r>
     </w:p>
     <w:p>
       <w:pPr>
@@ -7149,6 +7524,7 @@
           <w:sz w:val="24"/>
           <w:szCs w:val="24"/>
         </w:rPr>
+        <w:lastRenderedPageBreak/>
         <w:t xml:space="preserve">González-Fernández, H., Ruiz-Caballero, P., &amp; Almenares-García, J. (2021). Análisis de la consistencia geométrica en el tramo de la Carretera Central comprendido entre las estaciones 90+6.34 y 90+9.34. Ciencia en su PC, 1(1), 13–24. </w:t>
       </w:r>
       <w:hyperlink r:id="rId16" w:history="1">
@@ -7282,7 +7658,6 @@
           <w:sz w:val="24"/>
           <w:szCs w:val="24"/>
         </w:rPr>
-        <w:lastRenderedPageBreak/>
         <w:t xml:space="preserve">Alcaldía de Medellín - Secretaría de Movilidad. (s. f.). </w:t>
       </w:r>
       <w:r>
@@ -8483,6 +8858,7 @@
   <w:style w:type="character" w:default="1" w:styleId="Fuentedeprrafopredeter">
     <w:name w:val="Default Paragraph Font"/>
     <w:uiPriority w:val="1"/>
+    <w:semiHidden/>
     <w:unhideWhenUsed/>
   </w:style>
   <w:style w:type="table" w:default="1" w:styleId="Tablanormal">
@@ -9389,18 +9765,18 @@
 </file>
 
 <file path=customXml/item2.xml><?xml version="1.0" encoding="utf-8"?>
+<p:properties xmlns:p="http://schemas.microsoft.com/office/2006/metadata/properties" xmlns:xsi="http://www.w3.org/2001/XMLSchema-instance" xmlns:pc="http://schemas.microsoft.com/office/infopath/2007/PartnerControls">
+  <documentManagement/>
+</p:properties>
+</file>
+
+<file path=customXml/item3.xml><?xml version="1.0" encoding="utf-8"?>
 <?mso-contentType ?>
 <FormTemplates xmlns="http://schemas.microsoft.com/sharepoint/v3/contenttype/forms">
   <Display>DocumentLibraryForm</Display>
   <Edit>DocumentLibraryForm</Edit>
   <New>DocumentLibraryForm</New>
 </FormTemplates>
-</file>
-
-<file path=customXml/item3.xml><?xml version="1.0" encoding="utf-8"?>
-<p:properties xmlns:p="http://schemas.microsoft.com/office/2006/metadata/properties" xmlns:xsi="http://www.w3.org/2001/XMLSchema-instance" xmlns:pc="http://schemas.microsoft.com/office/infopath/2007/PartnerControls">
-  <documentManagement/>
-</p:properties>
 </file>
 
 <file path=customXml/itemProps1.xml><?xml version="1.0" encoding="utf-8"?>
@@ -9422,18 +9798,18 @@
 </file>
 
 <file path=customXml/itemProps2.xml><?xml version="1.0" encoding="utf-8"?>
-<ds:datastoreItem xmlns:ds="http://schemas.openxmlformats.org/officeDocument/2006/customXml" ds:itemID="{0E95F6D3-464D-4EF4-A884-64B7E16BCDAC}">
-  <ds:schemaRefs>
-    <ds:schemaRef ds:uri="http://schemas.microsoft.com/sharepoint/v3/contenttype/forms"/>
-  </ds:schemaRefs>
-</ds:datastoreItem>
-</file>
-
-<file path=customXml/itemProps3.xml><?xml version="1.0" encoding="utf-8"?>
 <ds:datastoreItem xmlns:ds="http://schemas.openxmlformats.org/officeDocument/2006/customXml" ds:itemID="{982FA805-0B52-43B1-8910-1BD67303419A}">
   <ds:schemaRefs>
     <ds:schemaRef ds:uri="http://schemas.microsoft.com/office/2006/metadata/properties"/>
     <ds:schemaRef ds:uri="http://schemas.microsoft.com/office/infopath/2007/PartnerControls"/>
   </ds:schemaRefs>
 </ds:datastoreItem>
+</file>
+
+<file path=customXml/itemProps3.xml><?xml version="1.0" encoding="utf-8"?>
+<ds:datastoreItem xmlns:ds="http://schemas.openxmlformats.org/officeDocument/2006/customXml" ds:itemID="{0E95F6D3-464D-4EF4-A884-64B7E16BCDAC}">
+  <ds:schemaRefs>
+    <ds:schemaRef ds:uri="http://schemas.microsoft.com/sharepoint/v3/contenttype/forms"/>
+  </ds:schemaRefs>
+</ds:datastoreItem>
 </file>
</xml_diff>